<commit_message>
Add name and first six test screenshots to PA1 design document
Screenshots for tests 1-5 and 7 replace their placeholders; the rest
stay as placeholders until they are provided.

Co-Authored-By: Claude Opus 5.5 <noreply@anthropic.com>
Claude-Session: https://claude.ai/code/session_015V8epo32ib1aDt4pTugMni
</commit_message>
<xml_diff>
--- a/pa1/PA1_Design_Document.docx
+++ b/pa1/PA1_Design_Document.docx
@@ -32,7 +32,7 @@
     </w:p>
     <w:p>
       <w:pPr>
-        <w:spacing w:after="240"/>
+        <w:spacing w:after="60"/>
         <w:jc w:val="center"/>
       </w:pPr>
       <w:r>
@@ -44,6 +44,19 @@
           <w:szCs w:val="22"/>
         </w:rPr>
         <w:t xml:space="preserve">Design Document (multi-threaded version)</w:t>
+      </w:r>
+    </w:p>
+    <w:p>
+      <w:pPr>
+        <w:spacing w:after="240"/>
+        <w:jc w:val="center"/>
+      </w:pPr>
+      <w:r>
+        <w:rPr>
+          <w:sz w:val="22"/>
+          <w:szCs w:val="22"/>
+        </w:rPr>
+        <w:t xml:space="preserve">Colin Willour  |  NetID: cjw22003</w:t>
       </w:r>
     </w:p>
     <w:p>
@@ -7563,6 +7576,1296 @@
     <w:p>
       <w:pPr>
         <w:spacing w:after="160" w:before="60"/>
+        <w:jc w:val="center"/>
+      </w:pPr>
+      <w:r>
+        <w:drawing>
+          <wp:inline distT="0" distB="0" distL="0" distR="0">
+            <wp:extent cx="5334000" cy="2543175"/>
+            <wp:effectExtent t="0" r="0" b="0" l="0"/>
+            <wp:docPr id="1" name="01.png" descr="Screenshot: Test 1: ?????????? (basic_client terminal)" title="Test 1: ?????????? (basic_client terminal)"/>
+            <wp:cNvGraphicFramePr>
+              <a:graphicFrameLocks xmlns:a="http://schemas.openxmlformats.org/drawingml/2006/main" noChangeAspect="1"/>
+            </wp:cNvGraphicFramePr>
+            <a:graphic xmlns:a="http://schemas.openxmlformats.org/drawingml/2006/main">
+              <a:graphicData uri="http://schemas.openxmlformats.org/drawingml/2006/picture">
+                <pic:pic xmlns:pic="http://schemas.openxmlformats.org/drawingml/2006/picture">
+                  <pic:nvPicPr>
+                    <pic:cNvPr id="0" name="" descr=""/>
+                    <pic:cNvPicPr>
+                      <a:picLocks noChangeAspect="1" noChangeArrowheads="1"/>
+                    </pic:cNvPicPr>
+                  </pic:nvPicPr>
+                  <pic:blipFill>
+                    <a:blip r:embed="rId8" cstate="none"/>
+                    <a:srcRect/>
+                    <a:stretch>
+                      <a:fillRect/>
+                    </a:stretch>
+                  </pic:blipFill>
+                  <pic:spPr bwMode="auto">
+                    <a:xfrm>
+                      <a:off x="0" y="0"/>
+                      <a:ext cx="5334000" cy="2543175"/>
+                    </a:xfrm>
+                    <a:prstGeom prst="rect">
+                      <a:avLst/>
+                    </a:prstGeom>
+                  </pic:spPr>
+                </pic:pic>
+              </a:graphicData>
+            </a:graphic>
+          </wp:inline>
+        </w:drawing>
+      </w:r>
+    </w:p>
+    <w:p>
+      <w:pPr>
+        <w:keepNext/>
+        <w:spacing w:after="60" w:before="120"/>
+      </w:pPr>
+      <w:r>
+        <w:rPr>
+          <w:b/>
+          <w:bCs/>
+        </w:rPr>
+        <w:t xml:space="preserve">Test 2: ?</w:t>
+      </w:r>
+    </w:p>
+    <w:p>
+      <w:pPr>
+        <w:keepNext/>
+        <w:keepLines/>
+        <w:pBdr>
+          <w:top w:val="single" w:color="F2F2F2" w:sz="2" w:space="4"/>
+          <w:left w:val="single" w:color="A6A6A6" w:sz="12" w:space="6"/>
+        </w:pBdr>
+        <w:shd w:fill="F2F2F2" w:color="auto" w:val="clear"/>
+        <w:spacing w:after="0" w:before="0" w:line="240"/>
+        <w:ind w:left="144" w:right="144"/>
+      </w:pPr>
+      <w:r>
+        <w:rPr>
+          <w:rFonts w:ascii="Consolas" w:cs="Consolas" w:eastAsia="Consolas" w:hAnsi="Consolas"/>
+          <w:sz w:val="17"/>
+          <w:szCs w:val="17"/>
+        </w:rPr>
+        <w:t xml:space="preserve">$ python3 basic_client.py      (typed: ?)</w:t>
+      </w:r>
+    </w:p>
+    <w:p>
+      <w:pPr>
+        <w:keepNext/>
+        <w:keepLines/>
+        <w:pBdr>
+          <w:left w:val="single" w:color="A6A6A6" w:sz="12" w:space="6"/>
+        </w:pBdr>
+        <w:shd w:fill="F2F2F2" w:color="auto" w:val="clear"/>
+        <w:spacing w:after="0" w:before="0" w:line="240"/>
+        <w:ind w:left="144" w:right="144"/>
+      </w:pPr>
+      <w:r>
+        <w:rPr>
+          <w:rFonts w:ascii="Consolas" w:cs="Consolas" w:eastAsia="Consolas" w:hAnsi="Consolas"/>
+          <w:sz w:val="17"/>
+          <w:szCs w:val="17"/>
+        </w:rPr>
+        <w:t xml:space="preserve">Enter query: Server replied: 200 OK</w:t>
+      </w:r>
+    </w:p>
+    <w:p>
+      <w:pPr>
+        <w:keepNext/>
+        <w:keepLines/>
+        <w:pBdr>
+          <w:left w:val="single" w:color="A6A6A6" w:sz="12" w:space="6"/>
+        </w:pBdr>
+        <w:shd w:fill="F2F2F2" w:color="auto" w:val="clear"/>
+        <w:spacing w:after="0" w:before="0" w:line="240"/>
+        <w:ind w:left="144" w:right="144"/>
+      </w:pPr>
+      <w:r>
+        <w:rPr>
+          <w:rFonts w:ascii="Consolas" w:cs="Consolas" w:eastAsia="Consolas" w:hAnsi="Consolas"/>
+          <w:sz w:val="17"/>
+          <w:szCs w:val="17"/>
+        </w:rPr>
+        <w:t xml:space="preserve">Number of matching words: 69903</w:t>
+      </w:r>
+    </w:p>
+    <w:p>
+      <w:pPr>
+        <w:keepNext/>
+        <w:keepLines/>
+        <w:pBdr>
+          <w:left w:val="single" w:color="A6A6A6" w:sz="12" w:space="6"/>
+        </w:pBdr>
+        <w:shd w:fill="F2F2F2" w:color="auto" w:val="clear"/>
+        <w:spacing w:after="0" w:before="0" w:line="240"/>
+        <w:ind w:left="144" w:right="144"/>
+      </w:pPr>
+      <w:r>
+        <w:rPr>
+          <w:rFonts w:ascii="Consolas" w:cs="Consolas" w:eastAsia="Consolas" w:hAnsi="Consolas"/>
+          <w:sz w:val="17"/>
+          <w:szCs w:val="17"/>
+        </w:rPr>
+        <w:t xml:space="preserve">a</w:t>
+      </w:r>
+    </w:p>
+    <w:p>
+      <w:pPr>
+        <w:keepNext/>
+        <w:keepLines/>
+        <w:pBdr>
+          <w:left w:val="single" w:color="A6A6A6" w:sz="12" w:space="6"/>
+        </w:pBdr>
+        <w:shd w:fill="F2F2F2" w:color="auto" w:val="clear"/>
+        <w:spacing w:after="0" w:before="0" w:line="240"/>
+        <w:ind w:left="144" w:right="144"/>
+      </w:pPr>
+      <w:r>
+        <w:rPr>
+          <w:rFonts w:ascii="Consolas" w:cs="Consolas" w:eastAsia="Consolas" w:hAnsi="Consolas"/>
+          <w:sz w:val="17"/>
+          <w:szCs w:val="17"/>
+        </w:rPr>
+        <w:t xml:space="preserve">a-horizon</w:t>
+      </w:r>
+    </w:p>
+    <w:p>
+      <w:pPr>
+        <w:keepNext/>
+        <w:keepLines/>
+        <w:pBdr>
+          <w:left w:val="single" w:color="A6A6A6" w:sz="12" w:space="6"/>
+        </w:pBdr>
+        <w:shd w:fill="F2F2F2" w:color="auto" w:val="clear"/>
+        <w:spacing w:after="0" w:before="0" w:line="240"/>
+        <w:ind w:left="144" w:right="144"/>
+      </w:pPr>
+      <w:r>
+        <w:rPr>
+          <w:rFonts w:ascii="Consolas" w:cs="Consolas" w:eastAsia="Consolas" w:hAnsi="Consolas"/>
+          <w:sz w:val="17"/>
+          <w:szCs w:val="17"/>
+        </w:rPr>
+        <w:t xml:space="preserve">a-ok</w:t>
+      </w:r>
+    </w:p>
+    <w:p>
+      <w:pPr>
+        <w:keepNext/>
+        <w:keepLines/>
+        <w:pBdr>
+          <w:left w:val="single" w:color="A6A6A6" w:sz="12" w:space="6"/>
+        </w:pBdr>
+        <w:shd w:fill="F2F2F2" w:color="auto" w:val="clear"/>
+        <w:spacing w:after="0" w:before="0" w:line="240"/>
+        <w:ind w:left="144" w:right="144"/>
+      </w:pPr>
+      <w:r>
+        <w:rPr>
+          <w:rFonts w:ascii="Consolas" w:cs="Consolas" w:eastAsia="Consolas" w:hAnsi="Consolas"/>
+          <w:sz w:val="17"/>
+          <w:szCs w:val="17"/>
+        </w:rPr>
+        <w:t xml:space="preserve">aardvark</w:t>
+      </w:r>
+    </w:p>
+    <w:p>
+      <w:pPr>
+        <w:keepNext/>
+        <w:keepLines/>
+        <w:pBdr>
+          <w:left w:val="single" w:color="A6A6A6" w:sz="12" w:space="6"/>
+        </w:pBdr>
+        <w:shd w:fill="F2F2F2" w:color="auto" w:val="clear"/>
+        <w:spacing w:after="0" w:before="0" w:line="240"/>
+        <w:ind w:left="144" w:right="144"/>
+      </w:pPr>
+      <w:r>
+        <w:rPr>
+          <w:rFonts w:ascii="Consolas" w:cs="Consolas" w:eastAsia="Consolas" w:hAnsi="Consolas"/>
+          <w:sz w:val="17"/>
+          <w:szCs w:val="17"/>
+        </w:rPr>
+        <w:t xml:space="preserve">aardwolf</w:t>
+      </w:r>
+    </w:p>
+    <w:p>
+      <w:pPr>
+        <w:keepNext/>
+        <w:keepLines/>
+        <w:pBdr>
+          <w:left w:val="single" w:color="A6A6A6" w:sz="12" w:space="6"/>
+        </w:pBdr>
+        <w:shd w:fill="F2F2F2" w:color="auto" w:val="clear"/>
+        <w:spacing w:after="0" w:before="0" w:line="240"/>
+        <w:ind w:left="144" w:right="144"/>
+      </w:pPr>
+      <w:r>
+        <w:rPr>
+          <w:rFonts w:ascii="Consolas" w:cs="Consolas" w:eastAsia="Consolas" w:hAnsi="Consolas"/>
+          <w:sz w:val="17"/>
+          <w:szCs w:val="17"/>
+        </w:rPr>
+        <w:t xml:space="preserve">   ... (69897 more lines omitted; full output in logs/) ...</w:t>
+      </w:r>
+    </w:p>
+    <w:p>
+      <w:pPr>
+        <w:keepNext/>
+        <w:keepLines/>
+        <w:pBdr>
+          <w:left w:val="single" w:color="A6A6A6" w:sz="12" w:space="6"/>
+        </w:pBdr>
+        <w:shd w:fill="F2F2F2" w:color="auto" w:val="clear"/>
+        <w:spacing w:after="0" w:before="0" w:line="240"/>
+        <w:ind w:left="144" w:right="144"/>
+      </w:pPr>
+      <w:r>
+        <w:rPr>
+          <w:rFonts w:ascii="Consolas" w:cs="Consolas" w:eastAsia="Consolas" w:hAnsi="Consolas"/>
+          <w:sz w:val="17"/>
+          <w:szCs w:val="17"/>
+        </w:rPr>
+        <w:t xml:space="preserve">zymurgy</w:t>
+      </w:r>
+    </w:p>
+    <w:p>
+      <w:pPr>
+        <w:keepNext w:val="false"/>
+        <w:keepLines/>
+        <w:pBdr>
+          <w:bottom w:val="single" w:color="F2F2F2" w:sz="2" w:space="4"/>
+          <w:left w:val="single" w:color="A6A6A6" w:sz="12" w:space="6"/>
+        </w:pBdr>
+        <w:shd w:fill="F2F2F2" w:color="auto" w:val="clear"/>
+        <w:spacing w:after="0" w:before="0" w:line="240"/>
+        <w:ind w:left="144" w:right="144"/>
+      </w:pPr>
+      <w:r>
+        <w:rPr>
+          <w:rFonts w:ascii="Consolas" w:cs="Consolas" w:eastAsia="Consolas" w:hAnsi="Consolas"/>
+          <w:sz w:val="17"/>
+          <w:szCs w:val="17"/>
+        </w:rPr>
+        <w:t xml:space="preserve">[exit code 0]</w:t>
+      </w:r>
+    </w:p>
+    <w:p>
+      <w:pPr>
+        <w:spacing w:after="80"/>
+      </w:pPr>
+    </w:p>
+    <w:p>
+      <w:pPr>
+        <w:spacing w:after="160" w:before="60"/>
+        <w:jc w:val="center"/>
+      </w:pPr>
+      <w:r>
+        <w:drawing>
+          <wp:inline distT="0" distB="0" distL="0" distR="0">
+            <wp:extent cx="5334000" cy="2638425"/>
+            <wp:effectExtent t="0" r="0" b="0" l="0"/>
+            <wp:docPr id="1" name="02.png" descr="Screenshot: Test 2: ? (basic_client terminal)" title="Test 2: ? (basic_client terminal)"/>
+            <wp:cNvGraphicFramePr>
+              <a:graphicFrameLocks xmlns:a="http://schemas.openxmlformats.org/drawingml/2006/main" noChangeAspect="1"/>
+            </wp:cNvGraphicFramePr>
+            <a:graphic xmlns:a="http://schemas.openxmlformats.org/drawingml/2006/main">
+              <a:graphicData uri="http://schemas.openxmlformats.org/drawingml/2006/picture">
+                <pic:pic xmlns:pic="http://schemas.openxmlformats.org/drawingml/2006/picture">
+                  <pic:nvPicPr>
+                    <pic:cNvPr id="0" name="" descr=""/>
+                    <pic:cNvPicPr>
+                      <a:picLocks noChangeAspect="1" noChangeArrowheads="1"/>
+                    </pic:cNvPicPr>
+                  </pic:nvPicPr>
+                  <pic:blipFill>
+                    <a:blip r:embed="rId9" cstate="none"/>
+                    <a:srcRect/>
+                    <a:stretch>
+                      <a:fillRect/>
+                    </a:stretch>
+                  </pic:blipFill>
+                  <pic:spPr bwMode="auto">
+                    <a:xfrm>
+                      <a:off x="0" y="0"/>
+                      <a:ext cx="5334000" cy="2638425"/>
+                    </a:xfrm>
+                    <a:prstGeom prst="rect">
+                      <a:avLst/>
+                    </a:prstGeom>
+                  </pic:spPr>
+                </pic:pic>
+              </a:graphicData>
+            </a:graphic>
+          </wp:inline>
+        </w:drawing>
+      </w:r>
+    </w:p>
+    <w:p>
+      <w:pPr>
+        <w:keepNext/>
+        <w:spacing w:after="60" w:before="120"/>
+      </w:pPr>
+      <w:r>
+        <w:rPr>
+          <w:b/>
+          <w:bCs/>
+        </w:rPr>
+        <w:t xml:space="preserve">Test 3: ?(a)</w:t>
+      </w:r>
+    </w:p>
+    <w:p>
+      <w:pPr>
+        <w:keepNext/>
+        <w:keepLines/>
+        <w:pBdr>
+          <w:top w:val="single" w:color="F2F2F2" w:sz="2" w:space="4"/>
+          <w:left w:val="single" w:color="A6A6A6" w:sz="12" w:space="6"/>
+        </w:pBdr>
+        <w:shd w:fill="F2F2F2" w:color="auto" w:val="clear"/>
+        <w:spacing w:after="0" w:before="0" w:line="240"/>
+        <w:ind w:left="144" w:right="144"/>
+      </w:pPr>
+      <w:r>
+        <w:rPr>
+          <w:rFonts w:ascii="Consolas" w:cs="Consolas" w:eastAsia="Consolas" w:hAnsi="Consolas"/>
+          <w:sz w:val="17"/>
+          <w:szCs w:val="17"/>
+        </w:rPr>
+        <w:t xml:space="preserve">$ python3 basic_client.py      (typed: ?(a))</w:t>
+      </w:r>
+    </w:p>
+    <w:p>
+      <w:pPr>
+        <w:keepNext/>
+        <w:keepLines/>
+        <w:pBdr>
+          <w:left w:val="single" w:color="A6A6A6" w:sz="12" w:space="6"/>
+        </w:pBdr>
+        <w:shd w:fill="F2F2F2" w:color="auto" w:val="clear"/>
+        <w:spacing w:after="0" w:before="0" w:line="240"/>
+        <w:ind w:left="144" w:right="144"/>
+      </w:pPr>
+      <w:r>
+        <w:rPr>
+          <w:rFonts w:ascii="Consolas" w:cs="Consolas" w:eastAsia="Consolas" w:hAnsi="Consolas"/>
+          <w:sz w:val="17"/>
+          <w:szCs w:val="17"/>
+        </w:rPr>
+        <w:t xml:space="preserve">Enter query: Server replied: 200 OK</w:t>
+      </w:r>
+    </w:p>
+    <w:p>
+      <w:pPr>
+        <w:keepNext/>
+        <w:keepLines/>
+        <w:pBdr>
+          <w:left w:val="single" w:color="A6A6A6" w:sz="12" w:space="6"/>
+        </w:pBdr>
+        <w:shd w:fill="F2F2F2" w:color="auto" w:val="clear"/>
+        <w:spacing w:after="0" w:before="0" w:line="240"/>
+        <w:ind w:left="144" w:right="144"/>
+      </w:pPr>
+      <w:r>
+        <w:rPr>
+          <w:rFonts w:ascii="Consolas" w:cs="Consolas" w:eastAsia="Consolas" w:hAnsi="Consolas"/>
+          <w:sz w:val="17"/>
+          <w:szCs w:val="17"/>
+        </w:rPr>
+        <w:t xml:space="preserve">Number of matching words: 414</w:t>
+      </w:r>
+    </w:p>
+    <w:p>
+      <w:pPr>
+        <w:keepNext/>
+        <w:keepLines/>
+        <w:pBdr>
+          <w:left w:val="single" w:color="A6A6A6" w:sz="12" w:space="6"/>
+        </w:pBdr>
+        <w:shd w:fill="F2F2F2" w:color="auto" w:val="clear"/>
+        <w:spacing w:after="0" w:before="0" w:line="240"/>
+        <w:ind w:left="144" w:right="144"/>
+      </w:pPr>
+      <w:r>
+        <w:rPr>
+          <w:rFonts w:ascii="Consolas" w:cs="Consolas" w:eastAsia="Consolas" w:hAnsi="Consolas"/>
+          <w:sz w:val="17"/>
+          <w:szCs w:val="17"/>
+        </w:rPr>
+        <w:t xml:space="preserve">acting(a)</w:t>
+      </w:r>
+    </w:p>
+    <w:p>
+      <w:pPr>
+        <w:keepNext/>
+        <w:keepLines/>
+        <w:pBdr>
+          <w:left w:val="single" w:color="A6A6A6" w:sz="12" w:space="6"/>
+        </w:pBdr>
+        <w:shd w:fill="F2F2F2" w:color="auto" w:val="clear"/>
+        <w:spacing w:after="0" w:before="0" w:line="240"/>
+        <w:ind w:left="144" w:right="144"/>
+      </w:pPr>
+      <w:r>
+        <w:rPr>
+          <w:rFonts w:ascii="Consolas" w:cs="Consolas" w:eastAsia="Consolas" w:hAnsi="Consolas"/>
+          <w:sz w:val="17"/>
+          <w:szCs w:val="17"/>
+        </w:rPr>
+        <w:t xml:space="preserve">activating(a)</w:t>
+      </w:r>
+    </w:p>
+    <w:p>
+      <w:pPr>
+        <w:keepNext/>
+        <w:keepLines/>
+        <w:pBdr>
+          <w:left w:val="single" w:color="A6A6A6" w:sz="12" w:space="6"/>
+        </w:pBdr>
+        <w:shd w:fill="F2F2F2" w:color="auto" w:val="clear"/>
+        <w:spacing w:after="0" w:before="0" w:line="240"/>
+        <w:ind w:left="144" w:right="144"/>
+      </w:pPr>
+      <w:r>
+        <w:rPr>
+          <w:rFonts w:ascii="Consolas" w:cs="Consolas" w:eastAsia="Consolas" w:hAnsi="Consolas"/>
+          <w:sz w:val="17"/>
+          <w:szCs w:val="17"/>
+        </w:rPr>
+        <w:t xml:space="preserve">admitted(a)</w:t>
+      </w:r>
+    </w:p>
+    <w:p>
+      <w:pPr>
+        <w:keepNext/>
+        <w:keepLines/>
+        <w:pBdr>
+          <w:left w:val="single" w:color="A6A6A6" w:sz="12" w:space="6"/>
+        </w:pBdr>
+        <w:shd w:fill="F2F2F2" w:color="auto" w:val="clear"/>
+        <w:spacing w:after="0" w:before="0" w:line="240"/>
+        <w:ind w:left="144" w:right="144"/>
+      </w:pPr>
+      <w:r>
+        <w:rPr>
+          <w:rFonts w:ascii="Consolas" w:cs="Consolas" w:eastAsia="Consolas" w:hAnsi="Consolas"/>
+          <w:sz w:val="17"/>
+          <w:szCs w:val="17"/>
+        </w:rPr>
+        <w:t xml:space="preserve">advance(a)</w:t>
+      </w:r>
+    </w:p>
+    <w:p>
+      <w:pPr>
+        <w:keepNext/>
+        <w:keepLines/>
+        <w:pBdr>
+          <w:left w:val="single" w:color="A6A6A6" w:sz="12" w:space="6"/>
+        </w:pBdr>
+        <w:shd w:fill="F2F2F2" w:color="auto" w:val="clear"/>
+        <w:spacing w:after="0" w:before="0" w:line="240"/>
+        <w:ind w:left="144" w:right="144"/>
+      </w:pPr>
+      <w:r>
+        <w:rPr>
+          <w:rFonts w:ascii="Consolas" w:cs="Consolas" w:eastAsia="Consolas" w:hAnsi="Consolas"/>
+          <w:sz w:val="17"/>
+          <w:szCs w:val="17"/>
+        </w:rPr>
+        <w:t xml:space="preserve">advanced(a)</w:t>
+      </w:r>
+    </w:p>
+    <w:p>
+      <w:pPr>
+        <w:keepNext/>
+        <w:keepLines/>
+        <w:pBdr>
+          <w:left w:val="single" w:color="A6A6A6" w:sz="12" w:space="6"/>
+        </w:pBdr>
+        <w:shd w:fill="F2F2F2" w:color="auto" w:val="clear"/>
+        <w:spacing w:after="0" w:before="0" w:line="240"/>
+        <w:ind w:left="144" w:right="144"/>
+      </w:pPr>
+      <w:r>
+        <w:rPr>
+          <w:rFonts w:ascii="Consolas" w:cs="Consolas" w:eastAsia="Consolas" w:hAnsi="Consolas"/>
+          <w:sz w:val="17"/>
+          <w:szCs w:val="17"/>
+        </w:rPr>
+        <w:t xml:space="preserve">   ... (408 more lines omitted; full output in logs/) ...</w:t>
+      </w:r>
+    </w:p>
+    <w:p>
+      <w:pPr>
+        <w:keepNext/>
+        <w:keepLines/>
+        <w:pBdr>
+          <w:left w:val="single" w:color="A6A6A6" w:sz="12" w:space="6"/>
+        </w:pBdr>
+        <w:shd w:fill="F2F2F2" w:color="auto" w:val="clear"/>
+        <w:spacing w:after="0" w:before="0" w:line="240"/>
+        <w:ind w:left="144" w:right="144"/>
+      </w:pPr>
+      <w:r>
+        <w:rPr>
+          <w:rFonts w:ascii="Consolas" w:cs="Consolas" w:eastAsia="Consolas" w:hAnsi="Consolas"/>
+          <w:sz w:val="17"/>
+          <w:szCs w:val="17"/>
+        </w:rPr>
+        <w:t xml:space="preserve">zero(a)</w:t>
+      </w:r>
+    </w:p>
+    <w:p>
+      <w:pPr>
+        <w:keepNext w:val="false"/>
+        <w:keepLines/>
+        <w:pBdr>
+          <w:bottom w:val="single" w:color="F2F2F2" w:sz="2" w:space="4"/>
+          <w:left w:val="single" w:color="A6A6A6" w:sz="12" w:space="6"/>
+        </w:pBdr>
+        <w:shd w:fill="F2F2F2" w:color="auto" w:val="clear"/>
+        <w:spacing w:after="0" w:before="0" w:line="240"/>
+        <w:ind w:left="144" w:right="144"/>
+      </w:pPr>
+      <w:r>
+        <w:rPr>
+          <w:rFonts w:ascii="Consolas" w:cs="Consolas" w:eastAsia="Consolas" w:hAnsi="Consolas"/>
+          <w:sz w:val="17"/>
+          <w:szCs w:val="17"/>
+        </w:rPr>
+        <w:t xml:space="preserve">[exit code 0]</w:t>
+      </w:r>
+    </w:p>
+    <w:p>
+      <w:pPr>
+        <w:spacing w:after="80"/>
+      </w:pPr>
+    </w:p>
+    <w:p>
+      <w:pPr>
+        <w:spacing w:after="160" w:before="60"/>
+        <w:jc w:val="center"/>
+      </w:pPr>
+      <w:r>
+        <w:drawing>
+          <wp:inline distT="0" distB="0" distL="0" distR="0">
+            <wp:extent cx="5334000" cy="2333625"/>
+            <wp:effectExtent t="0" r="0" b="0" l="0"/>
+            <wp:docPr id="1" name="03.png" descr="Screenshot: Test 3: ?(a) (basic_client terminal)" title="Test 3: ?(a) (basic_client terminal)"/>
+            <wp:cNvGraphicFramePr>
+              <a:graphicFrameLocks xmlns:a="http://schemas.openxmlformats.org/drawingml/2006/main" noChangeAspect="1"/>
+            </wp:cNvGraphicFramePr>
+            <a:graphic xmlns:a="http://schemas.openxmlformats.org/drawingml/2006/main">
+              <a:graphicData uri="http://schemas.openxmlformats.org/drawingml/2006/picture">
+                <pic:pic xmlns:pic="http://schemas.openxmlformats.org/drawingml/2006/picture">
+                  <pic:nvPicPr>
+                    <pic:cNvPr id="0" name="" descr=""/>
+                    <pic:cNvPicPr>
+                      <a:picLocks noChangeAspect="1" noChangeArrowheads="1"/>
+                    </pic:cNvPicPr>
+                  </pic:nvPicPr>
+                  <pic:blipFill>
+                    <a:blip r:embed="rId10" cstate="none"/>
+                    <a:srcRect/>
+                    <a:stretch>
+                      <a:fillRect/>
+                    </a:stretch>
+                  </pic:blipFill>
+                  <pic:spPr bwMode="auto">
+                    <a:xfrm>
+                      <a:off x="0" y="0"/>
+                      <a:ext cx="5334000" cy="2333625"/>
+                    </a:xfrm>
+                    <a:prstGeom prst="rect">
+                      <a:avLst/>
+                    </a:prstGeom>
+                  </pic:spPr>
+                </pic:pic>
+              </a:graphicData>
+            </a:graphic>
+          </wp:inline>
+        </w:drawing>
+      </w:r>
+    </w:p>
+    <w:p>
+      <w:pPr>
+        <w:keepNext/>
+        <w:spacing w:after="60" w:before="120"/>
+      </w:pPr>
+      <w:r>
+        <w:rPr>
+          <w:b/>
+          <w:bCs/>
+        </w:rPr>
+        <w:t xml:space="preserve">Test 4: -?-</w:t>
+      </w:r>
+    </w:p>
+    <w:p>
+      <w:pPr>
+        <w:keepNext/>
+        <w:keepLines/>
+        <w:pBdr>
+          <w:top w:val="single" w:color="F2F2F2" w:sz="2" w:space="4"/>
+          <w:left w:val="single" w:color="A6A6A6" w:sz="12" w:space="6"/>
+        </w:pBdr>
+        <w:shd w:fill="F2F2F2" w:color="auto" w:val="clear"/>
+        <w:spacing w:after="0" w:before="0" w:line="240"/>
+        <w:ind w:left="144" w:right="144"/>
+      </w:pPr>
+      <w:r>
+        <w:rPr>
+          <w:rFonts w:ascii="Consolas" w:cs="Consolas" w:eastAsia="Consolas" w:hAnsi="Consolas"/>
+          <w:sz w:val="17"/>
+          <w:szCs w:val="17"/>
+        </w:rPr>
+        <w:t xml:space="preserve">$ python3 basic_client.py      (typed: -?-)</w:t>
+      </w:r>
+    </w:p>
+    <w:p>
+      <w:pPr>
+        <w:keepNext/>
+        <w:keepLines/>
+        <w:pBdr>
+          <w:left w:val="single" w:color="A6A6A6" w:sz="12" w:space="6"/>
+        </w:pBdr>
+        <w:shd w:fill="F2F2F2" w:color="auto" w:val="clear"/>
+        <w:spacing w:after="0" w:before="0" w:line="240"/>
+        <w:ind w:left="144" w:right="144"/>
+      </w:pPr>
+      <w:r>
+        <w:rPr>
+          <w:rFonts w:ascii="Consolas" w:cs="Consolas" w:eastAsia="Consolas" w:hAnsi="Consolas"/>
+          <w:sz w:val="17"/>
+          <w:szCs w:val="17"/>
+        </w:rPr>
+        <w:t xml:space="preserve">Enter query: Server replied: 200 OK</w:t>
+      </w:r>
+    </w:p>
+    <w:p>
+      <w:pPr>
+        <w:keepNext/>
+        <w:keepLines/>
+        <w:pBdr>
+          <w:left w:val="single" w:color="A6A6A6" w:sz="12" w:space="6"/>
+        </w:pBdr>
+        <w:shd w:fill="F2F2F2" w:color="auto" w:val="clear"/>
+        <w:spacing w:after="0" w:before="0" w:line="240"/>
+        <w:ind w:left="144" w:right="144"/>
+      </w:pPr>
+      <w:r>
+        <w:rPr>
+          <w:rFonts w:ascii="Consolas" w:cs="Consolas" w:eastAsia="Consolas" w:hAnsi="Consolas"/>
+          <w:sz w:val="17"/>
+          <w:szCs w:val="17"/>
+        </w:rPr>
+        <w:t xml:space="preserve">Number of matching words: 13</w:t>
+      </w:r>
+    </w:p>
+    <w:p>
+      <w:pPr>
+        <w:keepNext/>
+        <w:keepLines/>
+        <w:pBdr>
+          <w:left w:val="single" w:color="A6A6A6" w:sz="12" w:space="6"/>
+        </w:pBdr>
+        <w:shd w:fill="F2F2F2" w:color="auto" w:val="clear"/>
+        <w:spacing w:after="0" w:before="0" w:line="240"/>
+        <w:ind w:left="144" w:right="144"/>
+      </w:pPr>
+      <w:r>
+        <w:rPr>
+          <w:rFonts w:ascii="Consolas" w:cs="Consolas" w:eastAsia="Consolas" w:hAnsi="Consolas"/>
+          <w:sz w:val="17"/>
+          <w:szCs w:val="17"/>
+        </w:rPr>
+        <w:t xml:space="preserve">bric-a-brac</w:t>
+      </w:r>
+    </w:p>
+    <w:p>
+      <w:pPr>
+        <w:keepNext/>
+        <w:keepLines/>
+        <w:pBdr>
+          <w:left w:val="single" w:color="A6A6A6" w:sz="12" w:space="6"/>
+        </w:pBdr>
+        <w:shd w:fill="F2F2F2" w:color="auto" w:val="clear"/>
+        <w:spacing w:after="0" w:before="0" w:line="240"/>
+        <w:ind w:left="144" w:right="144"/>
+      </w:pPr>
+      <w:r>
+        <w:rPr>
+          <w:rFonts w:ascii="Consolas" w:cs="Consolas" w:eastAsia="Consolas" w:hAnsi="Consolas"/>
+          <w:sz w:val="17"/>
+          <w:szCs w:val="17"/>
+        </w:rPr>
+        <w:t xml:space="preserve">cap-a-pie</w:t>
+      </w:r>
+    </w:p>
+    <w:p>
+      <w:pPr>
+        <w:keepNext/>
+        <w:keepLines/>
+        <w:pBdr>
+          <w:left w:val="single" w:color="A6A6A6" w:sz="12" w:space="6"/>
+        </w:pBdr>
+        <w:shd w:fill="F2F2F2" w:color="auto" w:val="clear"/>
+        <w:spacing w:after="0" w:before="0" w:line="240"/>
+        <w:ind w:left="144" w:right="144"/>
+      </w:pPr>
+      <w:r>
+        <w:rPr>
+          <w:rFonts w:ascii="Consolas" w:cs="Consolas" w:eastAsia="Consolas" w:hAnsi="Consolas"/>
+          <w:sz w:val="17"/>
+          <w:szCs w:val="17"/>
+        </w:rPr>
+        <w:t xml:space="preserve">cock-a-doodle-doo</w:t>
+      </w:r>
+    </w:p>
+    <w:p>
+      <w:pPr>
+        <w:keepNext/>
+        <w:keepLines/>
+        <w:pBdr>
+          <w:left w:val="single" w:color="A6A6A6" w:sz="12" w:space="6"/>
+        </w:pBdr>
+        <w:shd w:fill="F2F2F2" w:color="auto" w:val="clear"/>
+        <w:spacing w:after="0" w:before="0" w:line="240"/>
+        <w:ind w:left="144" w:right="144"/>
+      </w:pPr>
+      <w:r>
+        <w:rPr>
+          <w:rFonts w:ascii="Consolas" w:cs="Consolas" w:eastAsia="Consolas" w:hAnsi="Consolas"/>
+          <w:sz w:val="17"/>
+          <w:szCs w:val="17"/>
+        </w:rPr>
+        <w:t xml:space="preserve">cock-a-leekie</w:t>
+      </w:r>
+    </w:p>
+    <w:p>
+      <w:pPr>
+        <w:keepNext/>
+        <w:keepLines/>
+        <w:pBdr>
+          <w:left w:val="single" w:color="A6A6A6" w:sz="12" w:space="6"/>
+        </w:pBdr>
+        <w:shd w:fill="F2F2F2" w:color="auto" w:val="clear"/>
+        <w:spacing w:after="0" w:before="0" w:line="240"/>
+        <w:ind w:left="144" w:right="144"/>
+      </w:pPr>
+      <w:r>
+        <w:rPr>
+          <w:rFonts w:ascii="Consolas" w:cs="Consolas" w:eastAsia="Consolas" w:hAnsi="Consolas"/>
+          <w:sz w:val="17"/>
+          <w:szCs w:val="17"/>
+        </w:rPr>
+        <w:t xml:space="preserve">high-muck-a-muck</w:t>
+      </w:r>
+    </w:p>
+    <w:p>
+      <w:pPr>
+        <w:keepNext/>
+        <w:keepLines/>
+        <w:pBdr>
+          <w:left w:val="single" w:color="A6A6A6" w:sz="12" w:space="6"/>
+        </w:pBdr>
+        <w:shd w:fill="F2F2F2" w:color="auto" w:val="clear"/>
+        <w:spacing w:after="0" w:before="0" w:line="240"/>
+        <w:ind w:left="144" w:right="144"/>
+      </w:pPr>
+      <w:r>
+        <w:rPr>
+          <w:rFonts w:ascii="Consolas" w:cs="Consolas" w:eastAsia="Consolas" w:hAnsi="Consolas"/>
+          <w:sz w:val="17"/>
+          <w:szCs w:val="17"/>
+        </w:rPr>
+        <w:t xml:space="preserve">   ... (7 more lines omitted; full output in logs/) ...</w:t>
+      </w:r>
+    </w:p>
+    <w:p>
+      <w:pPr>
+        <w:keepNext/>
+        <w:keepLines/>
+        <w:pBdr>
+          <w:left w:val="single" w:color="A6A6A6" w:sz="12" w:space="6"/>
+        </w:pBdr>
+        <w:shd w:fill="F2F2F2" w:color="auto" w:val="clear"/>
+        <w:spacing w:after="0" w:before="0" w:line="240"/>
+        <w:ind w:left="144" w:right="144"/>
+      </w:pPr>
+      <w:r>
+        <w:rPr>
+          <w:rFonts w:ascii="Consolas" w:cs="Consolas" w:eastAsia="Consolas" w:hAnsi="Consolas"/>
+          <w:sz w:val="17"/>
+          <w:szCs w:val="17"/>
+        </w:rPr>
+        <w:t xml:space="preserve">vis-a-vis</w:t>
+      </w:r>
+    </w:p>
+    <w:p>
+      <w:pPr>
+        <w:keepNext w:val="false"/>
+        <w:keepLines/>
+        <w:pBdr>
+          <w:bottom w:val="single" w:color="F2F2F2" w:sz="2" w:space="4"/>
+          <w:left w:val="single" w:color="A6A6A6" w:sz="12" w:space="6"/>
+        </w:pBdr>
+        <w:shd w:fill="F2F2F2" w:color="auto" w:val="clear"/>
+        <w:spacing w:after="0" w:before="0" w:line="240"/>
+        <w:ind w:left="144" w:right="144"/>
+      </w:pPr>
+      <w:r>
+        <w:rPr>
+          <w:rFonts w:ascii="Consolas" w:cs="Consolas" w:eastAsia="Consolas" w:hAnsi="Consolas"/>
+          <w:sz w:val="17"/>
+          <w:szCs w:val="17"/>
+        </w:rPr>
+        <w:t xml:space="preserve">[exit code 0]</w:t>
+      </w:r>
+    </w:p>
+    <w:p>
+      <w:pPr>
+        <w:spacing w:after="80"/>
+      </w:pPr>
+    </w:p>
+    <w:p>
+      <w:pPr>
+        <w:spacing w:after="160" w:before="60"/>
+        <w:jc w:val="center"/>
+      </w:pPr>
+      <w:r>
+        <w:drawing>
+          <wp:inline distT="0" distB="0" distL="0" distR="0">
+            <wp:extent cx="5334000" cy="2381250"/>
+            <wp:effectExtent t="0" r="0" b="0" l="0"/>
+            <wp:docPr id="1" name="04.png" descr="Screenshot: Test 4: -?- (basic_client terminal)" title="Test 4: -?- (basic_client terminal)"/>
+            <wp:cNvGraphicFramePr>
+              <a:graphicFrameLocks xmlns:a="http://schemas.openxmlformats.org/drawingml/2006/main" noChangeAspect="1"/>
+            </wp:cNvGraphicFramePr>
+            <a:graphic xmlns:a="http://schemas.openxmlformats.org/drawingml/2006/main">
+              <a:graphicData uri="http://schemas.openxmlformats.org/drawingml/2006/picture">
+                <pic:pic xmlns:pic="http://schemas.openxmlformats.org/drawingml/2006/picture">
+                  <pic:nvPicPr>
+                    <pic:cNvPr id="0" name="" descr=""/>
+                    <pic:cNvPicPr>
+                      <a:picLocks noChangeAspect="1" noChangeArrowheads="1"/>
+                    </pic:cNvPicPr>
+                  </pic:nvPicPr>
+                  <pic:blipFill>
+                    <a:blip r:embed="rId11" cstate="none"/>
+                    <a:srcRect/>
+                    <a:stretch>
+                      <a:fillRect/>
+                    </a:stretch>
+                  </pic:blipFill>
+                  <pic:spPr bwMode="auto">
+                    <a:xfrm>
+                      <a:off x="0" y="0"/>
+                      <a:ext cx="5334000" cy="2381250"/>
+                    </a:xfrm>
+                    <a:prstGeom prst="rect">
+                      <a:avLst/>
+                    </a:prstGeom>
+                  </pic:spPr>
+                </pic:pic>
+              </a:graphicData>
+            </a:graphic>
+          </wp:inline>
+        </w:drawing>
+      </w:r>
+    </w:p>
+    <w:p>
+      <w:pPr>
+        <w:keepNext/>
+        <w:spacing w:after="60" w:before="120"/>
+      </w:pPr>
+      <w:r>
+        <w:rPr>
+          <w:b/>
+          <w:bCs/>
+        </w:rPr>
+        <w:t xml:space="preserve">Test 5: a?t (handout example)</w:t>
+      </w:r>
+    </w:p>
+    <w:p>
+      <w:pPr>
+        <w:keepNext/>
+        <w:keepLines/>
+        <w:pBdr>
+          <w:top w:val="single" w:color="F2F2F2" w:sz="2" w:space="4"/>
+          <w:left w:val="single" w:color="A6A6A6" w:sz="12" w:space="6"/>
+        </w:pBdr>
+        <w:shd w:fill="F2F2F2" w:color="auto" w:val="clear"/>
+        <w:spacing w:after="0" w:before="0" w:line="240"/>
+        <w:ind w:left="144" w:right="144"/>
+      </w:pPr>
+      <w:r>
+        <w:rPr>
+          <w:rFonts w:ascii="Consolas" w:cs="Consolas" w:eastAsia="Consolas" w:hAnsi="Consolas"/>
+          <w:sz w:val="17"/>
+          <w:szCs w:val="17"/>
+        </w:rPr>
+        <w:t xml:space="preserve">$ python3 basic_client.py      (typed: a?t)</w:t>
+      </w:r>
+    </w:p>
+    <w:p>
+      <w:pPr>
+        <w:keepNext/>
+        <w:keepLines/>
+        <w:pBdr>
+          <w:left w:val="single" w:color="A6A6A6" w:sz="12" w:space="6"/>
+        </w:pBdr>
+        <w:shd w:fill="F2F2F2" w:color="auto" w:val="clear"/>
+        <w:spacing w:after="0" w:before="0" w:line="240"/>
+        <w:ind w:left="144" w:right="144"/>
+      </w:pPr>
+      <w:r>
+        <w:rPr>
+          <w:rFonts w:ascii="Consolas" w:cs="Consolas" w:eastAsia="Consolas" w:hAnsi="Consolas"/>
+          <w:sz w:val="17"/>
+          <w:szCs w:val="17"/>
+        </w:rPr>
+        <w:t xml:space="preserve">Enter query: Server replied: 200 OK</w:t>
+      </w:r>
+    </w:p>
+    <w:p>
+      <w:pPr>
+        <w:keepNext/>
+        <w:keepLines/>
+        <w:pBdr>
+          <w:left w:val="single" w:color="A6A6A6" w:sz="12" w:space="6"/>
+        </w:pBdr>
+        <w:shd w:fill="F2F2F2" w:color="auto" w:val="clear"/>
+        <w:spacing w:after="0" w:before="0" w:line="240"/>
+        <w:ind w:left="144" w:right="144"/>
+      </w:pPr>
+      <w:r>
+        <w:rPr>
+          <w:rFonts w:ascii="Consolas" w:cs="Consolas" w:eastAsia="Consolas" w:hAnsi="Consolas"/>
+          <w:sz w:val="17"/>
+          <w:szCs w:val="17"/>
+        </w:rPr>
+        <w:t xml:space="preserve">Number of matching words: 4260</w:t>
+      </w:r>
+    </w:p>
+    <w:p>
+      <w:pPr>
+        <w:keepNext/>
+        <w:keepLines/>
+        <w:pBdr>
+          <w:left w:val="single" w:color="A6A6A6" w:sz="12" w:space="6"/>
+        </w:pBdr>
+        <w:shd w:fill="F2F2F2" w:color="auto" w:val="clear"/>
+        <w:spacing w:after="0" w:before="0" w:line="240"/>
+        <w:ind w:left="144" w:right="144"/>
+      </w:pPr>
+      <w:r>
+        <w:rPr>
+          <w:rFonts w:ascii="Consolas" w:cs="Consolas" w:eastAsia="Consolas" w:hAnsi="Consolas"/>
+          <w:sz w:val="17"/>
+          <w:szCs w:val="17"/>
+        </w:rPr>
+        <w:t xml:space="preserve">abactinal</w:t>
+      </w:r>
+    </w:p>
+    <w:p>
+      <w:pPr>
+        <w:keepNext/>
+        <w:keepLines/>
+        <w:pBdr>
+          <w:left w:val="single" w:color="A6A6A6" w:sz="12" w:space="6"/>
+        </w:pBdr>
+        <w:shd w:fill="F2F2F2" w:color="auto" w:val="clear"/>
+        <w:spacing w:after="0" w:before="0" w:line="240"/>
+        <w:ind w:left="144" w:right="144"/>
+      </w:pPr>
+      <w:r>
+        <w:rPr>
+          <w:rFonts w:ascii="Consolas" w:cs="Consolas" w:eastAsia="Consolas" w:hAnsi="Consolas"/>
+          <w:sz w:val="17"/>
+          <w:szCs w:val="17"/>
+        </w:rPr>
+        <w:t xml:space="preserve">abaft</w:t>
+      </w:r>
+    </w:p>
+    <w:p>
+      <w:pPr>
+        <w:keepNext/>
+        <w:keepLines/>
+        <w:pBdr>
+          <w:left w:val="single" w:color="A6A6A6" w:sz="12" w:space="6"/>
+        </w:pBdr>
+        <w:shd w:fill="F2F2F2" w:color="auto" w:val="clear"/>
+        <w:spacing w:after="0" w:before="0" w:line="240"/>
+        <w:ind w:left="144" w:right="144"/>
+      </w:pPr>
+      <w:r>
+        <w:rPr>
+          <w:rFonts w:ascii="Consolas" w:cs="Consolas" w:eastAsia="Consolas" w:hAnsi="Consolas"/>
+          <w:sz w:val="17"/>
+          <w:szCs w:val="17"/>
+        </w:rPr>
+        <w:t xml:space="preserve">abarticulation</w:t>
+      </w:r>
+    </w:p>
+    <w:p>
+      <w:pPr>
+        <w:keepNext/>
+        <w:keepLines/>
+        <w:pBdr>
+          <w:left w:val="single" w:color="A6A6A6" w:sz="12" w:space="6"/>
+        </w:pBdr>
+        <w:shd w:fill="F2F2F2" w:color="auto" w:val="clear"/>
+        <w:spacing w:after="0" w:before="0" w:line="240"/>
+        <w:ind w:left="144" w:right="144"/>
+      </w:pPr>
+      <w:r>
+        <w:rPr>
+          <w:rFonts w:ascii="Consolas" w:cs="Consolas" w:eastAsia="Consolas" w:hAnsi="Consolas"/>
+          <w:sz w:val="17"/>
+          <w:szCs w:val="17"/>
+        </w:rPr>
+        <w:t xml:space="preserve">abattis</w:t>
+      </w:r>
+    </w:p>
+    <w:p>
+      <w:pPr>
+        <w:keepNext/>
+        <w:keepLines/>
+        <w:pBdr>
+          <w:left w:val="single" w:color="A6A6A6" w:sz="12" w:space="6"/>
+        </w:pBdr>
+        <w:shd w:fill="F2F2F2" w:color="auto" w:val="clear"/>
+        <w:spacing w:after="0" w:before="0" w:line="240"/>
+        <w:ind w:left="144" w:right="144"/>
+      </w:pPr>
+      <w:r>
+        <w:rPr>
+          <w:rFonts w:ascii="Consolas" w:cs="Consolas" w:eastAsia="Consolas" w:hAnsi="Consolas"/>
+          <w:sz w:val="17"/>
+          <w:szCs w:val="17"/>
+        </w:rPr>
+        <w:t xml:space="preserve">abattoir</w:t>
+      </w:r>
+    </w:p>
+    <w:p>
+      <w:pPr>
+        <w:keepNext/>
+        <w:keepLines/>
+        <w:pBdr>
+          <w:left w:val="single" w:color="A6A6A6" w:sz="12" w:space="6"/>
+        </w:pBdr>
+        <w:shd w:fill="F2F2F2" w:color="auto" w:val="clear"/>
+        <w:spacing w:after="0" w:before="0" w:line="240"/>
+        <w:ind w:left="144" w:right="144"/>
+      </w:pPr>
+      <w:r>
+        <w:rPr>
+          <w:rFonts w:ascii="Consolas" w:cs="Consolas" w:eastAsia="Consolas" w:hAnsi="Consolas"/>
+          <w:sz w:val="17"/>
+          <w:szCs w:val="17"/>
+        </w:rPr>
+        <w:t xml:space="preserve">   ... (4254 more lines omitted; full output in logs/) ...</w:t>
+      </w:r>
+    </w:p>
+    <w:p>
+      <w:pPr>
+        <w:keepNext/>
+        <w:keepLines/>
+        <w:pBdr>
+          <w:left w:val="single" w:color="A6A6A6" w:sz="12" w:space="6"/>
+        </w:pBdr>
+        <w:shd w:fill="F2F2F2" w:color="auto" w:val="clear"/>
+        <w:spacing w:after="0" w:before="0" w:line="240"/>
+        <w:ind w:left="144" w:right="144"/>
+      </w:pPr>
+      <w:r>
+        <w:rPr>
+          <w:rFonts w:ascii="Consolas" w:cs="Consolas" w:eastAsia="Consolas" w:hAnsi="Consolas"/>
+          <w:sz w:val="17"/>
+          <w:szCs w:val="17"/>
+        </w:rPr>
+        <w:t xml:space="preserve">zygodactyl</w:t>
+      </w:r>
+    </w:p>
+    <w:p>
+      <w:pPr>
+        <w:keepNext w:val="false"/>
+        <w:keepLines/>
+        <w:pBdr>
+          <w:bottom w:val="single" w:color="F2F2F2" w:sz="2" w:space="4"/>
+          <w:left w:val="single" w:color="A6A6A6" w:sz="12" w:space="6"/>
+        </w:pBdr>
+        <w:shd w:fill="F2F2F2" w:color="auto" w:val="clear"/>
+        <w:spacing w:after="0" w:before="0" w:line="240"/>
+        <w:ind w:left="144" w:right="144"/>
+      </w:pPr>
+      <w:r>
+        <w:rPr>
+          <w:rFonts w:ascii="Consolas" w:cs="Consolas" w:eastAsia="Consolas" w:hAnsi="Consolas"/>
+          <w:sz w:val="17"/>
+          <w:szCs w:val="17"/>
+        </w:rPr>
+        <w:t xml:space="preserve">[exit code 0]</w:t>
+      </w:r>
+    </w:p>
+    <w:p>
+      <w:pPr>
+        <w:spacing w:after="80"/>
+      </w:pPr>
+    </w:p>
+    <w:p>
+      <w:pPr>
+        <w:spacing w:after="160" w:before="60"/>
+        <w:jc w:val="center"/>
+      </w:pPr>
+      <w:r>
+        <w:drawing>
+          <wp:inline distT="0" distB="0" distL="0" distR="0">
+            <wp:extent cx="5334000" cy="4391025"/>
+            <wp:effectExtent t="0" r="0" b="0" l="0"/>
+            <wp:docPr id="1" name="05.png" descr="Screenshot: Test 5: a?t (handout example) (basic_client terminal)" title="Test 5: a?t (handout example) (basic_client terminal)"/>
+            <wp:cNvGraphicFramePr>
+              <a:graphicFrameLocks xmlns:a="http://schemas.openxmlformats.org/drawingml/2006/main" noChangeAspect="1"/>
+            </wp:cNvGraphicFramePr>
+            <a:graphic xmlns:a="http://schemas.openxmlformats.org/drawingml/2006/main">
+              <a:graphicData uri="http://schemas.openxmlformats.org/drawingml/2006/picture">
+                <pic:pic xmlns:pic="http://schemas.openxmlformats.org/drawingml/2006/picture">
+                  <pic:nvPicPr>
+                    <pic:cNvPr id="0" name="" descr=""/>
+                    <pic:cNvPicPr>
+                      <a:picLocks noChangeAspect="1" noChangeArrowheads="1"/>
+                    </pic:cNvPicPr>
+                  </pic:nvPicPr>
+                  <pic:blipFill>
+                    <a:blip r:embed="rId12" cstate="none"/>
+                    <a:srcRect/>
+                    <a:stretch>
+                      <a:fillRect/>
+                    </a:stretch>
+                  </pic:blipFill>
+                  <pic:spPr bwMode="auto">
+                    <a:xfrm>
+                      <a:off x="0" y="0"/>
+                      <a:ext cx="5334000" cy="4391025"/>
+                    </a:xfrm>
+                    <a:prstGeom prst="rect">
+                      <a:avLst/>
+                    </a:prstGeom>
+                  </pic:spPr>
+                </pic:pic>
+              </a:graphicData>
+            </a:graphic>
+          </wp:inline>
+        </w:drawing>
+      </w:r>
+    </w:p>
+    <w:p>
+      <w:pPr>
+        <w:keepNext/>
+        <w:spacing w:after="60" w:before="120"/>
+      </w:pPr>
+      <w:r>
+        <w:rPr>
+          <w:b/>
+          <w:bCs/>
+        </w:rPr>
+        <w:t xml:space="preserve">Test 6: zzzzqx (no match)</w:t>
+      </w:r>
+    </w:p>
+    <w:p>
+      <w:pPr>
+        <w:keepNext/>
+        <w:keepLines/>
+        <w:pBdr>
+          <w:top w:val="single" w:color="F2F2F2" w:sz="2" w:space="4"/>
+          <w:left w:val="single" w:color="A6A6A6" w:sz="12" w:space="6"/>
+        </w:pBdr>
+        <w:shd w:fill="F2F2F2" w:color="auto" w:val="clear"/>
+        <w:spacing w:after="0" w:before="0" w:line="240"/>
+        <w:ind w:left="144" w:right="144"/>
+      </w:pPr>
+      <w:r>
+        <w:rPr>
+          <w:rFonts w:ascii="Consolas" w:cs="Consolas" w:eastAsia="Consolas" w:hAnsi="Consolas"/>
+          <w:sz w:val="17"/>
+          <w:szCs w:val="17"/>
+        </w:rPr>
+        <w:t xml:space="preserve">$ python3 basic_client.py      (typed: zzzzqx)</w:t>
+      </w:r>
+    </w:p>
+    <w:p>
+      <w:pPr>
+        <w:keepNext/>
+        <w:keepLines/>
+        <w:pBdr>
+          <w:left w:val="single" w:color="A6A6A6" w:sz="12" w:space="6"/>
+        </w:pBdr>
+        <w:shd w:fill="F2F2F2" w:color="auto" w:val="clear"/>
+        <w:spacing w:after="0" w:before="0" w:line="240"/>
+        <w:ind w:left="144" w:right="144"/>
+      </w:pPr>
+      <w:r>
+        <w:rPr>
+          <w:rFonts w:ascii="Consolas" w:cs="Consolas" w:eastAsia="Consolas" w:hAnsi="Consolas"/>
+          <w:sz w:val="17"/>
+          <w:szCs w:val="17"/>
+        </w:rPr>
+        <w:t xml:space="preserve">Enter query: Server replied: 404 NOT_FOUND</w:t>
+      </w:r>
+    </w:p>
+    <w:p>
+      <w:pPr>
+        <w:keepNext/>
+        <w:keepLines/>
+        <w:pBdr>
+          <w:left w:val="single" w:color="A6A6A6" w:sz="12" w:space="6"/>
+        </w:pBdr>
+        <w:shd w:fill="F2F2F2" w:color="auto" w:val="clear"/>
+        <w:spacing w:after="0" w:before="0" w:line="240"/>
+        <w:ind w:left="144" w:right="144"/>
+      </w:pPr>
+      <w:r>
+        <w:rPr>
+          <w:rFonts w:ascii="Consolas" w:cs="Consolas" w:eastAsia="Consolas" w:hAnsi="Consolas"/>
+          <w:sz w:val="17"/>
+          <w:szCs w:val="17"/>
+        </w:rPr>
+        <w:t xml:space="preserve">Number of matching words: 0</w:t>
+      </w:r>
+    </w:p>
+    <w:p>
+      <w:pPr>
+        <w:keepNext w:val="false"/>
+        <w:keepLines/>
+        <w:pBdr>
+          <w:bottom w:val="single" w:color="F2F2F2" w:sz="2" w:space="4"/>
+          <w:left w:val="single" w:color="A6A6A6" w:sz="12" w:space="6"/>
+        </w:pBdr>
+        <w:shd w:fill="F2F2F2" w:color="auto" w:val="clear"/>
+        <w:spacing w:after="0" w:before="0" w:line="240"/>
+        <w:ind w:left="144" w:right="144"/>
+      </w:pPr>
+      <w:r>
+        <w:rPr>
+          <w:rFonts w:ascii="Consolas" w:cs="Consolas" w:eastAsia="Consolas" w:hAnsi="Consolas"/>
+          <w:sz w:val="17"/>
+          <w:szCs w:val="17"/>
+        </w:rPr>
+        <w:t xml:space="preserve">[exit code 0]</w:t>
+      </w:r>
+    </w:p>
+    <w:p>
+      <w:pPr>
+        <w:spacing w:after="80"/>
+      </w:pPr>
+    </w:p>
+    <w:p>
+      <w:pPr>
+        <w:spacing w:after="160" w:before="60"/>
       </w:pPr>
       <w:r>
         <w:rPr>
@@ -7570,7 +8873,7 @@
           <w:bCs/>
           <w:color w:val="C00000"/>
         </w:rPr>
-        <w:t xml:space="preserve">[SCREENSHOT PLACEHOLDER: Test 1: ?????????? (basic_client terminal)]</w:t>
+        <w:t xml:space="preserve">[SCREENSHOT PLACEHOLDER: Test 6: zzzzqx (no match) (basic_client terminal)]</w:t>
       </w:r>
     </w:p>
     <w:p>
@@ -7583,7 +8886,7 @@
           <w:b/>
           <w:bCs/>
         </w:rPr>
-        <w:t xml:space="preserve">Test 2: ?</w:t>
+        <w:t xml:space="preserve">Test 7: empty query</w:t>
       </w:r>
     </w:p>
     <w:p>
@@ -7604,187 +8907,27 @@
           <w:sz w:val="17"/>
           <w:szCs w:val="17"/>
         </w:rPr>
-        <w:t xml:space="preserve">$ python3 basic_client.py      (typed: ?)</w:t>
-      </w:r>
-    </w:p>
-    <w:p>
-      <w:pPr>
-        <w:keepNext/>
-        <w:keepLines/>
-        <w:pBdr>
-          <w:left w:val="single" w:color="A6A6A6" w:sz="12" w:space="6"/>
-        </w:pBdr>
-        <w:shd w:fill="F2F2F2" w:color="auto" w:val="clear"/>
-        <w:spacing w:after="0" w:before="0" w:line="240"/>
-        <w:ind w:left="144" w:right="144"/>
-      </w:pPr>
-      <w:r>
-        <w:rPr>
-          <w:rFonts w:ascii="Consolas" w:cs="Consolas" w:eastAsia="Consolas" w:hAnsi="Consolas"/>
-          <w:sz w:val="17"/>
-          <w:szCs w:val="17"/>
-        </w:rPr>
-        <w:t xml:space="preserve">Enter query: Server replied: 200 OK</w:t>
-      </w:r>
-    </w:p>
-    <w:p>
-      <w:pPr>
-        <w:keepNext/>
-        <w:keepLines/>
-        <w:pBdr>
-          <w:left w:val="single" w:color="A6A6A6" w:sz="12" w:space="6"/>
-        </w:pBdr>
-        <w:shd w:fill="F2F2F2" w:color="auto" w:val="clear"/>
-        <w:spacing w:after="0" w:before="0" w:line="240"/>
-        <w:ind w:left="144" w:right="144"/>
-      </w:pPr>
-      <w:r>
-        <w:rPr>
-          <w:rFonts w:ascii="Consolas" w:cs="Consolas" w:eastAsia="Consolas" w:hAnsi="Consolas"/>
-          <w:sz w:val="17"/>
-          <w:szCs w:val="17"/>
-        </w:rPr>
-        <w:t xml:space="preserve">Number of matching words: 69903</w:t>
-      </w:r>
-    </w:p>
-    <w:p>
-      <w:pPr>
-        <w:keepNext/>
-        <w:keepLines/>
-        <w:pBdr>
-          <w:left w:val="single" w:color="A6A6A6" w:sz="12" w:space="6"/>
-        </w:pBdr>
-        <w:shd w:fill="F2F2F2" w:color="auto" w:val="clear"/>
-        <w:spacing w:after="0" w:before="0" w:line="240"/>
-        <w:ind w:left="144" w:right="144"/>
-      </w:pPr>
-      <w:r>
-        <w:rPr>
-          <w:rFonts w:ascii="Consolas" w:cs="Consolas" w:eastAsia="Consolas" w:hAnsi="Consolas"/>
-          <w:sz w:val="17"/>
-          <w:szCs w:val="17"/>
-        </w:rPr>
-        <w:t xml:space="preserve">a</w:t>
-      </w:r>
-    </w:p>
-    <w:p>
-      <w:pPr>
-        <w:keepNext/>
-        <w:keepLines/>
-        <w:pBdr>
-          <w:left w:val="single" w:color="A6A6A6" w:sz="12" w:space="6"/>
-        </w:pBdr>
-        <w:shd w:fill="F2F2F2" w:color="auto" w:val="clear"/>
-        <w:spacing w:after="0" w:before="0" w:line="240"/>
-        <w:ind w:left="144" w:right="144"/>
-      </w:pPr>
-      <w:r>
-        <w:rPr>
-          <w:rFonts w:ascii="Consolas" w:cs="Consolas" w:eastAsia="Consolas" w:hAnsi="Consolas"/>
-          <w:sz w:val="17"/>
-          <w:szCs w:val="17"/>
-        </w:rPr>
-        <w:t xml:space="preserve">a-horizon</w:t>
-      </w:r>
-    </w:p>
-    <w:p>
-      <w:pPr>
-        <w:keepNext/>
-        <w:keepLines/>
-        <w:pBdr>
-          <w:left w:val="single" w:color="A6A6A6" w:sz="12" w:space="6"/>
-        </w:pBdr>
-        <w:shd w:fill="F2F2F2" w:color="auto" w:val="clear"/>
-        <w:spacing w:after="0" w:before="0" w:line="240"/>
-        <w:ind w:left="144" w:right="144"/>
-      </w:pPr>
-      <w:r>
-        <w:rPr>
-          <w:rFonts w:ascii="Consolas" w:cs="Consolas" w:eastAsia="Consolas" w:hAnsi="Consolas"/>
-          <w:sz w:val="17"/>
-          <w:szCs w:val="17"/>
-        </w:rPr>
-        <w:t xml:space="preserve">a-ok</w:t>
-      </w:r>
-    </w:p>
-    <w:p>
-      <w:pPr>
-        <w:keepNext/>
-        <w:keepLines/>
-        <w:pBdr>
-          <w:left w:val="single" w:color="A6A6A6" w:sz="12" w:space="6"/>
-        </w:pBdr>
-        <w:shd w:fill="F2F2F2" w:color="auto" w:val="clear"/>
-        <w:spacing w:after="0" w:before="0" w:line="240"/>
-        <w:ind w:left="144" w:right="144"/>
-      </w:pPr>
-      <w:r>
-        <w:rPr>
-          <w:rFonts w:ascii="Consolas" w:cs="Consolas" w:eastAsia="Consolas" w:hAnsi="Consolas"/>
-          <w:sz w:val="17"/>
-          <w:szCs w:val="17"/>
-        </w:rPr>
-        <w:t xml:space="preserve">aardvark</w:t>
-      </w:r>
-    </w:p>
-    <w:p>
-      <w:pPr>
-        <w:keepNext/>
-        <w:keepLines/>
-        <w:pBdr>
-          <w:left w:val="single" w:color="A6A6A6" w:sz="12" w:space="6"/>
-        </w:pBdr>
-        <w:shd w:fill="F2F2F2" w:color="auto" w:val="clear"/>
-        <w:spacing w:after="0" w:before="0" w:line="240"/>
-        <w:ind w:left="144" w:right="144"/>
-      </w:pPr>
-      <w:r>
-        <w:rPr>
-          <w:rFonts w:ascii="Consolas" w:cs="Consolas" w:eastAsia="Consolas" w:hAnsi="Consolas"/>
-          <w:sz w:val="17"/>
-          <w:szCs w:val="17"/>
-        </w:rPr>
-        <w:t xml:space="preserve">aardwolf</w:t>
-      </w:r>
-    </w:p>
-    <w:p>
-      <w:pPr>
-        <w:keepNext/>
-        <w:keepLines/>
-        <w:pBdr>
-          <w:left w:val="single" w:color="A6A6A6" w:sz="12" w:space="6"/>
-        </w:pBdr>
-        <w:shd w:fill="F2F2F2" w:color="auto" w:val="clear"/>
-        <w:spacing w:after="0" w:before="0" w:line="240"/>
-        <w:ind w:left="144" w:right="144"/>
-      </w:pPr>
-      <w:r>
-        <w:rPr>
-          <w:rFonts w:ascii="Consolas" w:cs="Consolas" w:eastAsia="Consolas" w:hAnsi="Consolas"/>
-          <w:sz w:val="17"/>
-          <w:szCs w:val="17"/>
-        </w:rPr>
-        <w:t xml:space="preserve">   ... (69897 more lines omitted; full output in logs/) ...</w:t>
-      </w:r>
-    </w:p>
-    <w:p>
-      <w:pPr>
-        <w:keepNext/>
-        <w:keepLines/>
-        <w:pBdr>
-          <w:left w:val="single" w:color="A6A6A6" w:sz="12" w:space="6"/>
-        </w:pBdr>
-        <w:shd w:fill="F2F2F2" w:color="auto" w:val="clear"/>
-        <w:spacing w:after="0" w:before="0" w:line="240"/>
-        <w:ind w:left="144" w:right="144"/>
-      </w:pPr>
-      <w:r>
-        <w:rPr>
-          <w:rFonts w:ascii="Consolas" w:cs="Consolas" w:eastAsia="Consolas" w:hAnsi="Consolas"/>
-          <w:sz w:val="17"/>
-          <w:szCs w:val="17"/>
-        </w:rPr>
-        <w:t xml:space="preserve">zymurgy</w:t>
+        <w:t xml:space="preserve">$ python3 basic_client.py      (typed: )</w:t>
+      </w:r>
+    </w:p>
+    <w:p>
+      <w:pPr>
+        <w:keepNext/>
+        <w:keepLines/>
+        <w:pBdr>
+          <w:left w:val="single" w:color="A6A6A6" w:sz="12" w:space="6"/>
+        </w:pBdr>
+        <w:shd w:fill="F2F2F2" w:color="auto" w:val="clear"/>
+        <w:spacing w:after="0" w:before="0" w:line="240"/>
+        <w:ind w:left="144" w:right="144"/>
+      </w:pPr>
+      <w:r>
+        <w:rPr>
+          <w:rFonts w:ascii="Consolas" w:cs="Consolas" w:eastAsia="Consolas" w:hAnsi="Consolas"/>
+          <w:sz w:val="17"/>
+          <w:szCs w:val="17"/>
+        </w:rPr>
+        <w:t xml:space="preserve">Enter query: Query must not be empty.</w:t>
       </w:r>
     </w:p>
     <w:p>
@@ -7805,7 +8948,7 @@
           <w:sz w:val="17"/>
           <w:szCs w:val="17"/>
         </w:rPr>
-        <w:t xml:space="preserve">[exit code 0]</w:t>
+        <w:t xml:space="preserve">[exit code 1]</w:t>
       </w:r>
     </w:p>
     <w:p>
@@ -7816,979 +8959,47 @@
     <w:p>
       <w:pPr>
         <w:spacing w:after="160" w:before="60"/>
-      </w:pPr>
-      <w:r>
-        <w:rPr>
-          <w:b/>
-          <w:bCs/>
-          <w:color w:val="C00000"/>
-        </w:rPr>
-        <w:t xml:space="preserve">[SCREENSHOT PLACEHOLDER: Test 2: ? (basic_client terminal)]</w:t>
-      </w:r>
-    </w:p>
-    <w:p>
-      <w:pPr>
-        <w:keepNext/>
-        <w:spacing w:after="60" w:before="120"/>
-      </w:pPr>
-      <w:r>
-        <w:rPr>
-          <w:b/>
-          <w:bCs/>
-        </w:rPr>
-        <w:t xml:space="preserve">Test 3: ?(a)</w:t>
-      </w:r>
-    </w:p>
-    <w:p>
-      <w:pPr>
-        <w:keepNext/>
-        <w:keepLines/>
-        <w:pBdr>
-          <w:top w:val="single" w:color="F2F2F2" w:sz="2" w:space="4"/>
-          <w:left w:val="single" w:color="A6A6A6" w:sz="12" w:space="6"/>
-        </w:pBdr>
-        <w:shd w:fill="F2F2F2" w:color="auto" w:val="clear"/>
-        <w:spacing w:after="0" w:before="0" w:line="240"/>
-        <w:ind w:left="144" w:right="144"/>
-      </w:pPr>
-      <w:r>
-        <w:rPr>
-          <w:rFonts w:ascii="Consolas" w:cs="Consolas" w:eastAsia="Consolas" w:hAnsi="Consolas"/>
-          <w:sz w:val="17"/>
-          <w:szCs w:val="17"/>
-        </w:rPr>
-        <w:t xml:space="preserve">$ python3 basic_client.py      (typed: ?(a))</w:t>
-      </w:r>
-    </w:p>
-    <w:p>
-      <w:pPr>
-        <w:keepNext/>
-        <w:keepLines/>
-        <w:pBdr>
-          <w:left w:val="single" w:color="A6A6A6" w:sz="12" w:space="6"/>
-        </w:pBdr>
-        <w:shd w:fill="F2F2F2" w:color="auto" w:val="clear"/>
-        <w:spacing w:after="0" w:before="0" w:line="240"/>
-        <w:ind w:left="144" w:right="144"/>
-      </w:pPr>
-      <w:r>
-        <w:rPr>
-          <w:rFonts w:ascii="Consolas" w:cs="Consolas" w:eastAsia="Consolas" w:hAnsi="Consolas"/>
-          <w:sz w:val="17"/>
-          <w:szCs w:val="17"/>
-        </w:rPr>
-        <w:t xml:space="preserve">Enter query: Server replied: 200 OK</w:t>
-      </w:r>
-    </w:p>
-    <w:p>
-      <w:pPr>
-        <w:keepNext/>
-        <w:keepLines/>
-        <w:pBdr>
-          <w:left w:val="single" w:color="A6A6A6" w:sz="12" w:space="6"/>
-        </w:pBdr>
-        <w:shd w:fill="F2F2F2" w:color="auto" w:val="clear"/>
-        <w:spacing w:after="0" w:before="0" w:line="240"/>
-        <w:ind w:left="144" w:right="144"/>
-      </w:pPr>
-      <w:r>
-        <w:rPr>
-          <w:rFonts w:ascii="Consolas" w:cs="Consolas" w:eastAsia="Consolas" w:hAnsi="Consolas"/>
-          <w:sz w:val="17"/>
-          <w:szCs w:val="17"/>
-        </w:rPr>
-        <w:t xml:space="preserve">Number of matching words: 414</w:t>
-      </w:r>
-    </w:p>
-    <w:p>
-      <w:pPr>
-        <w:keepNext/>
-        <w:keepLines/>
-        <w:pBdr>
-          <w:left w:val="single" w:color="A6A6A6" w:sz="12" w:space="6"/>
-        </w:pBdr>
-        <w:shd w:fill="F2F2F2" w:color="auto" w:val="clear"/>
-        <w:spacing w:after="0" w:before="0" w:line="240"/>
-        <w:ind w:left="144" w:right="144"/>
-      </w:pPr>
-      <w:r>
-        <w:rPr>
-          <w:rFonts w:ascii="Consolas" w:cs="Consolas" w:eastAsia="Consolas" w:hAnsi="Consolas"/>
-          <w:sz w:val="17"/>
-          <w:szCs w:val="17"/>
-        </w:rPr>
-        <w:t xml:space="preserve">acting(a)</w:t>
-      </w:r>
-    </w:p>
-    <w:p>
-      <w:pPr>
-        <w:keepNext/>
-        <w:keepLines/>
-        <w:pBdr>
-          <w:left w:val="single" w:color="A6A6A6" w:sz="12" w:space="6"/>
-        </w:pBdr>
-        <w:shd w:fill="F2F2F2" w:color="auto" w:val="clear"/>
-        <w:spacing w:after="0" w:before="0" w:line="240"/>
-        <w:ind w:left="144" w:right="144"/>
-      </w:pPr>
-      <w:r>
-        <w:rPr>
-          <w:rFonts w:ascii="Consolas" w:cs="Consolas" w:eastAsia="Consolas" w:hAnsi="Consolas"/>
-          <w:sz w:val="17"/>
-          <w:szCs w:val="17"/>
-        </w:rPr>
-        <w:t xml:space="preserve">activating(a)</w:t>
-      </w:r>
-    </w:p>
-    <w:p>
-      <w:pPr>
-        <w:keepNext/>
-        <w:keepLines/>
-        <w:pBdr>
-          <w:left w:val="single" w:color="A6A6A6" w:sz="12" w:space="6"/>
-        </w:pBdr>
-        <w:shd w:fill="F2F2F2" w:color="auto" w:val="clear"/>
-        <w:spacing w:after="0" w:before="0" w:line="240"/>
-        <w:ind w:left="144" w:right="144"/>
-      </w:pPr>
-      <w:r>
-        <w:rPr>
-          <w:rFonts w:ascii="Consolas" w:cs="Consolas" w:eastAsia="Consolas" w:hAnsi="Consolas"/>
-          <w:sz w:val="17"/>
-          <w:szCs w:val="17"/>
-        </w:rPr>
-        <w:t xml:space="preserve">admitted(a)</w:t>
-      </w:r>
-    </w:p>
-    <w:p>
-      <w:pPr>
-        <w:keepNext/>
-        <w:keepLines/>
-        <w:pBdr>
-          <w:left w:val="single" w:color="A6A6A6" w:sz="12" w:space="6"/>
-        </w:pBdr>
-        <w:shd w:fill="F2F2F2" w:color="auto" w:val="clear"/>
-        <w:spacing w:after="0" w:before="0" w:line="240"/>
-        <w:ind w:left="144" w:right="144"/>
-      </w:pPr>
-      <w:r>
-        <w:rPr>
-          <w:rFonts w:ascii="Consolas" w:cs="Consolas" w:eastAsia="Consolas" w:hAnsi="Consolas"/>
-          <w:sz w:val="17"/>
-          <w:szCs w:val="17"/>
-        </w:rPr>
-        <w:t xml:space="preserve">advance(a)</w:t>
-      </w:r>
-    </w:p>
-    <w:p>
-      <w:pPr>
-        <w:keepNext/>
-        <w:keepLines/>
-        <w:pBdr>
-          <w:left w:val="single" w:color="A6A6A6" w:sz="12" w:space="6"/>
-        </w:pBdr>
-        <w:shd w:fill="F2F2F2" w:color="auto" w:val="clear"/>
-        <w:spacing w:after="0" w:before="0" w:line="240"/>
-        <w:ind w:left="144" w:right="144"/>
-      </w:pPr>
-      <w:r>
-        <w:rPr>
-          <w:rFonts w:ascii="Consolas" w:cs="Consolas" w:eastAsia="Consolas" w:hAnsi="Consolas"/>
-          <w:sz w:val="17"/>
-          <w:szCs w:val="17"/>
-        </w:rPr>
-        <w:t xml:space="preserve">advanced(a)</w:t>
-      </w:r>
-    </w:p>
-    <w:p>
-      <w:pPr>
-        <w:keepNext/>
-        <w:keepLines/>
-        <w:pBdr>
-          <w:left w:val="single" w:color="A6A6A6" w:sz="12" w:space="6"/>
-        </w:pBdr>
-        <w:shd w:fill="F2F2F2" w:color="auto" w:val="clear"/>
-        <w:spacing w:after="0" w:before="0" w:line="240"/>
-        <w:ind w:left="144" w:right="144"/>
-      </w:pPr>
-      <w:r>
-        <w:rPr>
-          <w:rFonts w:ascii="Consolas" w:cs="Consolas" w:eastAsia="Consolas" w:hAnsi="Consolas"/>
-          <w:sz w:val="17"/>
-          <w:szCs w:val="17"/>
-        </w:rPr>
-        <w:t xml:space="preserve">   ... (408 more lines omitted; full output in logs/) ...</w:t>
-      </w:r>
-    </w:p>
-    <w:p>
-      <w:pPr>
-        <w:keepNext/>
-        <w:keepLines/>
-        <w:pBdr>
-          <w:left w:val="single" w:color="A6A6A6" w:sz="12" w:space="6"/>
-        </w:pBdr>
-        <w:shd w:fill="F2F2F2" w:color="auto" w:val="clear"/>
-        <w:spacing w:after="0" w:before="0" w:line="240"/>
-        <w:ind w:left="144" w:right="144"/>
-      </w:pPr>
-      <w:r>
-        <w:rPr>
-          <w:rFonts w:ascii="Consolas" w:cs="Consolas" w:eastAsia="Consolas" w:hAnsi="Consolas"/>
-          <w:sz w:val="17"/>
-          <w:szCs w:val="17"/>
-        </w:rPr>
-        <w:t xml:space="preserve">zero(a)</w:t>
-      </w:r>
-    </w:p>
-    <w:p>
-      <w:pPr>
-        <w:keepNext w:val="false"/>
-        <w:keepLines/>
-        <w:pBdr>
-          <w:bottom w:val="single" w:color="F2F2F2" w:sz="2" w:space="4"/>
-          <w:left w:val="single" w:color="A6A6A6" w:sz="12" w:space="6"/>
-        </w:pBdr>
-        <w:shd w:fill="F2F2F2" w:color="auto" w:val="clear"/>
-        <w:spacing w:after="0" w:before="0" w:line="240"/>
-        <w:ind w:left="144" w:right="144"/>
-      </w:pPr>
-      <w:r>
-        <w:rPr>
-          <w:rFonts w:ascii="Consolas" w:cs="Consolas" w:eastAsia="Consolas" w:hAnsi="Consolas"/>
-          <w:sz w:val="17"/>
-          <w:szCs w:val="17"/>
-        </w:rPr>
-        <w:t xml:space="preserve">[exit code 0]</w:t>
-      </w:r>
-    </w:p>
-    <w:p>
-      <w:pPr>
-        <w:spacing w:after="80"/>
-      </w:pPr>
-    </w:p>
-    <w:p>
-      <w:pPr>
-        <w:spacing w:after="160" w:before="60"/>
-      </w:pPr>
-      <w:r>
-        <w:rPr>
-          <w:b/>
-          <w:bCs/>
-          <w:color w:val="C00000"/>
-        </w:rPr>
-        <w:t xml:space="preserve">[SCREENSHOT PLACEHOLDER: Test 3: ?(a) (basic_client terminal)]</w:t>
-      </w:r>
-    </w:p>
-    <w:p>
-      <w:pPr>
-        <w:keepNext/>
-        <w:spacing w:after="60" w:before="120"/>
-      </w:pPr>
-      <w:r>
-        <w:rPr>
-          <w:b/>
-          <w:bCs/>
-        </w:rPr>
-        <w:t xml:space="preserve">Test 4: -?-</w:t>
-      </w:r>
-    </w:p>
-    <w:p>
-      <w:pPr>
-        <w:keepNext/>
-        <w:keepLines/>
-        <w:pBdr>
-          <w:top w:val="single" w:color="F2F2F2" w:sz="2" w:space="4"/>
-          <w:left w:val="single" w:color="A6A6A6" w:sz="12" w:space="6"/>
-        </w:pBdr>
-        <w:shd w:fill="F2F2F2" w:color="auto" w:val="clear"/>
-        <w:spacing w:after="0" w:before="0" w:line="240"/>
-        <w:ind w:left="144" w:right="144"/>
-      </w:pPr>
-      <w:r>
-        <w:rPr>
-          <w:rFonts w:ascii="Consolas" w:cs="Consolas" w:eastAsia="Consolas" w:hAnsi="Consolas"/>
-          <w:sz w:val="17"/>
-          <w:szCs w:val="17"/>
-        </w:rPr>
-        <w:t xml:space="preserve">$ python3 basic_client.py      (typed: -?-)</w:t>
-      </w:r>
-    </w:p>
-    <w:p>
-      <w:pPr>
-        <w:keepNext/>
-        <w:keepLines/>
-        <w:pBdr>
-          <w:left w:val="single" w:color="A6A6A6" w:sz="12" w:space="6"/>
-        </w:pBdr>
-        <w:shd w:fill="F2F2F2" w:color="auto" w:val="clear"/>
-        <w:spacing w:after="0" w:before="0" w:line="240"/>
-        <w:ind w:left="144" w:right="144"/>
-      </w:pPr>
-      <w:r>
-        <w:rPr>
-          <w:rFonts w:ascii="Consolas" w:cs="Consolas" w:eastAsia="Consolas" w:hAnsi="Consolas"/>
-          <w:sz w:val="17"/>
-          <w:szCs w:val="17"/>
-        </w:rPr>
-        <w:t xml:space="preserve">Enter query: Server replied: 200 OK</w:t>
-      </w:r>
-    </w:p>
-    <w:p>
-      <w:pPr>
-        <w:keepNext/>
-        <w:keepLines/>
-        <w:pBdr>
-          <w:left w:val="single" w:color="A6A6A6" w:sz="12" w:space="6"/>
-        </w:pBdr>
-        <w:shd w:fill="F2F2F2" w:color="auto" w:val="clear"/>
-        <w:spacing w:after="0" w:before="0" w:line="240"/>
-        <w:ind w:left="144" w:right="144"/>
-      </w:pPr>
-      <w:r>
-        <w:rPr>
-          <w:rFonts w:ascii="Consolas" w:cs="Consolas" w:eastAsia="Consolas" w:hAnsi="Consolas"/>
-          <w:sz w:val="17"/>
-          <w:szCs w:val="17"/>
-        </w:rPr>
-        <w:t xml:space="preserve">Number of matching words: 13</w:t>
-      </w:r>
-    </w:p>
-    <w:p>
-      <w:pPr>
-        <w:keepNext/>
-        <w:keepLines/>
-        <w:pBdr>
-          <w:left w:val="single" w:color="A6A6A6" w:sz="12" w:space="6"/>
-        </w:pBdr>
-        <w:shd w:fill="F2F2F2" w:color="auto" w:val="clear"/>
-        <w:spacing w:after="0" w:before="0" w:line="240"/>
-        <w:ind w:left="144" w:right="144"/>
-      </w:pPr>
-      <w:r>
-        <w:rPr>
-          <w:rFonts w:ascii="Consolas" w:cs="Consolas" w:eastAsia="Consolas" w:hAnsi="Consolas"/>
-          <w:sz w:val="17"/>
-          <w:szCs w:val="17"/>
-        </w:rPr>
-        <w:t xml:space="preserve">bric-a-brac</w:t>
-      </w:r>
-    </w:p>
-    <w:p>
-      <w:pPr>
-        <w:keepNext/>
-        <w:keepLines/>
-        <w:pBdr>
-          <w:left w:val="single" w:color="A6A6A6" w:sz="12" w:space="6"/>
-        </w:pBdr>
-        <w:shd w:fill="F2F2F2" w:color="auto" w:val="clear"/>
-        <w:spacing w:after="0" w:before="0" w:line="240"/>
-        <w:ind w:left="144" w:right="144"/>
-      </w:pPr>
-      <w:r>
-        <w:rPr>
-          <w:rFonts w:ascii="Consolas" w:cs="Consolas" w:eastAsia="Consolas" w:hAnsi="Consolas"/>
-          <w:sz w:val="17"/>
-          <w:szCs w:val="17"/>
-        </w:rPr>
-        <w:t xml:space="preserve">cap-a-pie</w:t>
-      </w:r>
-    </w:p>
-    <w:p>
-      <w:pPr>
-        <w:keepNext/>
-        <w:keepLines/>
-        <w:pBdr>
-          <w:left w:val="single" w:color="A6A6A6" w:sz="12" w:space="6"/>
-        </w:pBdr>
-        <w:shd w:fill="F2F2F2" w:color="auto" w:val="clear"/>
-        <w:spacing w:after="0" w:before="0" w:line="240"/>
-        <w:ind w:left="144" w:right="144"/>
-      </w:pPr>
-      <w:r>
-        <w:rPr>
-          <w:rFonts w:ascii="Consolas" w:cs="Consolas" w:eastAsia="Consolas" w:hAnsi="Consolas"/>
-          <w:sz w:val="17"/>
-          <w:szCs w:val="17"/>
-        </w:rPr>
-        <w:t xml:space="preserve">cock-a-doodle-doo</w:t>
-      </w:r>
-    </w:p>
-    <w:p>
-      <w:pPr>
-        <w:keepNext/>
-        <w:keepLines/>
-        <w:pBdr>
-          <w:left w:val="single" w:color="A6A6A6" w:sz="12" w:space="6"/>
-        </w:pBdr>
-        <w:shd w:fill="F2F2F2" w:color="auto" w:val="clear"/>
-        <w:spacing w:after="0" w:before="0" w:line="240"/>
-        <w:ind w:left="144" w:right="144"/>
-      </w:pPr>
-      <w:r>
-        <w:rPr>
-          <w:rFonts w:ascii="Consolas" w:cs="Consolas" w:eastAsia="Consolas" w:hAnsi="Consolas"/>
-          <w:sz w:val="17"/>
-          <w:szCs w:val="17"/>
-        </w:rPr>
-        <w:t xml:space="preserve">cock-a-leekie</w:t>
-      </w:r>
-    </w:p>
-    <w:p>
-      <w:pPr>
-        <w:keepNext/>
-        <w:keepLines/>
-        <w:pBdr>
-          <w:left w:val="single" w:color="A6A6A6" w:sz="12" w:space="6"/>
-        </w:pBdr>
-        <w:shd w:fill="F2F2F2" w:color="auto" w:val="clear"/>
-        <w:spacing w:after="0" w:before="0" w:line="240"/>
-        <w:ind w:left="144" w:right="144"/>
-      </w:pPr>
-      <w:r>
-        <w:rPr>
-          <w:rFonts w:ascii="Consolas" w:cs="Consolas" w:eastAsia="Consolas" w:hAnsi="Consolas"/>
-          <w:sz w:val="17"/>
-          <w:szCs w:val="17"/>
-        </w:rPr>
-        <w:t xml:space="preserve">high-muck-a-muck</w:t>
-      </w:r>
-    </w:p>
-    <w:p>
-      <w:pPr>
-        <w:keepNext/>
-        <w:keepLines/>
-        <w:pBdr>
-          <w:left w:val="single" w:color="A6A6A6" w:sz="12" w:space="6"/>
-        </w:pBdr>
-        <w:shd w:fill="F2F2F2" w:color="auto" w:val="clear"/>
-        <w:spacing w:after="0" w:before="0" w:line="240"/>
-        <w:ind w:left="144" w:right="144"/>
-      </w:pPr>
-      <w:r>
-        <w:rPr>
-          <w:rFonts w:ascii="Consolas" w:cs="Consolas" w:eastAsia="Consolas" w:hAnsi="Consolas"/>
-          <w:sz w:val="17"/>
-          <w:szCs w:val="17"/>
-        </w:rPr>
-        <w:t xml:space="preserve">   ... (7 more lines omitted; full output in logs/) ...</w:t>
-      </w:r>
-    </w:p>
-    <w:p>
-      <w:pPr>
-        <w:keepNext/>
-        <w:keepLines/>
-        <w:pBdr>
-          <w:left w:val="single" w:color="A6A6A6" w:sz="12" w:space="6"/>
-        </w:pBdr>
-        <w:shd w:fill="F2F2F2" w:color="auto" w:val="clear"/>
-        <w:spacing w:after="0" w:before="0" w:line="240"/>
-        <w:ind w:left="144" w:right="144"/>
-      </w:pPr>
-      <w:r>
-        <w:rPr>
-          <w:rFonts w:ascii="Consolas" w:cs="Consolas" w:eastAsia="Consolas" w:hAnsi="Consolas"/>
-          <w:sz w:val="17"/>
-          <w:szCs w:val="17"/>
-        </w:rPr>
-        <w:t xml:space="preserve">vis-a-vis</w:t>
-      </w:r>
-    </w:p>
-    <w:p>
-      <w:pPr>
-        <w:keepNext w:val="false"/>
-        <w:keepLines/>
-        <w:pBdr>
-          <w:bottom w:val="single" w:color="F2F2F2" w:sz="2" w:space="4"/>
-          <w:left w:val="single" w:color="A6A6A6" w:sz="12" w:space="6"/>
-        </w:pBdr>
-        <w:shd w:fill="F2F2F2" w:color="auto" w:val="clear"/>
-        <w:spacing w:after="0" w:before="0" w:line="240"/>
-        <w:ind w:left="144" w:right="144"/>
-      </w:pPr>
-      <w:r>
-        <w:rPr>
-          <w:rFonts w:ascii="Consolas" w:cs="Consolas" w:eastAsia="Consolas" w:hAnsi="Consolas"/>
-          <w:sz w:val="17"/>
-          <w:szCs w:val="17"/>
-        </w:rPr>
-        <w:t xml:space="preserve">[exit code 0]</w:t>
-      </w:r>
-    </w:p>
-    <w:p>
-      <w:pPr>
-        <w:spacing w:after="80"/>
-      </w:pPr>
-    </w:p>
-    <w:p>
-      <w:pPr>
-        <w:spacing w:after="160" w:before="60"/>
-      </w:pPr>
-      <w:r>
-        <w:rPr>
-          <w:b/>
-          <w:bCs/>
-          <w:color w:val="C00000"/>
-        </w:rPr>
-        <w:t xml:space="preserve">[SCREENSHOT PLACEHOLDER: Test 4: -?- (basic_client terminal)]</w:t>
-      </w:r>
-    </w:p>
-    <w:p>
-      <w:pPr>
-        <w:keepNext/>
-        <w:spacing w:after="60" w:before="120"/>
-      </w:pPr>
-      <w:r>
-        <w:rPr>
-          <w:b/>
-          <w:bCs/>
-        </w:rPr>
-        <w:t xml:space="preserve">Test 5: a?t (handout example)</w:t>
-      </w:r>
-    </w:p>
-    <w:p>
-      <w:pPr>
-        <w:keepNext/>
-        <w:keepLines/>
-        <w:pBdr>
-          <w:top w:val="single" w:color="F2F2F2" w:sz="2" w:space="4"/>
-          <w:left w:val="single" w:color="A6A6A6" w:sz="12" w:space="6"/>
-        </w:pBdr>
-        <w:shd w:fill="F2F2F2" w:color="auto" w:val="clear"/>
-        <w:spacing w:after="0" w:before="0" w:line="240"/>
-        <w:ind w:left="144" w:right="144"/>
-      </w:pPr>
-      <w:r>
-        <w:rPr>
-          <w:rFonts w:ascii="Consolas" w:cs="Consolas" w:eastAsia="Consolas" w:hAnsi="Consolas"/>
-          <w:sz w:val="17"/>
-          <w:szCs w:val="17"/>
-        </w:rPr>
-        <w:t xml:space="preserve">$ python3 basic_client.py      (typed: a?t)</w:t>
-      </w:r>
-    </w:p>
-    <w:p>
-      <w:pPr>
-        <w:keepNext/>
-        <w:keepLines/>
-        <w:pBdr>
-          <w:left w:val="single" w:color="A6A6A6" w:sz="12" w:space="6"/>
-        </w:pBdr>
-        <w:shd w:fill="F2F2F2" w:color="auto" w:val="clear"/>
-        <w:spacing w:after="0" w:before="0" w:line="240"/>
-        <w:ind w:left="144" w:right="144"/>
-      </w:pPr>
-      <w:r>
-        <w:rPr>
-          <w:rFonts w:ascii="Consolas" w:cs="Consolas" w:eastAsia="Consolas" w:hAnsi="Consolas"/>
-          <w:sz w:val="17"/>
-          <w:szCs w:val="17"/>
-        </w:rPr>
-        <w:t xml:space="preserve">Enter query: Server replied: 200 OK</w:t>
-      </w:r>
-    </w:p>
-    <w:p>
-      <w:pPr>
-        <w:keepNext/>
-        <w:keepLines/>
-        <w:pBdr>
-          <w:left w:val="single" w:color="A6A6A6" w:sz="12" w:space="6"/>
-        </w:pBdr>
-        <w:shd w:fill="F2F2F2" w:color="auto" w:val="clear"/>
-        <w:spacing w:after="0" w:before="0" w:line="240"/>
-        <w:ind w:left="144" w:right="144"/>
-      </w:pPr>
-      <w:r>
-        <w:rPr>
-          <w:rFonts w:ascii="Consolas" w:cs="Consolas" w:eastAsia="Consolas" w:hAnsi="Consolas"/>
-          <w:sz w:val="17"/>
-          <w:szCs w:val="17"/>
-        </w:rPr>
-        <w:t xml:space="preserve">Number of matching words: 4260</w:t>
-      </w:r>
-    </w:p>
-    <w:p>
-      <w:pPr>
-        <w:keepNext/>
-        <w:keepLines/>
-        <w:pBdr>
-          <w:left w:val="single" w:color="A6A6A6" w:sz="12" w:space="6"/>
-        </w:pBdr>
-        <w:shd w:fill="F2F2F2" w:color="auto" w:val="clear"/>
-        <w:spacing w:after="0" w:before="0" w:line="240"/>
-        <w:ind w:left="144" w:right="144"/>
-      </w:pPr>
-      <w:r>
-        <w:rPr>
-          <w:rFonts w:ascii="Consolas" w:cs="Consolas" w:eastAsia="Consolas" w:hAnsi="Consolas"/>
-          <w:sz w:val="17"/>
-          <w:szCs w:val="17"/>
-        </w:rPr>
-        <w:t xml:space="preserve">abactinal</w:t>
-      </w:r>
-    </w:p>
-    <w:p>
-      <w:pPr>
-        <w:keepNext/>
-        <w:keepLines/>
-        <w:pBdr>
-          <w:left w:val="single" w:color="A6A6A6" w:sz="12" w:space="6"/>
-        </w:pBdr>
-        <w:shd w:fill="F2F2F2" w:color="auto" w:val="clear"/>
-        <w:spacing w:after="0" w:before="0" w:line="240"/>
-        <w:ind w:left="144" w:right="144"/>
-      </w:pPr>
-      <w:r>
-        <w:rPr>
-          <w:rFonts w:ascii="Consolas" w:cs="Consolas" w:eastAsia="Consolas" w:hAnsi="Consolas"/>
-          <w:sz w:val="17"/>
-          <w:szCs w:val="17"/>
-        </w:rPr>
-        <w:t xml:space="preserve">abaft</w:t>
-      </w:r>
-    </w:p>
-    <w:p>
-      <w:pPr>
-        <w:keepNext/>
-        <w:keepLines/>
-        <w:pBdr>
-          <w:left w:val="single" w:color="A6A6A6" w:sz="12" w:space="6"/>
-        </w:pBdr>
-        <w:shd w:fill="F2F2F2" w:color="auto" w:val="clear"/>
-        <w:spacing w:after="0" w:before="0" w:line="240"/>
-        <w:ind w:left="144" w:right="144"/>
-      </w:pPr>
-      <w:r>
-        <w:rPr>
-          <w:rFonts w:ascii="Consolas" w:cs="Consolas" w:eastAsia="Consolas" w:hAnsi="Consolas"/>
-          <w:sz w:val="17"/>
-          <w:szCs w:val="17"/>
-        </w:rPr>
-        <w:t xml:space="preserve">abarticulation</w:t>
-      </w:r>
-    </w:p>
-    <w:p>
-      <w:pPr>
-        <w:keepNext/>
-        <w:keepLines/>
-        <w:pBdr>
-          <w:left w:val="single" w:color="A6A6A6" w:sz="12" w:space="6"/>
-        </w:pBdr>
-        <w:shd w:fill="F2F2F2" w:color="auto" w:val="clear"/>
-        <w:spacing w:after="0" w:before="0" w:line="240"/>
-        <w:ind w:left="144" w:right="144"/>
-      </w:pPr>
-      <w:r>
-        <w:rPr>
-          <w:rFonts w:ascii="Consolas" w:cs="Consolas" w:eastAsia="Consolas" w:hAnsi="Consolas"/>
-          <w:sz w:val="17"/>
-          <w:szCs w:val="17"/>
-        </w:rPr>
-        <w:t xml:space="preserve">abattis</w:t>
-      </w:r>
-    </w:p>
-    <w:p>
-      <w:pPr>
-        <w:keepNext/>
-        <w:keepLines/>
-        <w:pBdr>
-          <w:left w:val="single" w:color="A6A6A6" w:sz="12" w:space="6"/>
-        </w:pBdr>
-        <w:shd w:fill="F2F2F2" w:color="auto" w:val="clear"/>
-        <w:spacing w:after="0" w:before="0" w:line="240"/>
-        <w:ind w:left="144" w:right="144"/>
-      </w:pPr>
-      <w:r>
-        <w:rPr>
-          <w:rFonts w:ascii="Consolas" w:cs="Consolas" w:eastAsia="Consolas" w:hAnsi="Consolas"/>
-          <w:sz w:val="17"/>
-          <w:szCs w:val="17"/>
-        </w:rPr>
-        <w:t xml:space="preserve">abattoir</w:t>
-      </w:r>
-    </w:p>
-    <w:p>
-      <w:pPr>
-        <w:keepNext/>
-        <w:keepLines/>
-        <w:pBdr>
-          <w:left w:val="single" w:color="A6A6A6" w:sz="12" w:space="6"/>
-        </w:pBdr>
-        <w:shd w:fill="F2F2F2" w:color="auto" w:val="clear"/>
-        <w:spacing w:after="0" w:before="0" w:line="240"/>
-        <w:ind w:left="144" w:right="144"/>
-      </w:pPr>
-      <w:r>
-        <w:rPr>
-          <w:rFonts w:ascii="Consolas" w:cs="Consolas" w:eastAsia="Consolas" w:hAnsi="Consolas"/>
-          <w:sz w:val="17"/>
-          <w:szCs w:val="17"/>
-        </w:rPr>
-        <w:t xml:space="preserve">   ... (4254 more lines omitted; full output in logs/) ...</w:t>
-      </w:r>
-    </w:p>
-    <w:p>
-      <w:pPr>
-        <w:keepNext/>
-        <w:keepLines/>
-        <w:pBdr>
-          <w:left w:val="single" w:color="A6A6A6" w:sz="12" w:space="6"/>
-        </w:pBdr>
-        <w:shd w:fill="F2F2F2" w:color="auto" w:val="clear"/>
-        <w:spacing w:after="0" w:before="0" w:line="240"/>
-        <w:ind w:left="144" w:right="144"/>
-      </w:pPr>
-      <w:r>
-        <w:rPr>
-          <w:rFonts w:ascii="Consolas" w:cs="Consolas" w:eastAsia="Consolas" w:hAnsi="Consolas"/>
-          <w:sz w:val="17"/>
-          <w:szCs w:val="17"/>
-        </w:rPr>
-        <w:t xml:space="preserve">zygodactyl</w:t>
-      </w:r>
-    </w:p>
-    <w:p>
-      <w:pPr>
-        <w:keepNext w:val="false"/>
-        <w:keepLines/>
-        <w:pBdr>
-          <w:bottom w:val="single" w:color="F2F2F2" w:sz="2" w:space="4"/>
-          <w:left w:val="single" w:color="A6A6A6" w:sz="12" w:space="6"/>
-        </w:pBdr>
-        <w:shd w:fill="F2F2F2" w:color="auto" w:val="clear"/>
-        <w:spacing w:after="0" w:before="0" w:line="240"/>
-        <w:ind w:left="144" w:right="144"/>
-      </w:pPr>
-      <w:r>
-        <w:rPr>
-          <w:rFonts w:ascii="Consolas" w:cs="Consolas" w:eastAsia="Consolas" w:hAnsi="Consolas"/>
-          <w:sz w:val="17"/>
-          <w:szCs w:val="17"/>
-        </w:rPr>
-        <w:t xml:space="preserve">[exit code 0]</w:t>
-      </w:r>
-    </w:p>
-    <w:p>
-      <w:pPr>
-        <w:spacing w:after="80"/>
-      </w:pPr>
-    </w:p>
-    <w:p>
-      <w:pPr>
-        <w:spacing w:after="160" w:before="60"/>
-      </w:pPr>
-      <w:r>
-        <w:rPr>
-          <w:b/>
-          <w:bCs/>
-          <w:color w:val="C00000"/>
-        </w:rPr>
-        <w:t xml:space="preserve">[SCREENSHOT PLACEHOLDER: Test 5: a?t (handout example) (basic_client terminal)]</w:t>
-      </w:r>
-    </w:p>
-    <w:p>
-      <w:pPr>
-        <w:keepNext/>
-        <w:spacing w:after="60" w:before="120"/>
-      </w:pPr>
-      <w:r>
-        <w:rPr>
-          <w:b/>
-          <w:bCs/>
-        </w:rPr>
-        <w:t xml:space="preserve">Test 6: zzzzqx (no match)</w:t>
-      </w:r>
-    </w:p>
-    <w:p>
-      <w:pPr>
-        <w:keepNext/>
-        <w:keepLines/>
-        <w:pBdr>
-          <w:top w:val="single" w:color="F2F2F2" w:sz="2" w:space="4"/>
-          <w:left w:val="single" w:color="A6A6A6" w:sz="12" w:space="6"/>
-        </w:pBdr>
-        <w:shd w:fill="F2F2F2" w:color="auto" w:val="clear"/>
-        <w:spacing w:after="0" w:before="0" w:line="240"/>
-        <w:ind w:left="144" w:right="144"/>
-      </w:pPr>
-      <w:r>
-        <w:rPr>
-          <w:rFonts w:ascii="Consolas" w:cs="Consolas" w:eastAsia="Consolas" w:hAnsi="Consolas"/>
-          <w:sz w:val="17"/>
-          <w:szCs w:val="17"/>
-        </w:rPr>
-        <w:t xml:space="preserve">$ python3 basic_client.py      (typed: zzzzqx)</w:t>
-      </w:r>
-    </w:p>
-    <w:p>
-      <w:pPr>
-        <w:keepNext/>
-        <w:keepLines/>
-        <w:pBdr>
-          <w:left w:val="single" w:color="A6A6A6" w:sz="12" w:space="6"/>
-        </w:pBdr>
-        <w:shd w:fill="F2F2F2" w:color="auto" w:val="clear"/>
-        <w:spacing w:after="0" w:before="0" w:line="240"/>
-        <w:ind w:left="144" w:right="144"/>
-      </w:pPr>
-      <w:r>
-        <w:rPr>
-          <w:rFonts w:ascii="Consolas" w:cs="Consolas" w:eastAsia="Consolas" w:hAnsi="Consolas"/>
-          <w:sz w:val="17"/>
-          <w:szCs w:val="17"/>
-        </w:rPr>
-        <w:t xml:space="preserve">Enter query: Server replied: 404 NOT_FOUND</w:t>
-      </w:r>
-    </w:p>
-    <w:p>
-      <w:pPr>
-        <w:keepNext/>
-        <w:keepLines/>
-        <w:pBdr>
-          <w:left w:val="single" w:color="A6A6A6" w:sz="12" w:space="6"/>
-        </w:pBdr>
-        <w:shd w:fill="F2F2F2" w:color="auto" w:val="clear"/>
-        <w:spacing w:after="0" w:before="0" w:line="240"/>
-        <w:ind w:left="144" w:right="144"/>
-      </w:pPr>
-      <w:r>
-        <w:rPr>
-          <w:rFonts w:ascii="Consolas" w:cs="Consolas" w:eastAsia="Consolas" w:hAnsi="Consolas"/>
-          <w:sz w:val="17"/>
-          <w:szCs w:val="17"/>
-        </w:rPr>
-        <w:t xml:space="preserve">Number of matching words: 0</w:t>
-      </w:r>
-    </w:p>
-    <w:p>
-      <w:pPr>
-        <w:keepNext w:val="false"/>
-        <w:keepLines/>
-        <w:pBdr>
-          <w:bottom w:val="single" w:color="F2F2F2" w:sz="2" w:space="4"/>
-          <w:left w:val="single" w:color="A6A6A6" w:sz="12" w:space="6"/>
-        </w:pBdr>
-        <w:shd w:fill="F2F2F2" w:color="auto" w:val="clear"/>
-        <w:spacing w:after="0" w:before="0" w:line="240"/>
-        <w:ind w:left="144" w:right="144"/>
-      </w:pPr>
-      <w:r>
-        <w:rPr>
-          <w:rFonts w:ascii="Consolas" w:cs="Consolas" w:eastAsia="Consolas" w:hAnsi="Consolas"/>
-          <w:sz w:val="17"/>
-          <w:szCs w:val="17"/>
-        </w:rPr>
-        <w:t xml:space="preserve">[exit code 0]</w:t>
-      </w:r>
-    </w:p>
-    <w:p>
-      <w:pPr>
-        <w:spacing w:after="80"/>
-      </w:pPr>
-    </w:p>
-    <w:p>
-      <w:pPr>
-        <w:spacing w:after="160" w:before="60"/>
-      </w:pPr>
-      <w:r>
-        <w:rPr>
-          <w:b/>
-          <w:bCs/>
-          <w:color w:val="C00000"/>
-        </w:rPr>
-        <w:t xml:space="preserve">[SCREENSHOT PLACEHOLDER: Test 6: zzzzqx (no match) (basic_client terminal)]</w:t>
-      </w:r>
-    </w:p>
-    <w:p>
-      <w:pPr>
-        <w:keepNext/>
-        <w:spacing w:after="60" w:before="120"/>
-      </w:pPr>
-      <w:r>
-        <w:rPr>
-          <w:b/>
-          <w:bCs/>
-        </w:rPr>
-        <w:t xml:space="preserve">Test 7: empty query</w:t>
-      </w:r>
-    </w:p>
-    <w:p>
-      <w:pPr>
-        <w:keepNext/>
-        <w:keepLines/>
-        <w:pBdr>
-          <w:top w:val="single" w:color="F2F2F2" w:sz="2" w:space="4"/>
-          <w:left w:val="single" w:color="A6A6A6" w:sz="12" w:space="6"/>
-        </w:pBdr>
-        <w:shd w:fill="F2F2F2" w:color="auto" w:val="clear"/>
-        <w:spacing w:after="0" w:before="0" w:line="240"/>
-        <w:ind w:left="144" w:right="144"/>
-      </w:pPr>
-      <w:r>
-        <w:rPr>
-          <w:rFonts w:ascii="Consolas" w:cs="Consolas" w:eastAsia="Consolas" w:hAnsi="Consolas"/>
-          <w:sz w:val="17"/>
-          <w:szCs w:val="17"/>
-        </w:rPr>
-        <w:t xml:space="preserve">$ python3 basic_client.py      (typed: )</w:t>
-      </w:r>
-    </w:p>
-    <w:p>
-      <w:pPr>
-        <w:keepNext/>
-        <w:keepLines/>
-        <w:pBdr>
-          <w:left w:val="single" w:color="A6A6A6" w:sz="12" w:space="6"/>
-        </w:pBdr>
-        <w:shd w:fill="F2F2F2" w:color="auto" w:val="clear"/>
-        <w:spacing w:after="0" w:before="0" w:line="240"/>
-        <w:ind w:left="144" w:right="144"/>
-      </w:pPr>
-      <w:r>
-        <w:rPr>
-          <w:rFonts w:ascii="Consolas" w:cs="Consolas" w:eastAsia="Consolas" w:hAnsi="Consolas"/>
-          <w:sz w:val="17"/>
-          <w:szCs w:val="17"/>
-        </w:rPr>
-        <w:t xml:space="preserve">Enter query: Query must not be empty.</w:t>
-      </w:r>
-    </w:p>
-    <w:p>
-      <w:pPr>
-        <w:keepNext w:val="false"/>
-        <w:keepLines/>
-        <w:pBdr>
-          <w:bottom w:val="single" w:color="F2F2F2" w:sz="2" w:space="4"/>
-          <w:left w:val="single" w:color="A6A6A6" w:sz="12" w:space="6"/>
-        </w:pBdr>
-        <w:shd w:fill="F2F2F2" w:color="auto" w:val="clear"/>
-        <w:spacing w:after="0" w:before="0" w:line="240"/>
-        <w:ind w:left="144" w:right="144"/>
-      </w:pPr>
-      <w:r>
-        <w:rPr>
-          <w:rFonts w:ascii="Consolas" w:cs="Consolas" w:eastAsia="Consolas" w:hAnsi="Consolas"/>
-          <w:sz w:val="17"/>
-          <w:szCs w:val="17"/>
-        </w:rPr>
-        <w:t xml:space="preserve">[exit code 1]</w:t>
-      </w:r>
-    </w:p>
-    <w:p>
-      <w:pPr>
-        <w:spacing w:after="80"/>
-      </w:pPr>
-    </w:p>
-    <w:p>
-      <w:pPr>
-        <w:spacing w:after="160" w:before="60"/>
-      </w:pPr>
-      <w:r>
-        <w:rPr>
-          <w:b/>
-          <w:bCs/>
-          <w:color w:val="C00000"/>
-        </w:rPr>
-        <w:t xml:space="preserve">[SCREENSHOT PLACEHOLDER: Test 7: empty query (basic_client terminal)]</w:t>
+        <w:jc w:val="center"/>
+      </w:pPr>
+      <w:r>
+        <w:drawing>
+          <wp:inline distT="0" distB="0" distL="0" distR="0">
+            <wp:extent cx="5334000" cy="847725"/>
+            <wp:effectExtent t="0" r="0" b="0" l="0"/>
+            <wp:docPr id="1" name="07.png" descr="Screenshot: Test 7: empty query (basic_client terminal)" title="Test 7: empty query (basic_client terminal)"/>
+            <wp:cNvGraphicFramePr>
+              <a:graphicFrameLocks xmlns:a="http://schemas.openxmlformats.org/drawingml/2006/main" noChangeAspect="1"/>
+            </wp:cNvGraphicFramePr>
+            <a:graphic xmlns:a="http://schemas.openxmlformats.org/drawingml/2006/main">
+              <a:graphicData uri="http://schemas.openxmlformats.org/drawingml/2006/picture">
+                <pic:pic xmlns:pic="http://schemas.openxmlformats.org/drawingml/2006/picture">
+                  <pic:nvPicPr>
+                    <pic:cNvPr id="0" name="" descr=""/>
+                    <pic:cNvPicPr>
+                      <a:picLocks noChangeAspect="1" noChangeArrowheads="1"/>
+                    </pic:cNvPicPr>
+                  </pic:nvPicPr>
+                  <pic:blipFill>
+                    <a:blip r:embed="rId13" cstate="none"/>
+                    <a:srcRect/>
+                    <a:stretch>
+                      <a:fillRect/>
+                    </a:stretch>
+                  </pic:blipFill>
+                  <pic:spPr bwMode="auto">
+                    <a:xfrm>
+                      <a:off x="0" y="0"/>
+                      <a:ext cx="5334000" cy="847725"/>
+                    </a:xfrm>
+                    <a:prstGeom prst="rect">
+                      <a:avLst/>
+                    </a:prstGeom>
+                  </pic:spPr>
+                </pic:pic>
+              </a:graphicData>
+            </a:graphic>
+          </wp:inline>
+        </w:drawing>
       </w:r>
     </w:p>
     <w:p>

</xml_diff>

<commit_message>
Finish PA1 design document with all Windows test screenshots
All screenshot placeholders are replaced with the student's Windows 11
captures and captions; notes on the 30 s client timeout seen in the
basic_server waiting test and on the 1 s accept() tick are added.

Co-Authored-By: Claude Opus 5.5 <noreply@anthropic.com>
Claude-Session: https://claude.ai/code/session_015V8epo32ib1aDt4pTugMni
</commit_message>
<xml_diff>
--- a/pa1/PA1_Design_Document.docx
+++ b/pa1/PA1_Design_Document.docx
@@ -2410,7 +2410,18 @@
         <w:t xml:space="preserve">serve_client()</w:t>
       </w:r>
       <w:r>
-        <w:t xml:space="preserve"> directly in the main thread, so a second client is only served once the first one has finished.</w:t>
+        <w:t xml:space="preserve"> directly in the main thread, so a second client is only served once the first one has finished. Both servers use a 1-second </w:t>
+      </w:r>
+      <w:r>
+        <w:rPr>
+          <w:rFonts w:ascii="Consolas" w:cs="Consolas" w:eastAsia="Consolas" w:hAnsi="Consolas"/>
+          <w:sz w:val="19"/>
+          <w:szCs w:val="19"/>
+        </w:rPr>
+        <w:t xml:space="preserve">accept()</w:t>
+      </w:r>
+      <w:r>
+        <w:t xml:space="preserve"> timeout so Ctrl-C stops them promptly on Windows.</w:t>
       </w:r>
     </w:p>
     <w:p>
@@ -4738,7 +4749,7 @@
         <w:spacing w:after="120"/>
       </w:pPr>
       <w:r>
-        <w:t xml:space="preserve">All outputs below were captured from real runs on Linux, Python 3, with server and clients on 127.0.0.1:12000. Full outputs, including every matching word, are saved in </w:t>
+        <w:t xml:space="preserve">Text outputs below were captured from real runs on Linux, Python 3, with server and clients on 127.0.0.1:12000. Full outputs, including every matching word, are saved in </w:t>
       </w:r>
       <w:r>
         <w:rPr>
@@ -4749,7 +4760,7 @@
         <w:t xml:space="preserve">pa1/logs/</w:t>
       </w:r>
       <w:r>
-        <w:t xml:space="preserve">. Long word lists are shortened here to their first and last lines. Red placeholders mark where terminal screenshots go. Keyboard input was piped in for the captures, so the typed text is shown in the </w:t>
+        <w:t xml:space="preserve">. Long word lists are shortened here to their first and last lines. Each test is followed by a screenshot of the same test run on Windows 11. Keyboard input was piped in for the captures, so the typed text is shown in the </w:t>
       </w:r>
       <w:r>
         <w:rPr>
@@ -7575,13 +7586,14 @@
     </w:p>
     <w:p>
       <w:pPr>
-        <w:spacing w:after="160" w:before="60"/>
+        <w:keepNext/>
+        <w:spacing w:after="40" w:before="60"/>
         <w:jc w:val="center"/>
       </w:pPr>
       <w:r>
         <w:drawing>
           <wp:inline distT="0" distB="0" distL="0" distR="0">
-            <wp:extent cx="5334000" cy="2543175"/>
+            <wp:extent cx="3943350" cy="1876425"/>
             <wp:effectExtent t="0" r="0" b="0" l="0"/>
             <wp:docPr id="1" name="01.png" descr="Screenshot: Test 1: ?????????? (basic_client terminal)" title="Test 1: ?????????? (basic_client terminal)"/>
             <wp:cNvGraphicFramePr>
@@ -7606,7 +7618,7 @@
                   <pic:spPr bwMode="auto">
                     <a:xfrm>
                       <a:off x="0" y="0"/>
-                      <a:ext cx="5334000" cy="2543175"/>
+                      <a:ext cx="3943350" cy="1876425"/>
                     </a:xfrm>
                     <a:prstGeom prst="rect">
                       <a:avLst/>
@@ -7621,6 +7633,22 @@
     </w:p>
     <w:p>
       <w:pPr>
+        <w:spacing w:after="200"/>
+        <w:jc w:val="center"/>
+      </w:pPr>
+      <w:r>
+        <w:rPr>
+          <w:i/>
+          <w:iCs/>
+          <w:color w:val="595959"/>
+          <w:sz w:val="18"/>
+          <w:szCs w:val="18"/>
+        </w:rPr>
+        <w:t xml:space="preserve">Screenshot (Windows 11): Test 1: ?????????? (basic_client terminal)</w:t>
+      </w:r>
+    </w:p>
+    <w:p>
+      <w:pPr>
         <w:keepNext/>
         <w:spacing w:after="60" w:before="120"/>
       </w:pPr>
@@ -7861,13 +7889,14 @@
     </w:p>
     <w:p>
       <w:pPr>
-        <w:spacing w:after="160" w:before="60"/>
+        <w:keepNext/>
+        <w:spacing w:after="40" w:before="60"/>
         <w:jc w:val="center"/>
       </w:pPr>
       <w:r>
         <w:drawing>
           <wp:inline distT="0" distB="0" distL="0" distR="0">
-            <wp:extent cx="5334000" cy="2638425"/>
+            <wp:extent cx="5943600" cy="2943225"/>
             <wp:effectExtent t="0" r="0" b="0" l="0"/>
             <wp:docPr id="1" name="02.png" descr="Screenshot: Test 2: ? (basic_client terminal)" title="Test 2: ? (basic_client terminal)"/>
             <wp:cNvGraphicFramePr>
@@ -7892,7 +7921,7 @@
                   <pic:spPr bwMode="auto">
                     <a:xfrm>
                       <a:off x="0" y="0"/>
-                      <a:ext cx="5334000" cy="2638425"/>
+                      <a:ext cx="5943600" cy="2943225"/>
                     </a:xfrm>
                     <a:prstGeom prst="rect">
                       <a:avLst/>
@@ -7907,6 +7936,22 @@
     </w:p>
     <w:p>
       <w:pPr>
+        <w:spacing w:after="200"/>
+        <w:jc w:val="center"/>
+      </w:pPr>
+      <w:r>
+        <w:rPr>
+          <w:i/>
+          <w:iCs/>
+          <w:color w:val="595959"/>
+          <w:sz w:val="18"/>
+          <w:szCs w:val="18"/>
+        </w:rPr>
+        <w:t xml:space="preserve">Screenshot (Windows 11): Test 2: ? (basic_client terminal)</w:t>
+      </w:r>
+    </w:p>
+    <w:p>
+      <w:pPr>
         <w:keepNext/>
         <w:spacing w:after="60" w:before="120"/>
       </w:pPr>
@@ -8147,13 +8192,14 @@
     </w:p>
     <w:p>
       <w:pPr>
-        <w:spacing w:after="160" w:before="60"/>
+        <w:keepNext/>
+        <w:spacing w:after="40" w:before="60"/>
         <w:jc w:val="center"/>
       </w:pPr>
       <w:r>
         <w:drawing>
           <wp:inline distT="0" distB="0" distL="0" distR="0">
-            <wp:extent cx="5334000" cy="2333625"/>
+            <wp:extent cx="4848225" cy="2124075"/>
             <wp:effectExtent t="0" r="0" b="0" l="0"/>
             <wp:docPr id="1" name="03.png" descr="Screenshot: Test 3: ?(a) (basic_client terminal)" title="Test 3: ?(a) (basic_client terminal)"/>
             <wp:cNvGraphicFramePr>
@@ -8178,7 +8224,7 @@
                   <pic:spPr bwMode="auto">
                     <a:xfrm>
                       <a:off x="0" y="0"/>
-                      <a:ext cx="5334000" cy="2333625"/>
+                      <a:ext cx="4848225" cy="2124075"/>
                     </a:xfrm>
                     <a:prstGeom prst="rect">
                       <a:avLst/>
@@ -8193,6 +8239,22 @@
     </w:p>
     <w:p>
       <w:pPr>
+        <w:spacing w:after="200"/>
+        <w:jc w:val="center"/>
+      </w:pPr>
+      <w:r>
+        <w:rPr>
+          <w:i/>
+          <w:iCs/>
+          <w:color w:val="595959"/>
+          <w:sz w:val="18"/>
+          <w:szCs w:val="18"/>
+        </w:rPr>
+        <w:t xml:space="preserve">Screenshot (Windows 11): Test 3: ?(a) (basic_client terminal)</w:t>
+      </w:r>
+    </w:p>
+    <w:p>
+      <w:pPr>
         <w:keepNext/>
         <w:spacing w:after="60" w:before="120"/>
       </w:pPr>
@@ -8433,13 +8495,14 @@
     </w:p>
     <w:p>
       <w:pPr>
-        <w:spacing w:after="160" w:before="60"/>
+        <w:keepNext/>
+        <w:spacing w:after="40" w:before="60"/>
         <w:jc w:val="center"/>
       </w:pPr>
       <w:r>
         <w:drawing>
           <wp:inline distT="0" distB="0" distL="0" distR="0">
-            <wp:extent cx="5334000" cy="2381250"/>
+            <wp:extent cx="4838700" cy="2162175"/>
             <wp:effectExtent t="0" r="0" b="0" l="0"/>
             <wp:docPr id="1" name="04.png" descr="Screenshot: Test 4: -?- (basic_client terminal)" title="Test 4: -?- (basic_client terminal)"/>
             <wp:cNvGraphicFramePr>
@@ -8464,7 +8527,7 @@
                   <pic:spPr bwMode="auto">
                     <a:xfrm>
                       <a:off x="0" y="0"/>
-                      <a:ext cx="5334000" cy="2381250"/>
+                      <a:ext cx="4838700" cy="2162175"/>
                     </a:xfrm>
                     <a:prstGeom prst="rect">
                       <a:avLst/>
@@ -8479,6 +8542,22 @@
     </w:p>
     <w:p>
       <w:pPr>
+        <w:spacing w:after="200"/>
+        <w:jc w:val="center"/>
+      </w:pPr>
+      <w:r>
+        <w:rPr>
+          <w:i/>
+          <w:iCs/>
+          <w:color w:val="595959"/>
+          <w:sz w:val="18"/>
+          <w:szCs w:val="18"/>
+        </w:rPr>
+        <w:t xml:space="preserve">Screenshot (Windows 11): Test 4: -?- (basic_client terminal)</w:t>
+      </w:r>
+    </w:p>
+    <w:p>
+      <w:pPr>
         <w:keepNext/>
         <w:spacing w:after="60" w:before="120"/>
       </w:pPr>
@@ -8719,13 +8798,14 @@
     </w:p>
     <w:p>
       <w:pPr>
-        <w:spacing w:after="160" w:before="60"/>
+        <w:keepNext/>
+        <w:spacing w:after="40" w:before="60"/>
         <w:jc w:val="center"/>
       </w:pPr>
       <w:r>
         <w:drawing>
           <wp:inline distT="0" distB="0" distL="0" distR="0">
-            <wp:extent cx="5334000" cy="4391025"/>
+            <wp:extent cx="4162425" cy="3429000"/>
             <wp:effectExtent t="0" r="0" b="0" l="0"/>
             <wp:docPr id="1" name="05.png" descr="Screenshot: Test 5: a?t (handout example) (basic_client terminal)" title="Test 5: a?t (handout example) (basic_client terminal)"/>
             <wp:cNvGraphicFramePr>
@@ -8750,7 +8830,7 @@
                   <pic:spPr bwMode="auto">
                     <a:xfrm>
                       <a:off x="0" y="0"/>
-                      <a:ext cx="5334000" cy="4391025"/>
+                      <a:ext cx="4162425" cy="3429000"/>
                     </a:xfrm>
                     <a:prstGeom prst="rect">
                       <a:avLst/>
@@ -8765,6 +8845,22 @@
     </w:p>
     <w:p>
       <w:pPr>
+        <w:spacing w:after="200"/>
+        <w:jc w:val="center"/>
+      </w:pPr>
+      <w:r>
+        <w:rPr>
+          <w:i/>
+          <w:iCs/>
+          <w:color w:val="595959"/>
+          <w:sz w:val="18"/>
+          <w:szCs w:val="18"/>
+        </w:rPr>
+        <w:t xml:space="preserve">Screenshot (Windows 11): Test 5: a?t (handout example) (basic_client terminal)</w:t>
+      </w:r>
+    </w:p>
+    <w:p>
+      <w:pPr>
         <w:keepNext/>
         <w:spacing w:after="60" w:before="120"/>
       </w:pPr>
@@ -8865,108 +8961,16 @@
     </w:p>
     <w:p>
       <w:pPr>
-        <w:spacing w:after="160" w:before="60"/>
-      </w:pPr>
-      <w:r>
-        <w:rPr>
-          <w:b/>
-          <w:bCs/>
-          <w:color w:val="C00000"/>
-        </w:rPr>
-        <w:t xml:space="preserve">[SCREENSHOT PLACEHOLDER: Test 6: zzzzqx (no match) (basic_client terminal)]</w:t>
-      </w:r>
-    </w:p>
-    <w:p>
-      <w:pPr>
-        <w:keepNext/>
-        <w:spacing w:after="60" w:before="120"/>
-      </w:pPr>
-      <w:r>
-        <w:rPr>
-          <w:b/>
-          <w:bCs/>
-        </w:rPr>
-        <w:t xml:space="preserve">Test 7: empty query</w:t>
-      </w:r>
-    </w:p>
-    <w:p>
-      <w:pPr>
-        <w:keepNext/>
-        <w:keepLines/>
-        <w:pBdr>
-          <w:top w:val="single" w:color="F2F2F2" w:sz="2" w:space="4"/>
-          <w:left w:val="single" w:color="A6A6A6" w:sz="12" w:space="6"/>
-        </w:pBdr>
-        <w:shd w:fill="F2F2F2" w:color="auto" w:val="clear"/>
-        <w:spacing w:after="0" w:before="0" w:line="240"/>
-        <w:ind w:left="144" w:right="144"/>
-      </w:pPr>
-      <w:r>
-        <w:rPr>
-          <w:rFonts w:ascii="Consolas" w:cs="Consolas" w:eastAsia="Consolas" w:hAnsi="Consolas"/>
-          <w:sz w:val="17"/>
-          <w:szCs w:val="17"/>
-        </w:rPr>
-        <w:t xml:space="preserve">$ python3 basic_client.py      (typed: )</w:t>
-      </w:r>
-    </w:p>
-    <w:p>
-      <w:pPr>
-        <w:keepNext/>
-        <w:keepLines/>
-        <w:pBdr>
-          <w:left w:val="single" w:color="A6A6A6" w:sz="12" w:space="6"/>
-        </w:pBdr>
-        <w:shd w:fill="F2F2F2" w:color="auto" w:val="clear"/>
-        <w:spacing w:after="0" w:before="0" w:line="240"/>
-        <w:ind w:left="144" w:right="144"/>
-      </w:pPr>
-      <w:r>
-        <w:rPr>
-          <w:rFonts w:ascii="Consolas" w:cs="Consolas" w:eastAsia="Consolas" w:hAnsi="Consolas"/>
-          <w:sz w:val="17"/>
-          <w:szCs w:val="17"/>
-        </w:rPr>
-        <w:t xml:space="preserve">Enter query: Query must not be empty.</w:t>
-      </w:r>
-    </w:p>
-    <w:p>
-      <w:pPr>
-        <w:keepNext w:val="false"/>
-        <w:keepLines/>
-        <w:pBdr>
-          <w:bottom w:val="single" w:color="F2F2F2" w:sz="2" w:space="4"/>
-          <w:left w:val="single" w:color="A6A6A6" w:sz="12" w:space="6"/>
-        </w:pBdr>
-        <w:shd w:fill="F2F2F2" w:color="auto" w:val="clear"/>
-        <w:spacing w:after="0" w:before="0" w:line="240"/>
-        <w:ind w:left="144" w:right="144"/>
-      </w:pPr>
-      <w:r>
-        <w:rPr>
-          <w:rFonts w:ascii="Consolas" w:cs="Consolas" w:eastAsia="Consolas" w:hAnsi="Consolas"/>
-          <w:sz w:val="17"/>
-          <w:szCs w:val="17"/>
-        </w:rPr>
-        <w:t xml:space="preserve">[exit code 1]</w:t>
-      </w:r>
-    </w:p>
-    <w:p>
-      <w:pPr>
-        <w:spacing w:after="80"/>
-      </w:pPr>
-    </w:p>
-    <w:p>
-      <w:pPr>
-        <w:spacing w:after="160" w:before="60"/>
+        <w:keepNext/>
+        <w:spacing w:after="40" w:before="60"/>
         <w:jc w:val="center"/>
       </w:pPr>
       <w:r>
         <w:drawing>
           <wp:inline distT="0" distB="0" distL="0" distR="0">
-            <wp:extent cx="5334000" cy="847725"/>
+            <wp:extent cx="2981325" cy="904875"/>
             <wp:effectExtent t="0" r="0" b="0" l="0"/>
-            <wp:docPr id="1" name="07.png" descr="Screenshot: Test 7: empty query (basic_client terminal)" title="Test 7: empty query (basic_client terminal)"/>
+            <wp:docPr id="1" name="06.png" descr="Screenshot: Test 6: zzzzqx (no match) (basic_client terminal)" title="Test 6: zzzzqx (no match) (basic_client terminal)"/>
             <wp:cNvGraphicFramePr>
               <a:graphicFrameLocks xmlns:a="http://schemas.openxmlformats.org/drawingml/2006/main" noChangeAspect="1"/>
             </wp:cNvGraphicFramePr>
@@ -8989,7 +8993,7 @@
                   <pic:spPr bwMode="auto">
                     <a:xfrm>
                       <a:off x="0" y="0"/>
-                      <a:ext cx="5334000" cy="847725"/>
+                      <a:ext cx="2981325" cy="904875"/>
                     </a:xfrm>
                     <a:prstGeom prst="rect">
                       <a:avLst/>
@@ -9004,6 +9008,22 @@
     </w:p>
     <w:p>
       <w:pPr>
+        <w:spacing w:after="200"/>
+        <w:jc w:val="center"/>
+      </w:pPr>
+      <w:r>
+        <w:rPr>
+          <w:i/>
+          <w:iCs/>
+          <w:color w:val="595959"/>
+          <w:sz w:val="18"/>
+          <w:szCs w:val="18"/>
+        </w:rPr>
+        <w:t xml:space="preserve">Screenshot (Windows 11): Test 6: zzzzqx (no match) (basic_client terminal)</w:t>
+      </w:r>
+    </w:p>
+    <w:p>
+      <w:pPr>
         <w:keepNext/>
         <w:spacing w:after="60" w:before="120"/>
       </w:pPr>
@@ -9012,7 +9032,7 @@
           <w:b/>
           <w:bCs/>
         </w:rPr>
-        <w:t xml:space="preserve">Test 8: server not running</w:t>
+        <w:t xml:space="preserve">Test 7: empty query</w:t>
       </w:r>
     </w:p>
     <w:p>
@@ -9033,7 +9053,27 @@
           <w:sz w:val="17"/>
           <w:szCs w:val="17"/>
         </w:rPr>
-        <w:t xml:space="preserve">Enter query: Could not connect to 127.0.0.1:12000 ([Errno 111] Connection refused). Is the server running?</w:t>
+        <w:t xml:space="preserve">$ python3 basic_client.py      (typed: )</w:t>
+      </w:r>
+    </w:p>
+    <w:p>
+      <w:pPr>
+        <w:keepNext/>
+        <w:keepLines/>
+        <w:pBdr>
+          <w:left w:val="single" w:color="A6A6A6" w:sz="12" w:space="6"/>
+        </w:pBdr>
+        <w:shd w:fill="F2F2F2" w:color="auto" w:val="clear"/>
+        <w:spacing w:after="0" w:before="0" w:line="240"/>
+        <w:ind w:left="144" w:right="144"/>
+      </w:pPr>
+      <w:r>
+        <w:rPr>
+          <w:rFonts w:ascii="Consolas" w:cs="Consolas" w:eastAsia="Consolas" w:hAnsi="Consolas"/>
+          <w:sz w:val="17"/>
+          <w:szCs w:val="17"/>
+        </w:rPr>
+        <w:t xml:space="preserve">Enter query: Query must not be empty.</w:t>
       </w:r>
     </w:p>
     <w:p>
@@ -9064,15 +9104,188 @@
     </w:p>
     <w:p>
       <w:pPr>
-        <w:spacing w:after="160" w:before="60"/>
+        <w:keepNext/>
+        <w:spacing w:after="40" w:before="60"/>
+        <w:jc w:val="center"/>
+      </w:pPr>
+      <w:r>
+        <w:drawing>
+          <wp:inline distT="0" distB="0" distL="0" distR="0">
+            <wp:extent cx="4829175" cy="762000"/>
+            <wp:effectExtent t="0" r="0" b="0" l="0"/>
+            <wp:docPr id="1" name="07.png" descr="Screenshot: Test 7: empty query (basic_client terminal)" title="Test 7: empty query (basic_client terminal)"/>
+            <wp:cNvGraphicFramePr>
+              <a:graphicFrameLocks xmlns:a="http://schemas.openxmlformats.org/drawingml/2006/main" noChangeAspect="1"/>
+            </wp:cNvGraphicFramePr>
+            <a:graphic xmlns:a="http://schemas.openxmlformats.org/drawingml/2006/main">
+              <a:graphicData uri="http://schemas.openxmlformats.org/drawingml/2006/picture">
+                <pic:pic xmlns:pic="http://schemas.openxmlformats.org/drawingml/2006/picture">
+                  <pic:nvPicPr>
+                    <pic:cNvPr id="0" name="" descr=""/>
+                    <pic:cNvPicPr>
+                      <a:picLocks noChangeAspect="1" noChangeArrowheads="1"/>
+                    </pic:cNvPicPr>
+                  </pic:nvPicPr>
+                  <pic:blipFill>
+                    <a:blip r:embed="rId14" cstate="none"/>
+                    <a:srcRect/>
+                    <a:stretch>
+                      <a:fillRect/>
+                    </a:stretch>
+                  </pic:blipFill>
+                  <pic:spPr bwMode="auto">
+                    <a:xfrm>
+                      <a:off x="0" y="0"/>
+                      <a:ext cx="4829175" cy="762000"/>
+                    </a:xfrm>
+                    <a:prstGeom prst="rect">
+                      <a:avLst/>
+                    </a:prstGeom>
+                  </pic:spPr>
+                </pic:pic>
+              </a:graphicData>
+            </a:graphic>
+          </wp:inline>
+        </w:drawing>
+      </w:r>
+    </w:p>
+    <w:p>
+      <w:pPr>
+        <w:spacing w:after="200"/>
+        <w:jc w:val="center"/>
+      </w:pPr>
+      <w:r>
+        <w:rPr>
+          <w:i/>
+          <w:iCs/>
+          <w:color w:val="595959"/>
+          <w:sz w:val="18"/>
+          <w:szCs w:val="18"/>
+        </w:rPr>
+        <w:t xml:space="preserve">Screenshot (Windows 11): Test 7: empty query (basic_client terminal)</w:t>
+      </w:r>
+    </w:p>
+    <w:p>
+      <w:pPr>
+        <w:keepNext/>
+        <w:spacing w:after="60" w:before="120"/>
       </w:pPr>
       <w:r>
         <w:rPr>
           <w:b/>
           <w:bCs/>
-          <w:color w:val="C00000"/>
-        </w:rPr>
-        <w:t xml:space="preserve">[SCREENSHOT PLACEHOLDER: Test 8: server not running (basic_client terminal)]</w:t>
+        </w:rPr>
+        <w:t xml:space="preserve">Test 8: server not running</w:t>
+      </w:r>
+    </w:p>
+    <w:p>
+      <w:pPr>
+        <w:keepNext/>
+        <w:keepLines/>
+        <w:pBdr>
+          <w:top w:val="single" w:color="F2F2F2" w:sz="2" w:space="4"/>
+          <w:left w:val="single" w:color="A6A6A6" w:sz="12" w:space="6"/>
+        </w:pBdr>
+        <w:shd w:fill="F2F2F2" w:color="auto" w:val="clear"/>
+        <w:spacing w:after="0" w:before="0" w:line="240"/>
+        <w:ind w:left="144" w:right="144"/>
+      </w:pPr>
+      <w:r>
+        <w:rPr>
+          <w:rFonts w:ascii="Consolas" w:cs="Consolas" w:eastAsia="Consolas" w:hAnsi="Consolas"/>
+          <w:sz w:val="17"/>
+          <w:szCs w:val="17"/>
+        </w:rPr>
+        <w:t xml:space="preserve">Enter query: Could not connect to 127.0.0.1:12000 ([Errno 111] Connection refused). Is the server running?</w:t>
+      </w:r>
+    </w:p>
+    <w:p>
+      <w:pPr>
+        <w:keepNext w:val="false"/>
+        <w:keepLines/>
+        <w:pBdr>
+          <w:bottom w:val="single" w:color="F2F2F2" w:sz="2" w:space="4"/>
+          <w:left w:val="single" w:color="A6A6A6" w:sz="12" w:space="6"/>
+        </w:pBdr>
+        <w:shd w:fill="F2F2F2" w:color="auto" w:val="clear"/>
+        <w:spacing w:after="0" w:before="0" w:line="240"/>
+        <w:ind w:left="144" w:right="144"/>
+      </w:pPr>
+      <w:r>
+        <w:rPr>
+          <w:rFonts w:ascii="Consolas" w:cs="Consolas" w:eastAsia="Consolas" w:hAnsi="Consolas"/>
+          <w:sz w:val="17"/>
+          <w:szCs w:val="17"/>
+        </w:rPr>
+        <w:t xml:space="preserve">[exit code 1]</w:t>
+      </w:r>
+    </w:p>
+    <w:p>
+      <w:pPr>
+        <w:spacing w:after="80"/>
+      </w:pPr>
+    </w:p>
+    <w:p>
+      <w:pPr>
+        <w:keepNext/>
+        <w:spacing w:after="40" w:before="60"/>
+        <w:jc w:val="center"/>
+      </w:pPr>
+      <w:r>
+        <w:drawing>
+          <wp:inline distT="0" distB="0" distL="0" distR="0">
+            <wp:extent cx="2847975" cy="1238250"/>
+            <wp:effectExtent t="0" r="0" b="0" l="0"/>
+            <wp:docPr id="1" name="08.png" descr="Screenshot: Test 8: server not running (basic_client terminal)" title="Test 8: server not running (basic_client terminal)"/>
+            <wp:cNvGraphicFramePr>
+              <a:graphicFrameLocks xmlns:a="http://schemas.openxmlformats.org/drawingml/2006/main" noChangeAspect="1"/>
+            </wp:cNvGraphicFramePr>
+            <a:graphic xmlns:a="http://schemas.openxmlformats.org/drawingml/2006/main">
+              <a:graphicData uri="http://schemas.openxmlformats.org/drawingml/2006/picture">
+                <pic:pic xmlns:pic="http://schemas.openxmlformats.org/drawingml/2006/picture">
+                  <pic:nvPicPr>
+                    <pic:cNvPr id="0" name="" descr=""/>
+                    <pic:cNvPicPr>
+                      <a:picLocks noChangeAspect="1" noChangeArrowheads="1"/>
+                    </pic:cNvPicPr>
+                  </pic:nvPicPr>
+                  <pic:blipFill>
+                    <a:blip r:embed="rId15" cstate="none"/>
+                    <a:srcRect/>
+                    <a:stretch>
+                      <a:fillRect/>
+                    </a:stretch>
+                  </pic:blipFill>
+                  <pic:spPr bwMode="auto">
+                    <a:xfrm>
+                      <a:off x="0" y="0"/>
+                      <a:ext cx="2847975" cy="1238250"/>
+                    </a:xfrm>
+                    <a:prstGeom prst="rect">
+                      <a:avLst/>
+                    </a:prstGeom>
+                  </pic:spPr>
+                </pic:pic>
+              </a:graphicData>
+            </a:graphic>
+          </wp:inline>
+        </w:drawing>
+      </w:r>
+    </w:p>
+    <w:p>
+      <w:pPr>
+        <w:spacing w:after="200"/>
+        <w:jc w:val="center"/>
+      </w:pPr>
+      <w:r>
+        <w:rPr>
+          <w:i/>
+          <w:iCs/>
+          <w:color w:val="595959"/>
+          <w:sz w:val="18"/>
+          <w:szCs w:val="18"/>
+        </w:rPr>
+        <w:t xml:space="preserve">Screenshot (Windows 11): Test 8: server not running (basic_client terminal)</w:t>
       </w:r>
     </w:p>
     <w:p>
@@ -9504,32 +9717,1639 @@
     </w:p>
     <w:p>
       <w:pPr>
-        <w:spacing w:after="160" w:before="60"/>
+        <w:keepNext/>
+        <w:spacing w:after="40" w:before="60"/>
+        <w:jc w:val="center"/>
+      </w:pPr>
+      <w:r>
+        <w:drawing>
+          <wp:inline distT="0" distB="0" distL="0" distR="0">
+            <wp:extent cx="4905375" cy="4105275"/>
+            <wp:effectExtent t="0" r="0" b="0" l="0"/>
+            <wp:docPr id="1" name="09.png" descr="Screenshot: basic_server terminal" title="basic_server terminal"/>
+            <wp:cNvGraphicFramePr>
+              <a:graphicFrameLocks xmlns:a="http://schemas.openxmlformats.org/drawingml/2006/main" noChangeAspect="1"/>
+            </wp:cNvGraphicFramePr>
+            <a:graphic xmlns:a="http://schemas.openxmlformats.org/drawingml/2006/main">
+              <a:graphicData uri="http://schemas.openxmlformats.org/drawingml/2006/picture">
+                <pic:pic xmlns:pic="http://schemas.openxmlformats.org/drawingml/2006/picture">
+                  <pic:nvPicPr>
+                    <pic:cNvPr id="0" name="" descr=""/>
+                    <pic:cNvPicPr>
+                      <a:picLocks noChangeAspect="1" noChangeArrowheads="1"/>
+                    </pic:cNvPicPr>
+                  </pic:nvPicPr>
+                  <pic:blipFill>
+                    <a:blip r:embed="rId16" cstate="none"/>
+                    <a:srcRect/>
+                    <a:stretch>
+                      <a:fillRect/>
+                    </a:stretch>
+                  </pic:blipFill>
+                  <pic:spPr bwMode="auto">
+                    <a:xfrm>
+                      <a:off x="0" y="0"/>
+                      <a:ext cx="4905375" cy="4105275"/>
+                    </a:xfrm>
+                    <a:prstGeom prst="rect">
+                      <a:avLst/>
+                    </a:prstGeom>
+                  </pic:spPr>
+                </pic:pic>
+              </a:graphicData>
+            </a:graphic>
+          </wp:inline>
+        </w:drawing>
+      </w:r>
+    </w:p>
+    <w:p>
+      <w:pPr>
+        <w:spacing w:after="200"/>
+        <w:jc w:val="center"/>
+      </w:pPr>
+      <w:r>
+        <w:rPr>
+          <w:i/>
+          <w:iCs/>
+          <w:color w:val="595959"/>
+          <w:sz w:val="18"/>
+          <w:szCs w:val="18"/>
+        </w:rPr>
+        <w:t xml:space="preserve">Screenshot (Windows 11): basic_server terminal</w:t>
+      </w:r>
+    </w:p>
+    <w:p>
+      <w:pPr>
+        <w:pStyle w:val="Heading2"/>
+      </w:pPr>
+      <w:r>
+        <w:t xml:space="preserve">4.3 Multi-threaded client: several queries on one connection</w:t>
+      </w:r>
+    </w:p>
+    <w:p>
+      <w:pPr>
+        <w:keepNext/>
+        <w:spacing w:after="120"/>
+      </w:pPr>
+      <w:r>
+        <w:t xml:space="preserve">Test 9 sends the four required queries plus </w:t>
+      </w:r>
+      <w:r>
+        <w:rPr>
+          <w:rFonts w:ascii="Consolas" w:cs="Consolas" w:eastAsia="Consolas" w:hAnsi="Consolas"/>
+          <w:sz w:val="19"/>
+          <w:szCs w:val="19"/>
+        </w:rPr>
+        <w:t xml:space="preserve">a?t</w:t>
+      </w:r>
+      <w:r>
+        <w:t xml:space="preserve">, </w:t>
+      </w:r>
+      <w:r>
+        <w:rPr>
+          <w:rFonts w:ascii="Consolas" w:cs="Consolas" w:eastAsia="Consolas" w:hAnsi="Consolas"/>
+          <w:sz w:val="19"/>
+          <w:szCs w:val="19"/>
+        </w:rPr>
+        <w:t xml:space="preserve">zzzzqx</w:t>
+      </w:r>
+      <w:r>
+        <w:t xml:space="preserve">, an empty line (ignored) and </w:t>
+      </w:r>
+      <w:r>
+        <w:rPr>
+          <w:rFonts w:ascii="Consolas" w:cs="Consolas" w:eastAsia="Consolas" w:hAnsi="Consolas"/>
+          <w:sz w:val="19"/>
+          <w:szCs w:val="19"/>
+        </w:rPr>
+        <w:t xml:space="preserve">quit</w:t>
+      </w:r>
+      <w:r>
+        <w:t xml:space="preserve"> on one connection (</w:t>
+      </w:r>
+      <w:r>
+        <w:rPr>
+          <w:rFonts w:ascii="Consolas" w:cs="Consolas" w:eastAsia="Consolas" w:hAnsi="Consolas"/>
+          <w:sz w:val="19"/>
+          <w:szCs w:val="19"/>
+        </w:rPr>
+        <w:t xml:space="preserve">logs/mt_client_session.txt</w:t>
+      </w:r>
+      <w:r>
+        <w:t xml:space="preserve">). Status lines from that run:</w:t>
+      </w:r>
+    </w:p>
+    <w:p>
+      <w:pPr>
+        <w:keepNext/>
+        <w:keepLines/>
+        <w:pBdr>
+          <w:top w:val="single" w:color="F2F2F2" w:sz="2" w:space="4"/>
+          <w:left w:val="single" w:color="A6A6A6" w:sz="12" w:space="6"/>
+        </w:pBdr>
+        <w:shd w:fill="F2F2F2" w:color="auto" w:val="clear"/>
+        <w:spacing w:after="0" w:before="0" w:line="240"/>
+        <w:ind w:left="144" w:right="144"/>
+      </w:pPr>
+      <w:r>
+        <w:rPr>
+          <w:rFonts w:ascii="Consolas" w:cs="Consolas" w:eastAsia="Consolas" w:hAnsi="Consolas"/>
+          <w:sz w:val="17"/>
+          <w:szCs w:val="17"/>
+        </w:rPr>
+        <w:t xml:space="preserve">$ python3 mt_client.py   (typed one per line: ??????????, ?, ?(a), -?-, a?t, zzzzqx, &lt;empty&gt;, quit)</w:t>
+      </w:r>
+    </w:p>
+    <w:p>
+      <w:pPr>
+        <w:keepNext/>
+        <w:keepLines/>
+        <w:pBdr>
+          <w:left w:val="single" w:color="A6A6A6" w:sz="12" w:space="6"/>
+        </w:pBdr>
+        <w:shd w:fill="F2F2F2" w:color="auto" w:val="clear"/>
+        <w:spacing w:after="0" w:before="0" w:line="240"/>
+        <w:ind w:left="144" w:right="144"/>
+      </w:pPr>
+      <w:r>
+        <w:rPr>
+          <w:rFonts w:ascii="Consolas" w:cs="Consolas" w:eastAsia="Consolas" w:hAnsi="Consolas"/>
+          <w:sz w:val="17"/>
+          <w:szCs w:val="17"/>
+        </w:rPr>
+        <w:t xml:space="preserve">Connected to 127.0.0.1:12000</w:t>
+      </w:r>
+    </w:p>
+    <w:p>
+      <w:pPr>
+        <w:keepNext/>
+        <w:keepLines/>
+        <w:pBdr>
+          <w:left w:val="single" w:color="A6A6A6" w:sz="12" w:space="6"/>
+        </w:pBdr>
+        <w:shd w:fill="F2F2F2" w:color="auto" w:val="clear"/>
+        <w:spacing w:after="0" w:before="0" w:line="240"/>
+        <w:ind w:left="144" w:right="144"/>
+      </w:pPr>
+      <w:r>
+        <w:rPr>
+          <w:rFonts w:ascii="Consolas" w:cs="Consolas" w:eastAsia="Consolas" w:hAnsi="Consolas"/>
+          <w:sz w:val="17"/>
+          <w:szCs w:val="17"/>
+        </w:rPr>
+        <w:t xml:space="preserve">Enter query (or 'quit'): Server replied: 200 OK</w:t>
+      </w:r>
+    </w:p>
+    <w:p>
+      <w:pPr>
+        <w:keepNext/>
+        <w:keepLines/>
+        <w:pBdr>
+          <w:left w:val="single" w:color="A6A6A6" w:sz="12" w:space="6"/>
+        </w:pBdr>
+        <w:shd w:fill="F2F2F2" w:color="auto" w:val="clear"/>
+        <w:spacing w:after="0" w:before="0" w:line="240"/>
+        <w:ind w:left="144" w:right="144"/>
+      </w:pPr>
+      <w:r>
+        <w:rPr>
+          <w:rFonts w:ascii="Consolas" w:cs="Consolas" w:eastAsia="Consolas" w:hAnsi="Consolas"/>
+          <w:sz w:val="17"/>
+          <w:szCs w:val="17"/>
+        </w:rPr>
+        <w:t xml:space="preserve">Number of matching words: 24071</w:t>
+      </w:r>
+    </w:p>
+    <w:p>
+      <w:pPr>
+        <w:keepNext/>
+        <w:keepLines/>
+        <w:pBdr>
+          <w:left w:val="single" w:color="A6A6A6" w:sz="12" w:space="6"/>
+        </w:pBdr>
+        <w:shd w:fill="F2F2F2" w:color="auto" w:val="clear"/>
+        <w:spacing w:after="0" w:before="0" w:line="240"/>
+        <w:ind w:left="144" w:right="144"/>
+      </w:pPr>
+      <w:r>
+        <w:rPr>
+          <w:rFonts w:ascii="Consolas" w:cs="Consolas" w:eastAsia="Consolas" w:hAnsi="Consolas"/>
+          <w:sz w:val="17"/>
+          <w:szCs w:val="17"/>
+        </w:rPr>
+        <w:t xml:space="preserve">Enter query (or 'quit'): Server replied: 200 OK</w:t>
+      </w:r>
+    </w:p>
+    <w:p>
+      <w:pPr>
+        <w:keepNext/>
+        <w:keepLines/>
+        <w:pBdr>
+          <w:left w:val="single" w:color="A6A6A6" w:sz="12" w:space="6"/>
+        </w:pBdr>
+        <w:shd w:fill="F2F2F2" w:color="auto" w:val="clear"/>
+        <w:spacing w:after="0" w:before="0" w:line="240"/>
+        <w:ind w:left="144" w:right="144"/>
+      </w:pPr>
+      <w:r>
+        <w:rPr>
+          <w:rFonts w:ascii="Consolas" w:cs="Consolas" w:eastAsia="Consolas" w:hAnsi="Consolas"/>
+          <w:sz w:val="17"/>
+          <w:szCs w:val="17"/>
+        </w:rPr>
+        <w:t xml:space="preserve">Number of matching words: 69903</w:t>
+      </w:r>
+    </w:p>
+    <w:p>
+      <w:pPr>
+        <w:keepNext/>
+        <w:keepLines/>
+        <w:pBdr>
+          <w:left w:val="single" w:color="A6A6A6" w:sz="12" w:space="6"/>
+        </w:pBdr>
+        <w:shd w:fill="F2F2F2" w:color="auto" w:val="clear"/>
+        <w:spacing w:after="0" w:before="0" w:line="240"/>
+        <w:ind w:left="144" w:right="144"/>
+      </w:pPr>
+      <w:r>
+        <w:rPr>
+          <w:rFonts w:ascii="Consolas" w:cs="Consolas" w:eastAsia="Consolas" w:hAnsi="Consolas"/>
+          <w:sz w:val="17"/>
+          <w:szCs w:val="17"/>
+        </w:rPr>
+        <w:t xml:space="preserve">Enter query (or 'quit'): Server replied: 200 OK</w:t>
+      </w:r>
+    </w:p>
+    <w:p>
+      <w:pPr>
+        <w:keepNext/>
+        <w:keepLines/>
+        <w:pBdr>
+          <w:left w:val="single" w:color="A6A6A6" w:sz="12" w:space="6"/>
+        </w:pBdr>
+        <w:shd w:fill="F2F2F2" w:color="auto" w:val="clear"/>
+        <w:spacing w:after="0" w:before="0" w:line="240"/>
+        <w:ind w:left="144" w:right="144"/>
+      </w:pPr>
+      <w:r>
+        <w:rPr>
+          <w:rFonts w:ascii="Consolas" w:cs="Consolas" w:eastAsia="Consolas" w:hAnsi="Consolas"/>
+          <w:sz w:val="17"/>
+          <w:szCs w:val="17"/>
+        </w:rPr>
+        <w:t xml:space="preserve">Number of matching words: 414</w:t>
+      </w:r>
+    </w:p>
+    <w:p>
+      <w:pPr>
+        <w:keepNext/>
+        <w:keepLines/>
+        <w:pBdr>
+          <w:left w:val="single" w:color="A6A6A6" w:sz="12" w:space="6"/>
+        </w:pBdr>
+        <w:shd w:fill="F2F2F2" w:color="auto" w:val="clear"/>
+        <w:spacing w:after="0" w:before="0" w:line="240"/>
+        <w:ind w:left="144" w:right="144"/>
+      </w:pPr>
+      <w:r>
+        <w:rPr>
+          <w:rFonts w:ascii="Consolas" w:cs="Consolas" w:eastAsia="Consolas" w:hAnsi="Consolas"/>
+          <w:sz w:val="17"/>
+          <w:szCs w:val="17"/>
+        </w:rPr>
+        <w:t xml:space="preserve">Enter query (or 'quit'): Server replied: 200 OK</w:t>
+      </w:r>
+    </w:p>
+    <w:p>
+      <w:pPr>
+        <w:keepNext/>
+        <w:keepLines/>
+        <w:pBdr>
+          <w:left w:val="single" w:color="A6A6A6" w:sz="12" w:space="6"/>
+        </w:pBdr>
+        <w:shd w:fill="F2F2F2" w:color="auto" w:val="clear"/>
+        <w:spacing w:after="0" w:before="0" w:line="240"/>
+        <w:ind w:left="144" w:right="144"/>
+      </w:pPr>
+      <w:r>
+        <w:rPr>
+          <w:rFonts w:ascii="Consolas" w:cs="Consolas" w:eastAsia="Consolas" w:hAnsi="Consolas"/>
+          <w:sz w:val="17"/>
+          <w:szCs w:val="17"/>
+        </w:rPr>
+        <w:t xml:space="preserve">Number of matching words: 13</w:t>
+      </w:r>
+    </w:p>
+    <w:p>
+      <w:pPr>
+        <w:keepNext/>
+        <w:keepLines/>
+        <w:pBdr>
+          <w:left w:val="single" w:color="A6A6A6" w:sz="12" w:space="6"/>
+        </w:pBdr>
+        <w:shd w:fill="F2F2F2" w:color="auto" w:val="clear"/>
+        <w:spacing w:after="0" w:before="0" w:line="240"/>
+        <w:ind w:left="144" w:right="144"/>
+      </w:pPr>
+      <w:r>
+        <w:rPr>
+          <w:rFonts w:ascii="Consolas" w:cs="Consolas" w:eastAsia="Consolas" w:hAnsi="Consolas"/>
+          <w:sz w:val="17"/>
+          <w:szCs w:val="17"/>
+        </w:rPr>
+        <w:t xml:space="preserve">Enter query (or 'quit'): Server replied: 200 OK</w:t>
+      </w:r>
+    </w:p>
+    <w:p>
+      <w:pPr>
+        <w:keepNext/>
+        <w:keepLines/>
+        <w:pBdr>
+          <w:left w:val="single" w:color="A6A6A6" w:sz="12" w:space="6"/>
+        </w:pBdr>
+        <w:shd w:fill="F2F2F2" w:color="auto" w:val="clear"/>
+        <w:spacing w:after="0" w:before="0" w:line="240"/>
+        <w:ind w:left="144" w:right="144"/>
+      </w:pPr>
+      <w:r>
+        <w:rPr>
+          <w:rFonts w:ascii="Consolas" w:cs="Consolas" w:eastAsia="Consolas" w:hAnsi="Consolas"/>
+          <w:sz w:val="17"/>
+          <w:szCs w:val="17"/>
+        </w:rPr>
+        <w:t xml:space="preserve">Number of matching words: 4260</w:t>
+      </w:r>
+    </w:p>
+    <w:p>
+      <w:pPr>
+        <w:keepNext/>
+        <w:keepLines/>
+        <w:pBdr>
+          <w:left w:val="single" w:color="A6A6A6" w:sz="12" w:space="6"/>
+        </w:pBdr>
+        <w:shd w:fill="F2F2F2" w:color="auto" w:val="clear"/>
+        <w:spacing w:after="0" w:before="0" w:line="240"/>
+        <w:ind w:left="144" w:right="144"/>
+      </w:pPr>
+      <w:r>
+        <w:rPr>
+          <w:rFonts w:ascii="Consolas" w:cs="Consolas" w:eastAsia="Consolas" w:hAnsi="Consolas"/>
+          <w:sz w:val="17"/>
+          <w:szCs w:val="17"/>
+        </w:rPr>
+        <w:t xml:space="preserve">Enter query (or 'quit'): Server replied: 404 NOT_FOUND</w:t>
+      </w:r>
+    </w:p>
+    <w:p>
+      <w:pPr>
+        <w:keepNext/>
+        <w:keepLines/>
+        <w:pBdr>
+          <w:left w:val="single" w:color="A6A6A6" w:sz="12" w:space="6"/>
+        </w:pBdr>
+        <w:shd w:fill="F2F2F2" w:color="auto" w:val="clear"/>
+        <w:spacing w:after="0" w:before="0" w:line="240"/>
+        <w:ind w:left="144" w:right="144"/>
+      </w:pPr>
+      <w:r>
+        <w:rPr>
+          <w:rFonts w:ascii="Consolas" w:cs="Consolas" w:eastAsia="Consolas" w:hAnsi="Consolas"/>
+          <w:sz w:val="17"/>
+          <w:szCs w:val="17"/>
+        </w:rPr>
+        <w:t xml:space="preserve">Number of matching words: 0</w:t>
+      </w:r>
+    </w:p>
+    <w:p>
+      <w:pPr>
+        <w:keepNext w:val="false"/>
+        <w:keepLines/>
+        <w:pBdr>
+          <w:bottom w:val="single" w:color="F2F2F2" w:sz="2" w:space="4"/>
+          <w:left w:val="single" w:color="A6A6A6" w:sz="12" w:space="6"/>
+        </w:pBdr>
+        <w:shd w:fill="F2F2F2" w:color="auto" w:val="clear"/>
+        <w:spacing w:after="0" w:before="0" w:line="240"/>
+        <w:ind w:left="144" w:right="144"/>
+      </w:pPr>
+      <w:r>
+        <w:rPr>
+          <w:rFonts w:ascii="Consolas" w:cs="Consolas" w:eastAsia="Consolas" w:hAnsi="Consolas"/>
+          <w:sz w:val="17"/>
+          <w:szCs w:val="17"/>
+        </w:rPr>
+        <w:t xml:space="preserve">Enter query (or 'quit'): Server replied: 200 BYE</w:t>
+      </w:r>
+    </w:p>
+    <w:p>
+      <w:pPr>
+        <w:spacing w:after="80"/>
+      </w:pPr>
+    </w:p>
+    <w:p>
+      <w:pPr>
+        <w:keepNext/>
+        <w:spacing w:after="120"/>
+      </w:pPr>
+      <w:r>
+        <w:t xml:space="preserve">Server log for this session (</w:t>
+      </w:r>
+      <w:r>
+        <w:rPr>
+          <w:rFonts w:ascii="Consolas" w:cs="Consolas" w:eastAsia="Consolas" w:hAnsi="Consolas"/>
+          <w:sz w:val="19"/>
+          <w:szCs w:val="19"/>
+        </w:rPr>
+        <w:t xml:space="preserve">logs/mt_server.log</w:t>
+      </w:r>
+      <w:r>
+        <w:t xml:space="preserve">):</w:t>
+      </w:r>
+    </w:p>
+    <w:p>
+      <w:pPr>
+        <w:keepNext/>
+        <w:keepLines/>
+        <w:pBdr>
+          <w:top w:val="single" w:color="F2F2F2" w:sz="2" w:space="4"/>
+          <w:left w:val="single" w:color="A6A6A6" w:sz="12" w:space="6"/>
+        </w:pBdr>
+        <w:shd w:fill="F2F2F2" w:color="auto" w:val="clear"/>
+        <w:spacing w:after="0" w:before="0" w:line="240"/>
+        <w:ind w:left="144" w:right="144"/>
+      </w:pPr>
+      <w:r>
+        <w:rPr>
+          <w:rFonts w:ascii="Consolas" w:cs="Consolas" w:eastAsia="Consolas" w:hAnsi="Consolas"/>
+          <w:sz w:val="17"/>
+          <w:szCs w:val="17"/>
+        </w:rPr>
+        <w:t xml:space="preserve">Loaded 69903 words from /home/user/Testing_Repo/pa1/wordlist.txt</w:t>
+      </w:r>
+    </w:p>
+    <w:p>
+      <w:pPr>
+        <w:keepNext/>
+        <w:keepLines/>
+        <w:pBdr>
+          <w:left w:val="single" w:color="A6A6A6" w:sz="12" w:space="6"/>
+        </w:pBdr>
+        <w:shd w:fill="F2F2F2" w:color="auto" w:val="clear"/>
+        <w:spacing w:after="0" w:before="0" w:line="240"/>
+        <w:ind w:left="144" w:right="144"/>
+      </w:pPr>
+      <w:r>
+        <w:rPr>
+          <w:rFonts w:ascii="Consolas" w:cs="Consolas" w:eastAsia="Consolas" w:hAnsi="Consolas"/>
+          <w:sz w:val="17"/>
+          <w:szCs w:val="17"/>
+        </w:rPr>
+        <w:t xml:space="preserve">Multi-threaded WORDQ server listening on port 12000 (Ctrl-C to stop)</w:t>
+      </w:r>
+    </w:p>
+    <w:p>
+      <w:pPr>
+        <w:keepNext/>
+        <w:keepLines/>
+        <w:pBdr>
+          <w:left w:val="single" w:color="A6A6A6" w:sz="12" w:space="6"/>
+        </w:pBdr>
+        <w:shd w:fill="F2F2F2" w:color="auto" w:val="clear"/>
+        <w:spacing w:after="0" w:before="0" w:line="240"/>
+        <w:ind w:left="144" w:right="144"/>
+      </w:pPr>
+      <w:r>
+        <w:rPr>
+          <w:rFonts w:ascii="Consolas" w:cs="Consolas" w:eastAsia="Consolas" w:hAnsi="Consolas"/>
+          <w:sz w:val="17"/>
+          <w:szCs w:val="17"/>
+        </w:rPr>
+        <w:t xml:space="preserve">Server connected by ('127.0.0.1', 34836) at Fri Oct 16 00:14:31 2026</w:t>
+      </w:r>
+    </w:p>
+    <w:p>
+      <w:pPr>
+        <w:keepNext/>
+        <w:keepLines/>
+        <w:pBdr>
+          <w:left w:val="single" w:color="A6A6A6" w:sz="12" w:space="6"/>
+        </w:pBdr>
+        <w:shd w:fill="F2F2F2" w:color="auto" w:val="clear"/>
+        <w:spacing w:after="0" w:before="0" w:line="240"/>
+        <w:ind w:left="144" w:right="144"/>
+      </w:pPr>
+      <w:r>
+        <w:rPr>
+          <w:rFonts w:ascii="Consolas" w:cs="Consolas" w:eastAsia="Consolas" w:hAnsi="Consolas"/>
+          <w:sz w:val="17"/>
+          <w:szCs w:val="17"/>
+        </w:rPr>
+        <w:t xml:space="preserve">('127.0.0.1', 34836)  b'QUERY ??????????\n' -&gt; 200 OK 24071</w:t>
+      </w:r>
+    </w:p>
+    <w:p>
+      <w:pPr>
+        <w:keepNext/>
+        <w:keepLines/>
+        <w:pBdr>
+          <w:left w:val="single" w:color="A6A6A6" w:sz="12" w:space="6"/>
+        </w:pBdr>
+        <w:shd w:fill="F2F2F2" w:color="auto" w:val="clear"/>
+        <w:spacing w:after="0" w:before="0" w:line="240"/>
+        <w:ind w:left="144" w:right="144"/>
+      </w:pPr>
+      <w:r>
+        <w:rPr>
+          <w:rFonts w:ascii="Consolas" w:cs="Consolas" w:eastAsia="Consolas" w:hAnsi="Consolas"/>
+          <w:sz w:val="17"/>
+          <w:szCs w:val="17"/>
+        </w:rPr>
+        <w:t xml:space="preserve">('127.0.0.1', 34836)  b'QUERY ?\n' -&gt; 200 OK 69903</w:t>
+      </w:r>
+    </w:p>
+    <w:p>
+      <w:pPr>
+        <w:keepNext/>
+        <w:keepLines/>
+        <w:pBdr>
+          <w:left w:val="single" w:color="A6A6A6" w:sz="12" w:space="6"/>
+        </w:pBdr>
+        <w:shd w:fill="F2F2F2" w:color="auto" w:val="clear"/>
+        <w:spacing w:after="0" w:before="0" w:line="240"/>
+        <w:ind w:left="144" w:right="144"/>
+      </w:pPr>
+      <w:r>
+        <w:rPr>
+          <w:rFonts w:ascii="Consolas" w:cs="Consolas" w:eastAsia="Consolas" w:hAnsi="Consolas"/>
+          <w:sz w:val="17"/>
+          <w:szCs w:val="17"/>
+        </w:rPr>
+        <w:t xml:space="preserve">('127.0.0.1', 34836)  b'QUERY ?(a)\n' -&gt; 200 OK 414</w:t>
+      </w:r>
+    </w:p>
+    <w:p>
+      <w:pPr>
+        <w:keepNext/>
+        <w:keepLines/>
+        <w:pBdr>
+          <w:left w:val="single" w:color="A6A6A6" w:sz="12" w:space="6"/>
+        </w:pBdr>
+        <w:shd w:fill="F2F2F2" w:color="auto" w:val="clear"/>
+        <w:spacing w:after="0" w:before="0" w:line="240"/>
+        <w:ind w:left="144" w:right="144"/>
+      </w:pPr>
+      <w:r>
+        <w:rPr>
+          <w:rFonts w:ascii="Consolas" w:cs="Consolas" w:eastAsia="Consolas" w:hAnsi="Consolas"/>
+          <w:sz w:val="17"/>
+          <w:szCs w:val="17"/>
+        </w:rPr>
+        <w:t xml:space="preserve">('127.0.0.1', 34836)  b'QUERY -?-\n' -&gt; 200 OK 13</w:t>
+      </w:r>
+    </w:p>
+    <w:p>
+      <w:pPr>
+        <w:keepNext/>
+        <w:keepLines/>
+        <w:pBdr>
+          <w:left w:val="single" w:color="A6A6A6" w:sz="12" w:space="6"/>
+        </w:pBdr>
+        <w:shd w:fill="F2F2F2" w:color="auto" w:val="clear"/>
+        <w:spacing w:after="0" w:before="0" w:line="240"/>
+        <w:ind w:left="144" w:right="144"/>
+      </w:pPr>
+      <w:r>
+        <w:rPr>
+          <w:rFonts w:ascii="Consolas" w:cs="Consolas" w:eastAsia="Consolas" w:hAnsi="Consolas"/>
+          <w:sz w:val="17"/>
+          <w:szCs w:val="17"/>
+        </w:rPr>
+        <w:t xml:space="preserve">('127.0.0.1', 34836)  b'QUERY a?t\n' -&gt; 200 OK 4260</w:t>
+      </w:r>
+    </w:p>
+    <w:p>
+      <w:pPr>
+        <w:keepNext/>
+        <w:keepLines/>
+        <w:pBdr>
+          <w:left w:val="single" w:color="A6A6A6" w:sz="12" w:space="6"/>
+        </w:pBdr>
+        <w:shd w:fill="F2F2F2" w:color="auto" w:val="clear"/>
+        <w:spacing w:after="0" w:before="0" w:line="240"/>
+        <w:ind w:left="144" w:right="144"/>
+      </w:pPr>
+      <w:r>
+        <w:rPr>
+          <w:rFonts w:ascii="Consolas" w:cs="Consolas" w:eastAsia="Consolas" w:hAnsi="Consolas"/>
+          <w:sz w:val="17"/>
+          <w:szCs w:val="17"/>
+        </w:rPr>
+        <w:t xml:space="preserve">('127.0.0.1', 34836)  b'QUERY zzzzqx\n' -&gt; 404 NOT_FOUND 0</w:t>
+      </w:r>
+    </w:p>
+    <w:p>
+      <w:pPr>
+        <w:keepNext/>
+        <w:keepLines/>
+        <w:pBdr>
+          <w:left w:val="single" w:color="A6A6A6" w:sz="12" w:space="6"/>
+        </w:pBdr>
+        <w:shd w:fill="F2F2F2" w:color="auto" w:val="clear"/>
+        <w:spacing w:after="0" w:before="0" w:line="240"/>
+        <w:ind w:left="144" w:right="144"/>
+      </w:pPr>
+      <w:r>
+        <w:rPr>
+          <w:rFonts w:ascii="Consolas" w:cs="Consolas" w:eastAsia="Consolas" w:hAnsi="Consolas"/>
+          <w:sz w:val="17"/>
+          <w:szCs w:val="17"/>
+        </w:rPr>
+        <w:t xml:space="preserve">('127.0.0.1', 34836)  b'QUIT\n' -&gt; 200 BYE 0</w:t>
+      </w:r>
+    </w:p>
+    <w:p>
+      <w:pPr>
+        <w:keepNext w:val="false"/>
+        <w:keepLines/>
+        <w:pBdr>
+          <w:bottom w:val="single" w:color="F2F2F2" w:sz="2" w:space="4"/>
+          <w:left w:val="single" w:color="A6A6A6" w:sz="12" w:space="6"/>
+        </w:pBdr>
+        <w:shd w:fill="F2F2F2" w:color="auto" w:val="clear"/>
+        <w:spacing w:after="0" w:before="0" w:line="240"/>
+        <w:ind w:left="144" w:right="144"/>
+      </w:pPr>
+      <w:r>
+        <w:rPr>
+          <w:rFonts w:ascii="Consolas" w:cs="Consolas" w:eastAsia="Consolas" w:hAnsi="Consolas"/>
+          <w:sz w:val="17"/>
+          <w:szCs w:val="17"/>
+        </w:rPr>
+        <w:t xml:space="preserve">Client ('127.0.0.1', 34836) finished at Fri Oct 16 00:14:32 2026</w:t>
+      </w:r>
+    </w:p>
+    <w:p>
+      <w:pPr>
+        <w:spacing w:after="80"/>
+      </w:pPr>
+    </w:p>
+    <w:p>
+      <w:pPr>
+        <w:keepNext/>
+        <w:spacing w:after="40" w:before="60"/>
+        <w:jc w:val="center"/>
+      </w:pPr>
+      <w:r>
+        <w:drawing>
+          <wp:inline distT="0" distB="0" distL="0" distR="0">
+            <wp:extent cx="2886075" cy="3305175"/>
+            <wp:effectExtent t="0" r="0" b="0" l="0"/>
+            <wp:docPr id="1" name="10.png" descr="Screenshot: mt_client session with the four required queries" title="mt_client session with the four required queries"/>
+            <wp:cNvGraphicFramePr>
+              <a:graphicFrameLocks xmlns:a="http://schemas.openxmlformats.org/drawingml/2006/main" noChangeAspect="1"/>
+            </wp:cNvGraphicFramePr>
+            <a:graphic xmlns:a="http://schemas.openxmlformats.org/drawingml/2006/main">
+              <a:graphicData uri="http://schemas.openxmlformats.org/drawingml/2006/picture">
+                <pic:pic xmlns:pic="http://schemas.openxmlformats.org/drawingml/2006/picture">
+                  <pic:nvPicPr>
+                    <pic:cNvPr id="0" name="" descr=""/>
+                    <pic:cNvPicPr>
+                      <a:picLocks noChangeAspect="1" noChangeArrowheads="1"/>
+                    </pic:cNvPicPr>
+                  </pic:nvPicPr>
+                  <pic:blipFill>
+                    <a:blip r:embed="rId17" cstate="none"/>
+                    <a:srcRect/>
+                    <a:stretch>
+                      <a:fillRect/>
+                    </a:stretch>
+                  </pic:blipFill>
+                  <pic:spPr bwMode="auto">
+                    <a:xfrm>
+                      <a:off x="0" y="0"/>
+                      <a:ext cx="2886075" cy="3305175"/>
+                    </a:xfrm>
+                    <a:prstGeom prst="rect">
+                      <a:avLst/>
+                    </a:prstGeom>
+                  </pic:spPr>
+                </pic:pic>
+              </a:graphicData>
+            </a:graphic>
+          </wp:inline>
+        </w:drawing>
+      </w:r>
+    </w:p>
+    <w:p>
+      <w:pPr>
+        <w:spacing w:after="200"/>
+        <w:jc w:val="center"/>
+      </w:pPr>
+      <w:r>
+        <w:rPr>
+          <w:i/>
+          <w:iCs/>
+          <w:color w:val="595959"/>
+          <w:sz w:val="18"/>
+          <w:szCs w:val="18"/>
+        </w:rPr>
+        <w:t xml:space="preserve">Screenshot (Windows 11): mt_client: three requests on one connection, ending with 200 BYE</w:t>
+      </w:r>
+    </w:p>
+    <w:p>
+      <w:pPr>
+        <w:keepNext/>
+        <w:spacing w:after="120"/>
+      </w:pPr>
+      <w:r>
+        <w:t xml:space="preserve">Test 10, EOF counts as quit (</w:t>
+      </w:r>
+      <w:r>
+        <w:rPr>
+          <w:rFonts w:ascii="Consolas" w:cs="Consolas" w:eastAsia="Consolas" w:hAnsi="Consolas"/>
+          <w:sz w:val="19"/>
+          <w:szCs w:val="19"/>
+        </w:rPr>
+        <w:t xml:space="preserve">logs/mt_client_eof.txt</w:t>
+      </w:r>
+      <w:r>
+        <w:t xml:space="preserve">):</w:t>
+      </w:r>
+    </w:p>
+    <w:p>
+      <w:pPr>
+        <w:keepNext/>
+        <w:keepLines/>
+        <w:pBdr>
+          <w:top w:val="single" w:color="F2F2F2" w:sz="2" w:space="4"/>
+          <w:left w:val="single" w:color="A6A6A6" w:sz="12" w:space="6"/>
+        </w:pBdr>
+        <w:shd w:fill="F2F2F2" w:color="auto" w:val="clear"/>
+        <w:spacing w:after="0" w:before="0" w:line="240"/>
+        <w:ind w:left="144" w:right="144"/>
+      </w:pPr>
+      <w:r>
+        <w:rPr>
+          <w:rFonts w:ascii="Consolas" w:cs="Consolas" w:eastAsia="Consolas" w:hAnsi="Consolas"/>
+          <w:sz w:val="17"/>
+          <w:szCs w:val="17"/>
+        </w:rPr>
+        <w:t xml:space="preserve">$ python3 mt_client.py   (typed: -?- then EOF/Ctrl-D)</w:t>
+      </w:r>
+    </w:p>
+    <w:p>
+      <w:pPr>
+        <w:keepNext/>
+        <w:keepLines/>
+        <w:pBdr>
+          <w:left w:val="single" w:color="A6A6A6" w:sz="12" w:space="6"/>
+        </w:pBdr>
+        <w:shd w:fill="F2F2F2" w:color="auto" w:val="clear"/>
+        <w:spacing w:after="0" w:before="0" w:line="240"/>
+        <w:ind w:left="144" w:right="144"/>
+      </w:pPr>
+      <w:r>
+        <w:rPr>
+          <w:rFonts w:ascii="Consolas" w:cs="Consolas" w:eastAsia="Consolas" w:hAnsi="Consolas"/>
+          <w:sz w:val="17"/>
+          <w:szCs w:val="17"/>
+        </w:rPr>
+        <w:t xml:space="preserve">Connected to 127.0.0.1:12000</w:t>
+      </w:r>
+    </w:p>
+    <w:p>
+      <w:pPr>
+        <w:keepNext/>
+        <w:keepLines/>
+        <w:pBdr>
+          <w:left w:val="single" w:color="A6A6A6" w:sz="12" w:space="6"/>
+        </w:pBdr>
+        <w:shd w:fill="F2F2F2" w:color="auto" w:val="clear"/>
+        <w:spacing w:after="0" w:before="0" w:line="240"/>
+        <w:ind w:left="144" w:right="144"/>
+      </w:pPr>
+      <w:r>
+        <w:rPr>
+          <w:rFonts w:ascii="Consolas" w:cs="Consolas" w:eastAsia="Consolas" w:hAnsi="Consolas"/>
+          <w:sz w:val="17"/>
+          <w:szCs w:val="17"/>
+        </w:rPr>
+        <w:t xml:space="preserve">Enter query (or 'quit'): Server replied: 200 OK</w:t>
+      </w:r>
+    </w:p>
+    <w:p>
+      <w:pPr>
+        <w:keepNext/>
+        <w:keepLines/>
+        <w:pBdr>
+          <w:left w:val="single" w:color="A6A6A6" w:sz="12" w:space="6"/>
+        </w:pBdr>
+        <w:shd w:fill="F2F2F2" w:color="auto" w:val="clear"/>
+        <w:spacing w:after="0" w:before="0" w:line="240"/>
+        <w:ind w:left="144" w:right="144"/>
+      </w:pPr>
+      <w:r>
+        <w:rPr>
+          <w:rFonts w:ascii="Consolas" w:cs="Consolas" w:eastAsia="Consolas" w:hAnsi="Consolas"/>
+          <w:sz w:val="17"/>
+          <w:szCs w:val="17"/>
+        </w:rPr>
+        <w:t xml:space="preserve">Number of matching words: 13</w:t>
+      </w:r>
+    </w:p>
+    <w:p>
+      <w:pPr>
+        <w:keepNext/>
+        <w:keepLines/>
+        <w:pBdr>
+          <w:left w:val="single" w:color="A6A6A6" w:sz="12" w:space="6"/>
+        </w:pBdr>
+        <w:shd w:fill="F2F2F2" w:color="auto" w:val="clear"/>
+        <w:spacing w:after="0" w:before="0" w:line="240"/>
+        <w:ind w:left="144" w:right="144"/>
+      </w:pPr>
+      <w:r>
+        <w:rPr>
+          <w:rFonts w:ascii="Consolas" w:cs="Consolas" w:eastAsia="Consolas" w:hAnsi="Consolas"/>
+          <w:sz w:val="17"/>
+          <w:szCs w:val="17"/>
+        </w:rPr>
+        <w:t xml:space="preserve">bric-a-brac</w:t>
+      </w:r>
+    </w:p>
+    <w:p>
+      <w:pPr>
+        <w:keepNext/>
+        <w:keepLines/>
+        <w:pBdr>
+          <w:left w:val="single" w:color="A6A6A6" w:sz="12" w:space="6"/>
+        </w:pBdr>
+        <w:shd w:fill="F2F2F2" w:color="auto" w:val="clear"/>
+        <w:spacing w:after="0" w:before="0" w:line="240"/>
+        <w:ind w:left="144" w:right="144"/>
+      </w:pPr>
+      <w:r>
+        <w:rPr>
+          <w:rFonts w:ascii="Consolas" w:cs="Consolas" w:eastAsia="Consolas" w:hAnsi="Consolas"/>
+          <w:sz w:val="17"/>
+          <w:szCs w:val="17"/>
+        </w:rPr>
+        <w:t xml:space="preserve">   ... (11 more lines omitted; full output in logs/) ...</w:t>
+      </w:r>
+    </w:p>
+    <w:p>
+      <w:pPr>
+        <w:keepNext/>
+        <w:keepLines/>
+        <w:pBdr>
+          <w:left w:val="single" w:color="A6A6A6" w:sz="12" w:space="6"/>
+        </w:pBdr>
+        <w:shd w:fill="F2F2F2" w:color="auto" w:val="clear"/>
+        <w:spacing w:after="0" w:before="0" w:line="240"/>
+        <w:ind w:left="144" w:right="144"/>
+      </w:pPr>
+      <w:r>
+        <w:rPr>
+          <w:rFonts w:ascii="Consolas" w:cs="Consolas" w:eastAsia="Consolas" w:hAnsi="Consolas"/>
+          <w:sz w:val="17"/>
+          <w:szCs w:val="17"/>
+        </w:rPr>
+        <w:t xml:space="preserve">vis-a-vis</w:t>
+      </w:r>
+    </w:p>
+    <w:p>
+      <w:pPr>
+        <w:keepNext/>
+        <w:keepLines/>
+        <w:pBdr>
+          <w:left w:val="single" w:color="A6A6A6" w:sz="12" w:space="6"/>
+        </w:pBdr>
+        <w:shd w:fill="F2F2F2" w:color="auto" w:val="clear"/>
+        <w:spacing w:after="0" w:before="0" w:line="240"/>
+        <w:ind w:left="144" w:right="144"/>
+      </w:pPr>
+      <w:r>
+        <w:rPr>
+          <w:rFonts w:ascii="Consolas" w:cs="Consolas" w:eastAsia="Consolas" w:hAnsi="Consolas"/>
+          <w:sz w:val="17"/>
+          <w:szCs w:val="17"/>
+        </w:rPr>
+        <w:t xml:space="preserve">Enter query (or 'quit'): </w:t>
+      </w:r>
+    </w:p>
+    <w:p>
+      <w:pPr>
+        <w:keepNext/>
+        <w:keepLines/>
+        <w:pBdr>
+          <w:left w:val="single" w:color="A6A6A6" w:sz="12" w:space="6"/>
+        </w:pBdr>
+        <w:shd w:fill="F2F2F2" w:color="auto" w:val="clear"/>
+        <w:spacing w:after="0" w:before="0" w:line="240"/>
+        <w:ind w:left="144" w:right="144"/>
+      </w:pPr>
+      <w:r>
+        <w:rPr>
+          <w:rFonts w:ascii="Consolas" w:cs="Consolas" w:eastAsia="Consolas" w:hAnsi="Consolas"/>
+          <w:sz w:val="17"/>
+          <w:szCs w:val="17"/>
+        </w:rPr>
+        <w:t xml:space="preserve">Server replied: 200 BYE</w:t>
+      </w:r>
+    </w:p>
+    <w:p>
+      <w:pPr>
+        <w:keepNext w:val="false"/>
+        <w:keepLines/>
+        <w:pBdr>
+          <w:bottom w:val="single" w:color="F2F2F2" w:sz="2" w:space="4"/>
+          <w:left w:val="single" w:color="A6A6A6" w:sz="12" w:space="6"/>
+        </w:pBdr>
+        <w:shd w:fill="F2F2F2" w:color="auto" w:val="clear"/>
+        <w:spacing w:after="0" w:before="0" w:line="240"/>
+        <w:ind w:left="144" w:right="144"/>
+      </w:pPr>
+      <w:r>
+        <w:rPr>
+          <w:rFonts w:ascii="Consolas" w:cs="Consolas" w:eastAsia="Consolas" w:hAnsi="Consolas"/>
+          <w:sz w:val="17"/>
+          <w:szCs w:val="17"/>
+        </w:rPr>
+        <w:t xml:space="preserve">[exit code 0]</w:t>
+      </w:r>
+    </w:p>
+    <w:p>
+      <w:pPr>
+        <w:spacing w:after="80"/>
+      </w:pPr>
+    </w:p>
+    <w:p>
+      <w:pPr>
+        <w:pStyle w:val="Heading2"/>
+      </w:pPr>
+      <w:r>
+        <w:t xml:space="preserve">4.4 Malformed requests</w:t>
+      </w:r>
+    </w:p>
+    <w:p>
+      <w:pPr>
+        <w:keepNext/>
+        <w:spacing w:after="120"/>
+      </w:pPr>
+      <w:r>
+        <w:t xml:space="preserve">Tests 11-14 use </w:t>
+      </w:r>
+      <w:r>
+        <w:rPr>
+          <w:rFonts w:ascii="Consolas" w:cs="Consolas" w:eastAsia="Consolas" w:hAnsi="Consolas"/>
+          <w:sz w:val="19"/>
+          <w:szCs w:val="19"/>
+        </w:rPr>
+        <w:t xml:space="preserve">test_raw_protocol.py</w:t>
+      </w:r>
+      <w:r>
+        <w:t xml:space="preserve">, which sends raw lines over one connection (</w:t>
+      </w:r>
+      <w:r>
+        <w:rPr>
+          <w:rFonts w:ascii="Consolas" w:cs="Consolas" w:eastAsia="Consolas" w:hAnsi="Consolas"/>
+          <w:sz w:val="19"/>
+          <w:szCs w:val="19"/>
+        </w:rPr>
+        <w:t xml:space="preserve">logs/raw_protocol_tests.txt</w:t>
+      </w:r>
+      <w:r>
+        <w:t xml:space="preserve">):</w:t>
+      </w:r>
+    </w:p>
+    <w:p>
+      <w:pPr>
+        <w:keepNext/>
+        <w:keepLines/>
+        <w:pBdr>
+          <w:top w:val="single" w:color="F2F2F2" w:sz="2" w:space="4"/>
+          <w:left w:val="single" w:color="A6A6A6" w:sz="12" w:space="6"/>
+        </w:pBdr>
+        <w:shd w:fill="F2F2F2" w:color="auto" w:val="clear"/>
+        <w:spacing w:after="0" w:before="0" w:line="240"/>
+        <w:ind w:left="144" w:right="144"/>
+      </w:pPr>
+      <w:r>
+        <w:rPr>
+          <w:rFonts w:ascii="Consolas" w:cs="Consolas" w:eastAsia="Consolas" w:hAnsi="Consolas"/>
+          <w:sz w:val="17"/>
+          <w:szCs w:val="17"/>
+        </w:rPr>
+        <w:t xml:space="preserve">--- Test: empty QUERY</w:t>
+      </w:r>
+    </w:p>
+    <w:p>
+      <w:pPr>
+        <w:keepNext/>
+        <w:keepLines/>
+        <w:pBdr>
+          <w:left w:val="single" w:color="A6A6A6" w:sz="12" w:space="6"/>
+        </w:pBdr>
+        <w:shd w:fill="F2F2F2" w:color="auto" w:val="clear"/>
+        <w:spacing w:after="0" w:before="0" w:line="240"/>
+        <w:ind w:left="144" w:right="144"/>
+      </w:pPr>
+      <w:r>
+        <w:rPr>
+          <w:rFonts w:ascii="Consolas" w:cs="Consolas" w:eastAsia="Consolas" w:hAnsi="Consolas"/>
+          <w:sz w:val="17"/>
+          <w:szCs w:val="17"/>
+        </w:rPr>
+        <w:t xml:space="preserve">SEND b'QUERY\n'</w:t>
+      </w:r>
+    </w:p>
+    <w:p>
+      <w:pPr>
+        <w:keepNext/>
+        <w:keepLines/>
+        <w:pBdr>
+          <w:left w:val="single" w:color="A6A6A6" w:sz="12" w:space="6"/>
+        </w:pBdr>
+        <w:shd w:fill="F2F2F2" w:color="auto" w:val="clear"/>
+        <w:spacing w:after="0" w:before="0" w:line="240"/>
+        <w:ind w:left="144" w:right="144"/>
+      </w:pPr>
+      <w:r>
+        <w:rPr>
+          <w:rFonts w:ascii="Consolas" w:cs="Consolas" w:eastAsia="Consolas" w:hAnsi="Consolas"/>
+          <w:sz w:val="17"/>
+          <w:szCs w:val="17"/>
+        </w:rPr>
+        <w:t xml:space="preserve">RECV 400 BAD_REQUEST 0</w:t>
+      </w:r>
+    </w:p>
+    <w:p>
+      <w:pPr>
+        <w:keepNext/>
+        <w:keepLines/>
+        <w:pBdr>
+          <w:left w:val="single" w:color="A6A6A6" w:sz="12" w:space="6"/>
+        </w:pBdr>
+        <w:shd w:fill="F2F2F2" w:color="auto" w:val="clear"/>
+        <w:spacing w:after="0" w:before="0" w:line="240"/>
+        <w:ind w:left="144" w:right="144"/>
+      </w:pPr>
+      <w:r>
+        <w:rPr>
+          <w:rFonts w:ascii="Consolas" w:cs="Consolas" w:eastAsia="Consolas" w:hAnsi="Consolas"/>
+          <w:sz w:val="17"/>
+          <w:szCs w:val="17"/>
+        </w:rPr>
+        <w:t xml:space="preserve">SEND b'QUERY    \n'</w:t>
+      </w:r>
+    </w:p>
+    <w:p>
+      <w:pPr>
+        <w:keepNext/>
+        <w:keepLines/>
+        <w:pBdr>
+          <w:left w:val="single" w:color="A6A6A6" w:sz="12" w:space="6"/>
+        </w:pBdr>
+        <w:shd w:fill="F2F2F2" w:color="auto" w:val="clear"/>
+        <w:spacing w:after="0" w:before="0" w:line="240"/>
+        <w:ind w:left="144" w:right="144"/>
+      </w:pPr>
+      <w:r>
+        <w:rPr>
+          <w:rFonts w:ascii="Consolas" w:cs="Consolas" w:eastAsia="Consolas" w:hAnsi="Consolas"/>
+          <w:sz w:val="17"/>
+          <w:szCs w:val="17"/>
+        </w:rPr>
+        <w:t xml:space="preserve">RECV 400 BAD_REQUEST 0</w:t>
+      </w:r>
+    </w:p>
+    <w:p>
+      <w:pPr>
+        <w:keepNext/>
+        <w:keepLines/>
+        <w:pBdr>
+          <w:left w:val="single" w:color="A6A6A6" w:sz="12" w:space="6"/>
+        </w:pBdr>
+        <w:shd w:fill="F2F2F2" w:color="auto" w:val="clear"/>
+        <w:spacing w:after="0" w:before="0" w:line="240"/>
+        <w:ind w:left="144" w:right="144"/>
+      </w:pPr>
+      <w:r>
+        <w:rPr>
+          <w:rFonts w:ascii="Consolas" w:cs="Consolas" w:eastAsia="Consolas" w:hAnsi="Consolas"/>
+          <w:sz w:val="17"/>
+          <w:szCs w:val="17"/>
+        </w:rPr>
+        <w:t xml:space="preserve">--- Test: unknown command, then check connection stays open</w:t>
+      </w:r>
+    </w:p>
+    <w:p>
+      <w:pPr>
+        <w:keepNext/>
+        <w:keepLines/>
+        <w:pBdr>
+          <w:left w:val="single" w:color="A6A6A6" w:sz="12" w:space="6"/>
+        </w:pBdr>
+        <w:shd w:fill="F2F2F2" w:color="auto" w:val="clear"/>
+        <w:spacing w:after="0" w:before="0" w:line="240"/>
+        <w:ind w:left="144" w:right="144"/>
+      </w:pPr>
+      <w:r>
+        <w:rPr>
+          <w:rFonts w:ascii="Consolas" w:cs="Consolas" w:eastAsia="Consolas" w:hAnsi="Consolas"/>
+          <w:sz w:val="17"/>
+          <w:szCs w:val="17"/>
+        </w:rPr>
+        <w:t xml:space="preserve">SEND b'FIND a?t\n'</w:t>
+      </w:r>
+    </w:p>
+    <w:p>
+      <w:pPr>
+        <w:keepNext/>
+        <w:keepLines/>
+        <w:pBdr>
+          <w:left w:val="single" w:color="A6A6A6" w:sz="12" w:space="6"/>
+        </w:pBdr>
+        <w:shd w:fill="F2F2F2" w:color="auto" w:val="clear"/>
+        <w:spacing w:after="0" w:before="0" w:line="240"/>
+        <w:ind w:left="144" w:right="144"/>
+      </w:pPr>
+      <w:r>
+        <w:rPr>
+          <w:rFonts w:ascii="Consolas" w:cs="Consolas" w:eastAsia="Consolas" w:hAnsi="Consolas"/>
+          <w:sz w:val="17"/>
+          <w:szCs w:val="17"/>
+        </w:rPr>
+        <w:t xml:space="preserve">RECV 400 BAD_REQUEST 0</w:t>
+      </w:r>
+    </w:p>
+    <w:p>
+      <w:pPr>
+        <w:keepNext/>
+        <w:keepLines/>
+        <w:pBdr>
+          <w:left w:val="single" w:color="A6A6A6" w:sz="12" w:space="6"/>
+        </w:pBdr>
+        <w:shd w:fill="F2F2F2" w:color="auto" w:val="clear"/>
+        <w:spacing w:after="0" w:before="0" w:line="240"/>
+        <w:ind w:left="144" w:right="144"/>
+      </w:pPr>
+      <w:r>
+        <w:rPr>
+          <w:rFonts w:ascii="Consolas" w:cs="Consolas" w:eastAsia="Consolas" w:hAnsi="Consolas"/>
+          <w:sz w:val="17"/>
+          <w:szCs w:val="17"/>
+        </w:rPr>
+        <w:t xml:space="preserve">SEND b'QUERY -?-\n'</w:t>
+      </w:r>
+    </w:p>
+    <w:p>
+      <w:pPr>
+        <w:keepNext/>
+        <w:keepLines/>
+        <w:pBdr>
+          <w:left w:val="single" w:color="A6A6A6" w:sz="12" w:space="6"/>
+        </w:pBdr>
+        <w:shd w:fill="F2F2F2" w:color="auto" w:val="clear"/>
+        <w:spacing w:after="0" w:before="0" w:line="240"/>
+        <w:ind w:left="144" w:right="144"/>
+      </w:pPr>
+      <w:r>
+        <w:rPr>
+          <w:rFonts w:ascii="Consolas" w:cs="Consolas" w:eastAsia="Consolas" w:hAnsi="Consolas"/>
+          <w:sz w:val="17"/>
+          <w:szCs w:val="17"/>
+        </w:rPr>
+        <w:t xml:space="preserve">RECV 200 OK 13</w:t>
+      </w:r>
+    </w:p>
+    <w:p>
+      <w:pPr>
+        <w:keepNext/>
+        <w:keepLines/>
+        <w:pBdr>
+          <w:left w:val="single" w:color="A6A6A6" w:sz="12" w:space="6"/>
+        </w:pBdr>
+        <w:shd w:fill="F2F2F2" w:color="auto" w:val="clear"/>
+        <w:spacing w:after="0" w:before="0" w:line="240"/>
+        <w:ind w:left="144" w:right="144"/>
+      </w:pPr>
+      <w:r>
+        <w:rPr>
+          <w:rFonts w:ascii="Consolas" w:cs="Consolas" w:eastAsia="Consolas" w:hAnsi="Consolas"/>
+          <w:sz w:val="17"/>
+          <w:szCs w:val="17"/>
+        </w:rPr>
+        <w:t xml:space="preserve">connection still open: True</w:t>
+      </w:r>
+    </w:p>
+    <w:p>
+      <w:pPr>
+        <w:keepNext/>
+        <w:keepLines/>
+        <w:pBdr>
+          <w:left w:val="single" w:color="A6A6A6" w:sz="12" w:space="6"/>
+        </w:pBdr>
+        <w:shd w:fill="F2F2F2" w:color="auto" w:val="clear"/>
+        <w:spacing w:after="0" w:before="0" w:line="240"/>
+        <w:ind w:left="144" w:right="144"/>
+      </w:pPr>
+      <w:r>
+        <w:rPr>
+          <w:rFonts w:ascii="Consolas" w:cs="Consolas" w:eastAsia="Consolas" w:hAnsi="Consolas"/>
+          <w:sz w:val="17"/>
+          <w:szCs w:val="17"/>
+        </w:rPr>
+        <w:t xml:space="preserve">--- Test: lower-case command (commands are case-insensitive)</w:t>
+      </w:r>
+    </w:p>
+    <w:p>
+      <w:pPr>
+        <w:keepNext/>
+        <w:keepLines/>
+        <w:pBdr>
+          <w:left w:val="single" w:color="A6A6A6" w:sz="12" w:space="6"/>
+        </w:pBdr>
+        <w:shd w:fill="F2F2F2" w:color="auto" w:val="clear"/>
+        <w:spacing w:after="0" w:before="0" w:line="240"/>
+        <w:ind w:left="144" w:right="144"/>
+      </w:pPr>
+      <w:r>
+        <w:rPr>
+          <w:rFonts w:ascii="Consolas" w:cs="Consolas" w:eastAsia="Consolas" w:hAnsi="Consolas"/>
+          <w:sz w:val="17"/>
+          <w:szCs w:val="17"/>
+        </w:rPr>
+        <w:t xml:space="preserve">SEND b'query zzzzqx\n'</w:t>
+      </w:r>
+    </w:p>
+    <w:p>
+      <w:pPr>
+        <w:keepNext/>
+        <w:keepLines/>
+        <w:pBdr>
+          <w:left w:val="single" w:color="A6A6A6" w:sz="12" w:space="6"/>
+        </w:pBdr>
+        <w:shd w:fill="F2F2F2" w:color="auto" w:val="clear"/>
+        <w:spacing w:after="0" w:before="0" w:line="240"/>
+        <w:ind w:left="144" w:right="144"/>
+      </w:pPr>
+      <w:r>
+        <w:rPr>
+          <w:rFonts w:ascii="Consolas" w:cs="Consolas" w:eastAsia="Consolas" w:hAnsi="Consolas"/>
+          <w:sz w:val="17"/>
+          <w:szCs w:val="17"/>
+        </w:rPr>
+        <w:t xml:space="preserve">RECV 404 NOT_FOUND 0</w:t>
+      </w:r>
+    </w:p>
+    <w:p>
+      <w:pPr>
+        <w:keepNext/>
+        <w:keepLines/>
+        <w:pBdr>
+          <w:left w:val="single" w:color="A6A6A6" w:sz="12" w:space="6"/>
+        </w:pBdr>
+        <w:shd w:fill="F2F2F2" w:color="auto" w:val="clear"/>
+        <w:spacing w:after="0" w:before="0" w:line="240"/>
+        <w:ind w:left="144" w:right="144"/>
+      </w:pPr>
+      <w:r>
+        <w:rPr>
+          <w:rFonts w:ascii="Consolas" w:cs="Consolas" w:eastAsia="Consolas" w:hAnsi="Consolas"/>
+          <w:sz w:val="17"/>
+          <w:szCs w:val="17"/>
+        </w:rPr>
+        <w:t xml:space="preserve">--- Test: 2000-character line</w:t>
+      </w:r>
+    </w:p>
+    <w:p>
+      <w:pPr>
+        <w:keepNext/>
+        <w:keepLines/>
+        <w:pBdr>
+          <w:left w:val="single" w:color="A6A6A6" w:sz="12" w:space="6"/>
+        </w:pBdr>
+        <w:shd w:fill="F2F2F2" w:color="auto" w:val="clear"/>
+        <w:spacing w:after="0" w:before="0" w:line="240"/>
+        <w:ind w:left="144" w:right="144"/>
+      </w:pPr>
+      <w:r>
+        <w:rPr>
+          <w:rFonts w:ascii="Consolas" w:cs="Consolas" w:eastAsia="Consolas" w:hAnsi="Consolas"/>
+          <w:sz w:val="17"/>
+          <w:szCs w:val="17"/>
+        </w:rPr>
+        <w:t xml:space="preserve">SEND b'QUERY aaaaaaaaaaaaaa...(2007 bytes)'</w:t>
+      </w:r>
+    </w:p>
+    <w:p>
+      <w:pPr>
+        <w:keepNext/>
+        <w:keepLines/>
+        <w:pBdr>
+          <w:left w:val="single" w:color="A6A6A6" w:sz="12" w:space="6"/>
+        </w:pBdr>
+        <w:shd w:fill="F2F2F2" w:color="auto" w:val="clear"/>
+        <w:spacing w:after="0" w:before="0" w:line="240"/>
+        <w:ind w:left="144" w:right="144"/>
+      </w:pPr>
+      <w:r>
+        <w:rPr>
+          <w:rFonts w:ascii="Consolas" w:cs="Consolas" w:eastAsia="Consolas" w:hAnsi="Consolas"/>
+          <w:sz w:val="17"/>
+          <w:szCs w:val="17"/>
+        </w:rPr>
+        <w:t xml:space="preserve">RECV 400 BAD_REQUEST 0</w:t>
+      </w:r>
+    </w:p>
+    <w:p>
+      <w:pPr>
+        <w:keepNext w:val="false"/>
+        <w:keepLines/>
+        <w:pBdr>
+          <w:bottom w:val="single" w:color="F2F2F2" w:sz="2" w:space="4"/>
+          <w:left w:val="single" w:color="A6A6A6" w:sz="12" w:space="6"/>
+        </w:pBdr>
+        <w:shd w:fill="F2F2F2" w:color="auto" w:val="clear"/>
+        <w:spacing w:after="0" w:before="0" w:line="240"/>
+        <w:ind w:left="144" w:right="144"/>
+      </w:pPr>
+      <w:r>
+        <w:rPr>
+          <w:rFonts w:ascii="Consolas" w:cs="Consolas" w:eastAsia="Consolas" w:hAnsi="Consolas"/>
+          <w:sz w:val="17"/>
+          <w:szCs w:val="17"/>
+        </w:rPr>
+        <w:t xml:space="preserve">server closed connection: True</w:t>
+      </w:r>
+    </w:p>
+    <w:p>
+      <w:pPr>
+        <w:spacing w:after="80"/>
+      </w:pPr>
+    </w:p>
+    <w:p>
+      <w:pPr>
+        <w:keepNext/>
+        <w:spacing w:after="120"/>
+      </w:pPr>
+      <w:r>
+        <w:t xml:space="preserve">Matching server log lines:</w:t>
+      </w:r>
+    </w:p>
+    <w:p>
+      <w:pPr>
+        <w:keepNext/>
+        <w:keepLines/>
+        <w:pBdr>
+          <w:top w:val="single" w:color="F2F2F2" w:sz="2" w:space="4"/>
+          <w:left w:val="single" w:color="A6A6A6" w:sz="12" w:space="6"/>
+        </w:pBdr>
+        <w:shd w:fill="F2F2F2" w:color="auto" w:val="clear"/>
+        <w:spacing w:after="0" w:before="0" w:line="240"/>
+        <w:ind w:left="144" w:right="144"/>
+      </w:pPr>
+      <w:r>
+        <w:rPr>
+          <w:rFonts w:ascii="Consolas" w:cs="Consolas" w:eastAsia="Consolas" w:hAnsi="Consolas"/>
+          <w:sz w:val="17"/>
+          <w:szCs w:val="17"/>
+        </w:rPr>
+        <w:t xml:space="preserve">Server connected by ('127.0.0.1', 58870) at Fri Oct 16 00:14:38 2026</w:t>
+      </w:r>
+    </w:p>
+    <w:p>
+      <w:pPr>
+        <w:keepNext/>
+        <w:keepLines/>
+        <w:pBdr>
+          <w:left w:val="single" w:color="A6A6A6" w:sz="12" w:space="6"/>
+        </w:pBdr>
+        <w:shd w:fill="F2F2F2" w:color="auto" w:val="clear"/>
+        <w:spacing w:after="0" w:before="0" w:line="240"/>
+        <w:ind w:left="144" w:right="144"/>
+      </w:pPr>
+      <w:r>
+        <w:rPr>
+          <w:rFonts w:ascii="Consolas" w:cs="Consolas" w:eastAsia="Consolas" w:hAnsi="Consolas"/>
+          <w:sz w:val="17"/>
+          <w:szCs w:val="17"/>
+        </w:rPr>
+        <w:t xml:space="preserve">('127.0.0.1', 58870)  b'QUERY\n' -&gt; 400 BAD_REQUEST 0</w:t>
+      </w:r>
+    </w:p>
+    <w:p>
+      <w:pPr>
+        <w:keepNext/>
+        <w:keepLines/>
+        <w:pBdr>
+          <w:left w:val="single" w:color="A6A6A6" w:sz="12" w:space="6"/>
+        </w:pBdr>
+        <w:shd w:fill="F2F2F2" w:color="auto" w:val="clear"/>
+        <w:spacing w:after="0" w:before="0" w:line="240"/>
+        <w:ind w:left="144" w:right="144"/>
+      </w:pPr>
+      <w:r>
+        <w:rPr>
+          <w:rFonts w:ascii="Consolas" w:cs="Consolas" w:eastAsia="Consolas" w:hAnsi="Consolas"/>
+          <w:sz w:val="17"/>
+          <w:szCs w:val="17"/>
+        </w:rPr>
+        <w:t xml:space="preserve">('127.0.0.1', 58870)  b'QUERY    \n' -&gt; 400 BAD_REQUEST 0</w:t>
+      </w:r>
+    </w:p>
+    <w:p>
+      <w:pPr>
+        <w:keepNext/>
+        <w:keepLines/>
+        <w:pBdr>
+          <w:left w:val="single" w:color="A6A6A6" w:sz="12" w:space="6"/>
+        </w:pBdr>
+        <w:shd w:fill="F2F2F2" w:color="auto" w:val="clear"/>
+        <w:spacing w:after="0" w:before="0" w:line="240"/>
+        <w:ind w:left="144" w:right="144"/>
+      </w:pPr>
+      <w:r>
+        <w:rPr>
+          <w:rFonts w:ascii="Consolas" w:cs="Consolas" w:eastAsia="Consolas" w:hAnsi="Consolas"/>
+          <w:sz w:val="17"/>
+          <w:szCs w:val="17"/>
+        </w:rPr>
+        <w:t xml:space="preserve">('127.0.0.1', 58870)  b'FIND a?t\n' -&gt; 400 BAD_REQUEST 0</w:t>
+      </w:r>
+    </w:p>
+    <w:p>
+      <w:pPr>
+        <w:keepNext/>
+        <w:keepLines/>
+        <w:pBdr>
+          <w:left w:val="single" w:color="A6A6A6" w:sz="12" w:space="6"/>
+        </w:pBdr>
+        <w:shd w:fill="F2F2F2" w:color="auto" w:val="clear"/>
+        <w:spacing w:after="0" w:before="0" w:line="240"/>
+        <w:ind w:left="144" w:right="144"/>
+      </w:pPr>
+      <w:r>
+        <w:rPr>
+          <w:rFonts w:ascii="Consolas" w:cs="Consolas" w:eastAsia="Consolas" w:hAnsi="Consolas"/>
+          <w:sz w:val="17"/>
+          <w:szCs w:val="17"/>
+        </w:rPr>
+        <w:t xml:space="preserve">('127.0.0.1', 58870)  b'QUERY -?-\n' -&gt; 200 OK 13</w:t>
+      </w:r>
+    </w:p>
+    <w:p>
+      <w:pPr>
+        <w:keepNext/>
+        <w:keepLines/>
+        <w:pBdr>
+          <w:left w:val="single" w:color="A6A6A6" w:sz="12" w:space="6"/>
+        </w:pBdr>
+        <w:shd w:fill="F2F2F2" w:color="auto" w:val="clear"/>
+        <w:spacing w:after="0" w:before="0" w:line="240"/>
+        <w:ind w:left="144" w:right="144"/>
+      </w:pPr>
+      <w:r>
+        <w:rPr>
+          <w:rFonts w:ascii="Consolas" w:cs="Consolas" w:eastAsia="Consolas" w:hAnsi="Consolas"/>
+          <w:sz w:val="17"/>
+          <w:szCs w:val="17"/>
+        </w:rPr>
+        <w:t xml:space="preserve">('127.0.0.1', 58870)  b'query zzzzqx\n' -&gt; 404 NOT_FOUND 0</w:t>
+      </w:r>
+    </w:p>
+    <w:p>
+      <w:pPr>
+        <w:keepNext/>
+        <w:keepLines/>
+        <w:pBdr>
+          <w:left w:val="single" w:color="A6A6A6" w:sz="12" w:space="6"/>
+        </w:pBdr>
+        <w:shd w:fill="F2F2F2" w:color="auto" w:val="clear"/>
+        <w:spacing w:after="0" w:before="0" w:line="240"/>
+        <w:ind w:left="144" w:right="144"/>
+      </w:pPr>
+      <w:r>
+        <w:rPr>
+          <w:rFonts w:ascii="Consolas" w:cs="Consolas" w:eastAsia="Consolas" w:hAnsi="Consolas"/>
+          <w:sz w:val="17"/>
+          <w:szCs w:val="17"/>
+        </w:rPr>
+        <w:t xml:space="preserve">('127.0.0.1', 58870)  b'QUERY aaaaaaaaaaaaaaaaaaaaaaaaaa...' -&gt; 400 BAD_REQUEST 0</w:t>
+      </w:r>
+    </w:p>
+    <w:p>
+      <w:pPr>
+        <w:keepNext w:val="false"/>
+        <w:keepLines/>
+        <w:pBdr>
+          <w:bottom w:val="single" w:color="F2F2F2" w:sz="2" w:space="4"/>
+          <w:left w:val="single" w:color="A6A6A6" w:sz="12" w:space="6"/>
+        </w:pBdr>
+        <w:shd w:fill="F2F2F2" w:color="auto" w:val="clear"/>
+        <w:spacing w:after="0" w:before="0" w:line="240"/>
+        <w:ind w:left="144" w:right="144"/>
+      </w:pPr>
+      <w:r>
+        <w:rPr>
+          <w:rFonts w:ascii="Consolas" w:cs="Consolas" w:eastAsia="Consolas" w:hAnsi="Consolas"/>
+          <w:sz w:val="17"/>
+          <w:szCs w:val="17"/>
+        </w:rPr>
+        <w:t xml:space="preserve">Client ('127.0.0.1', 58870) finished at Fri Oct 16 00:14:38 2026</w:t>
+      </w:r>
+    </w:p>
+    <w:p>
+      <w:pPr>
+        <w:spacing w:after="80"/>
+      </w:pPr>
+    </w:p>
+    <w:p>
+      <w:pPr>
+        <w:keepNext/>
+        <w:spacing w:after="40" w:before="60"/>
+        <w:jc w:val="center"/>
+      </w:pPr>
+      <w:r>
+        <w:drawing>
+          <wp:inline distT="0" distB="0" distL="0" distR="0">
+            <wp:extent cx="2886075" cy="3533775"/>
+            <wp:effectExtent t="0" r="0" b="0" l="0"/>
+            <wp:docPr id="1" name="11.png" descr="Screenshot: test_raw_protocol.py output" title="test_raw_protocol.py output"/>
+            <wp:cNvGraphicFramePr>
+              <a:graphicFrameLocks xmlns:a="http://schemas.openxmlformats.org/drawingml/2006/main" noChangeAspect="1"/>
+            </wp:cNvGraphicFramePr>
+            <a:graphic xmlns:a="http://schemas.openxmlformats.org/drawingml/2006/main">
+              <a:graphicData uri="http://schemas.openxmlformats.org/drawingml/2006/picture">
+                <pic:pic xmlns:pic="http://schemas.openxmlformats.org/drawingml/2006/picture">
+                  <pic:nvPicPr>
+                    <pic:cNvPr id="0" name="" descr=""/>
+                    <pic:cNvPicPr>
+                      <a:picLocks noChangeAspect="1" noChangeArrowheads="1"/>
+                    </pic:cNvPicPr>
+                  </pic:nvPicPr>
+                  <pic:blipFill>
+                    <a:blip r:embed="rId18" cstate="none"/>
+                    <a:srcRect/>
+                    <a:stretch>
+                      <a:fillRect/>
+                    </a:stretch>
+                  </pic:blipFill>
+                  <pic:spPr bwMode="auto">
+                    <a:xfrm>
+                      <a:off x="0" y="0"/>
+                      <a:ext cx="2886075" cy="3533775"/>
+                    </a:xfrm>
+                    <a:prstGeom prst="rect">
+                      <a:avLst/>
+                    </a:prstGeom>
+                  </pic:spPr>
+                </pic:pic>
+              </a:graphicData>
+            </a:graphic>
+          </wp:inline>
+        </w:drawing>
+      </w:r>
+    </w:p>
+    <w:p>
+      <w:pPr>
+        <w:spacing w:after="200"/>
+        <w:jc w:val="center"/>
+      </w:pPr>
+      <w:r>
+        <w:rPr>
+          <w:i/>
+          <w:iCs/>
+          <w:color w:val="595959"/>
+          <w:sz w:val="18"/>
+          <w:szCs w:val="18"/>
+        </w:rPr>
+        <w:t xml:space="preserve">Screenshot (Windows 11): test_raw_protocol.py output</w:t>
+      </w:r>
+    </w:p>
+    <w:p>
+      <w:pPr>
+        <w:pStyle w:val="Heading2"/>
+      </w:pPr>
+      <w:r>
+        <w:t xml:space="preserve">4.5 Two clients at the same time</w:t>
+      </w:r>
+    </w:p>
+    <w:p>
+      <w:pPr>
+        <w:keepNext/>
+        <w:spacing w:after="120"/>
       </w:pPr>
       <w:r>
         <w:rPr>
           <w:b/>
           <w:bCs/>
-          <w:color w:val="C00000"/>
-        </w:rPr>
-        <w:t xml:space="preserve">[SCREENSHOT PLACEHOLDER: basic_server terminal]</w:t>
-      </w:r>
-    </w:p>
-    <w:p>
-      <w:pPr>
-        <w:pStyle w:val="Heading2"/>
-      </w:pPr>
-      <w:r>
-        <w:t xml:space="preserve">4.3 Multi-threaded client: several queries on one connection</w:t>
-      </w:r>
-    </w:p>
-    <w:p>
-      <w:pPr>
-        <w:keepNext/>
-        <w:spacing w:after="120"/>
-      </w:pPr>
-      <w:r>
-        <w:t xml:space="preserve">Test 9 sends the four required queries plus </w:t>
+        </w:rPr>
+        <w:t xml:space="preserve">Test 15, multi-threaded server.</w:t>
+      </w:r>
+      <w:r>
+        <w:t xml:space="preserve"> Client A connects, queries </w:t>
       </w:r>
       <w:r>
         <w:rPr>
@@ -9537,10 +11357,10 @@
           <w:sz w:val="19"/>
           <w:szCs w:val="19"/>
         </w:rPr>
-        <w:t xml:space="preserve">a?t</w:t>
-      </w:r>
-      <w:r>
-        <w:t xml:space="preserve">, </w:t>
+        <w:t xml:space="preserve">-?-</w:t>
+      </w:r>
+      <w:r>
+        <w:t xml:space="preserve">, then stays idle for 6 s. One second later client B connects, queries </w:t>
       </w:r>
       <w:r>
         <w:rPr>
@@ -9548,10 +11368,10 @@
           <w:sz w:val="19"/>
           <w:szCs w:val="19"/>
         </w:rPr>
-        <w:t xml:space="preserve">zzzzqx</w:t>
-      </w:r>
-      <w:r>
-        <w:t xml:space="preserve">, an empty line (ignored) and </w:t>
+        <w:t xml:space="preserve">?(a)</w:t>
+      </w:r>
+      <w:r>
+        <w:t xml:space="preserve"> and </w:t>
       </w:r>
       <w:r>
         <w:rPr>
@@ -9559,10 +11379,10 @@
           <w:sz w:val="19"/>
           <w:szCs w:val="19"/>
         </w:rPr>
-        <w:t xml:space="preserve">quit</w:t>
-      </w:r>
-      <w:r>
-        <w:t xml:space="preserve"> on one connection (</w:t>
+        <w:t xml:space="preserve">zzzzqx</w:t>
+      </w:r>
+      <w:r>
+        <w:t xml:space="preserve"> and quits, all while A is still connected (</w:t>
       </w:r>
       <w:r>
         <w:rPr>
@@ -9570,10 +11390,10 @@
           <w:sz w:val="19"/>
           <w:szCs w:val="19"/>
         </w:rPr>
-        <w:t xml:space="preserve">logs/mt_client_session.txt</w:t>
-      </w:r>
-      <w:r>
-        <w:t xml:space="preserve">). Status lines from that run:</w:t>
+        <w:t xml:space="preserve">logs/mt_two_clients.txt</w:t>
+      </w:r>
+      <w:r>
+        <w:t xml:space="preserve">):</w:t>
       </w:r>
     </w:p>
     <w:p>
@@ -9594,267 +11414,47 @@
           <w:sz w:val="17"/>
           <w:szCs w:val="17"/>
         </w:rPr>
-        <w:t xml:space="preserve">$ python3 mt_client.py   (typed one per line: ??????????, ?, ?(a), -?-, a?t, zzzzqx, &lt;empty&gt;, quit)</w:t>
-      </w:r>
-    </w:p>
-    <w:p>
-      <w:pPr>
-        <w:keepNext/>
-        <w:keepLines/>
-        <w:pBdr>
-          <w:left w:val="single" w:color="A6A6A6" w:sz="12" w:space="6"/>
-        </w:pBdr>
-        <w:shd w:fill="F2F2F2" w:color="auto" w:val="clear"/>
-        <w:spacing w:after="0" w:before="0" w:line="240"/>
-        <w:ind w:left="144" w:right="144"/>
-      </w:pPr>
-      <w:r>
-        <w:rPr>
-          <w:rFonts w:ascii="Consolas" w:cs="Consolas" w:eastAsia="Consolas" w:hAnsi="Consolas"/>
-          <w:sz w:val="17"/>
-          <w:szCs w:val="17"/>
-        </w:rPr>
-        <w:t xml:space="preserve">Connected to 127.0.0.1:12000</w:t>
-      </w:r>
-    </w:p>
-    <w:p>
-      <w:pPr>
-        <w:keepNext/>
-        <w:keepLines/>
-        <w:pBdr>
-          <w:left w:val="single" w:color="A6A6A6" w:sz="12" w:space="6"/>
-        </w:pBdr>
-        <w:shd w:fill="F2F2F2" w:color="auto" w:val="clear"/>
-        <w:spacing w:after="0" w:before="0" w:line="240"/>
-        <w:ind w:left="144" w:right="144"/>
-      </w:pPr>
-      <w:r>
-        <w:rPr>
-          <w:rFonts w:ascii="Consolas" w:cs="Consolas" w:eastAsia="Consolas" w:hAnsi="Consolas"/>
-          <w:sz w:val="17"/>
-          <w:szCs w:val="17"/>
-        </w:rPr>
-        <w:t xml:space="preserve">Enter query (or 'quit'): Server replied: 200 OK</w:t>
-      </w:r>
-    </w:p>
-    <w:p>
-      <w:pPr>
-        <w:keepNext/>
-        <w:keepLines/>
-        <w:pBdr>
-          <w:left w:val="single" w:color="A6A6A6" w:sz="12" w:space="6"/>
-        </w:pBdr>
-        <w:shd w:fill="F2F2F2" w:color="auto" w:val="clear"/>
-        <w:spacing w:after="0" w:before="0" w:line="240"/>
-        <w:ind w:left="144" w:right="144"/>
-      </w:pPr>
-      <w:r>
-        <w:rPr>
-          <w:rFonts w:ascii="Consolas" w:cs="Consolas" w:eastAsia="Consolas" w:hAnsi="Consolas"/>
-          <w:sz w:val="17"/>
-          <w:szCs w:val="17"/>
-        </w:rPr>
-        <w:t xml:space="preserve">Number of matching words: 24071</w:t>
-      </w:r>
-    </w:p>
-    <w:p>
-      <w:pPr>
-        <w:keepNext/>
-        <w:keepLines/>
-        <w:pBdr>
-          <w:left w:val="single" w:color="A6A6A6" w:sz="12" w:space="6"/>
-        </w:pBdr>
-        <w:shd w:fill="F2F2F2" w:color="auto" w:val="clear"/>
-        <w:spacing w:after="0" w:before="0" w:line="240"/>
-        <w:ind w:left="144" w:right="144"/>
-      </w:pPr>
-      <w:r>
-        <w:rPr>
-          <w:rFonts w:ascii="Consolas" w:cs="Consolas" w:eastAsia="Consolas" w:hAnsi="Consolas"/>
-          <w:sz w:val="17"/>
-          <w:szCs w:val="17"/>
-        </w:rPr>
-        <w:t xml:space="preserve">Enter query (or 'quit'): Server replied: 200 OK</w:t>
-      </w:r>
-    </w:p>
-    <w:p>
-      <w:pPr>
-        <w:keepNext/>
-        <w:keepLines/>
-        <w:pBdr>
-          <w:left w:val="single" w:color="A6A6A6" w:sz="12" w:space="6"/>
-        </w:pBdr>
-        <w:shd w:fill="F2F2F2" w:color="auto" w:val="clear"/>
-        <w:spacing w:after="0" w:before="0" w:line="240"/>
-        <w:ind w:left="144" w:right="144"/>
-      </w:pPr>
-      <w:r>
-        <w:rPr>
-          <w:rFonts w:ascii="Consolas" w:cs="Consolas" w:eastAsia="Consolas" w:hAnsi="Consolas"/>
-          <w:sz w:val="17"/>
-          <w:szCs w:val="17"/>
-        </w:rPr>
-        <w:t xml:space="preserve">Number of matching words: 69903</w:t>
-      </w:r>
-    </w:p>
-    <w:p>
-      <w:pPr>
-        <w:keepNext/>
-        <w:keepLines/>
-        <w:pBdr>
-          <w:left w:val="single" w:color="A6A6A6" w:sz="12" w:space="6"/>
-        </w:pBdr>
-        <w:shd w:fill="F2F2F2" w:color="auto" w:val="clear"/>
-        <w:spacing w:after="0" w:before="0" w:line="240"/>
-        <w:ind w:left="144" w:right="144"/>
-      </w:pPr>
-      <w:r>
-        <w:rPr>
-          <w:rFonts w:ascii="Consolas" w:cs="Consolas" w:eastAsia="Consolas" w:hAnsi="Consolas"/>
-          <w:sz w:val="17"/>
-          <w:szCs w:val="17"/>
-        </w:rPr>
-        <w:t xml:space="preserve">Enter query (or 'quit'): Server replied: 200 OK</w:t>
-      </w:r>
-    </w:p>
-    <w:p>
-      <w:pPr>
-        <w:keepNext/>
-        <w:keepLines/>
-        <w:pBdr>
-          <w:left w:val="single" w:color="A6A6A6" w:sz="12" w:space="6"/>
-        </w:pBdr>
-        <w:shd w:fill="F2F2F2" w:color="auto" w:val="clear"/>
-        <w:spacing w:after="0" w:before="0" w:line="240"/>
-        <w:ind w:left="144" w:right="144"/>
-      </w:pPr>
-      <w:r>
-        <w:rPr>
-          <w:rFonts w:ascii="Consolas" w:cs="Consolas" w:eastAsia="Consolas" w:hAnsi="Consolas"/>
-          <w:sz w:val="17"/>
-          <w:szCs w:val="17"/>
-        </w:rPr>
-        <w:t xml:space="preserve">Number of matching words: 414</w:t>
-      </w:r>
-    </w:p>
-    <w:p>
-      <w:pPr>
-        <w:keepNext/>
-        <w:keepLines/>
-        <w:pBdr>
-          <w:left w:val="single" w:color="A6A6A6" w:sz="12" w:space="6"/>
-        </w:pBdr>
-        <w:shd w:fill="F2F2F2" w:color="auto" w:val="clear"/>
-        <w:spacing w:after="0" w:before="0" w:line="240"/>
-        <w:ind w:left="144" w:right="144"/>
-      </w:pPr>
-      <w:r>
-        <w:rPr>
-          <w:rFonts w:ascii="Consolas" w:cs="Consolas" w:eastAsia="Consolas" w:hAnsi="Consolas"/>
-          <w:sz w:val="17"/>
-          <w:szCs w:val="17"/>
-        </w:rPr>
-        <w:t xml:space="preserve">Enter query (or 'quit'): Server replied: 200 OK</w:t>
-      </w:r>
-    </w:p>
-    <w:p>
-      <w:pPr>
-        <w:keepNext/>
-        <w:keepLines/>
-        <w:pBdr>
-          <w:left w:val="single" w:color="A6A6A6" w:sz="12" w:space="6"/>
-        </w:pBdr>
-        <w:shd w:fill="F2F2F2" w:color="auto" w:val="clear"/>
-        <w:spacing w:after="0" w:before="0" w:line="240"/>
-        <w:ind w:left="144" w:right="144"/>
-      </w:pPr>
-      <w:r>
-        <w:rPr>
-          <w:rFonts w:ascii="Consolas" w:cs="Consolas" w:eastAsia="Consolas" w:hAnsi="Consolas"/>
-          <w:sz w:val="17"/>
-          <w:szCs w:val="17"/>
-        </w:rPr>
-        <w:t xml:space="preserve">Number of matching words: 13</w:t>
-      </w:r>
-    </w:p>
-    <w:p>
-      <w:pPr>
-        <w:keepNext/>
-        <w:keepLines/>
-        <w:pBdr>
-          <w:left w:val="single" w:color="A6A6A6" w:sz="12" w:space="6"/>
-        </w:pBdr>
-        <w:shd w:fill="F2F2F2" w:color="auto" w:val="clear"/>
-        <w:spacing w:after="0" w:before="0" w:line="240"/>
-        <w:ind w:left="144" w:right="144"/>
-      </w:pPr>
-      <w:r>
-        <w:rPr>
-          <w:rFonts w:ascii="Consolas" w:cs="Consolas" w:eastAsia="Consolas" w:hAnsi="Consolas"/>
-          <w:sz w:val="17"/>
-          <w:szCs w:val="17"/>
-        </w:rPr>
-        <w:t xml:space="preserve">Enter query (or 'quit'): Server replied: 200 OK</w:t>
-      </w:r>
-    </w:p>
-    <w:p>
-      <w:pPr>
-        <w:keepNext/>
-        <w:keepLines/>
-        <w:pBdr>
-          <w:left w:val="single" w:color="A6A6A6" w:sz="12" w:space="6"/>
-        </w:pBdr>
-        <w:shd w:fill="F2F2F2" w:color="auto" w:val="clear"/>
-        <w:spacing w:after="0" w:before="0" w:line="240"/>
-        <w:ind w:left="144" w:right="144"/>
-      </w:pPr>
-      <w:r>
-        <w:rPr>
-          <w:rFonts w:ascii="Consolas" w:cs="Consolas" w:eastAsia="Consolas" w:hAnsi="Consolas"/>
-          <w:sz w:val="17"/>
-          <w:szCs w:val="17"/>
-        </w:rPr>
-        <w:t xml:space="preserve">Number of matching words: 4260</w:t>
-      </w:r>
-    </w:p>
-    <w:p>
-      <w:pPr>
-        <w:keepNext/>
-        <w:keepLines/>
-        <w:pBdr>
-          <w:left w:val="single" w:color="A6A6A6" w:sz="12" w:space="6"/>
-        </w:pBdr>
-        <w:shd w:fill="F2F2F2" w:color="auto" w:val="clear"/>
-        <w:spacing w:after="0" w:before="0" w:line="240"/>
-        <w:ind w:left="144" w:right="144"/>
-      </w:pPr>
-      <w:r>
-        <w:rPr>
-          <w:rFonts w:ascii="Consolas" w:cs="Consolas" w:eastAsia="Consolas" w:hAnsi="Consolas"/>
-          <w:sz w:val="17"/>
-          <w:szCs w:val="17"/>
-        </w:rPr>
-        <w:t xml:space="preserve">Enter query (or 'quit'): Server replied: 404 NOT_FOUND</w:t>
-      </w:r>
-    </w:p>
-    <w:p>
-      <w:pPr>
-        <w:keepNext/>
-        <w:keepLines/>
-        <w:pBdr>
-          <w:left w:val="single" w:color="A6A6A6" w:sz="12" w:space="6"/>
-        </w:pBdr>
-        <w:shd w:fill="F2F2F2" w:color="auto" w:val="clear"/>
-        <w:spacing w:after="0" w:before="0" w:line="240"/>
-        <w:ind w:left="144" w:right="144"/>
-      </w:pPr>
-      <w:r>
-        <w:rPr>
-          <w:rFonts w:ascii="Consolas" w:cs="Consolas" w:eastAsia="Consolas" w:hAnsi="Consolas"/>
-          <w:sz w:val="17"/>
-          <w:szCs w:val="17"/>
-        </w:rPr>
-        <w:t xml:space="preserve">Number of matching words: 0</w:t>
+        <w:t xml:space="preserve">[00:14:32] client A connects to MT server, queries -?-, then stays idle 6 s</w:t>
+      </w:r>
+    </w:p>
+    <w:p>
+      <w:pPr>
+        <w:keepNext/>
+        <w:keepLines/>
+        <w:pBdr>
+          <w:left w:val="single" w:color="A6A6A6" w:sz="12" w:space="6"/>
+        </w:pBdr>
+        <w:shd w:fill="F2F2F2" w:color="auto" w:val="clear"/>
+        <w:spacing w:after="0" w:before="0" w:line="240"/>
+        <w:ind w:left="144" w:right="144"/>
+      </w:pPr>
+      <w:r>
+        <w:rPr>
+          <w:rFonts w:ascii="Consolas" w:cs="Consolas" w:eastAsia="Consolas" w:hAnsi="Consolas"/>
+          <w:sz w:val="17"/>
+          <w:szCs w:val="17"/>
+        </w:rPr>
+        <w:t xml:space="preserve">[00:14:33] client B connects while A is still connected</w:t>
+      </w:r>
+    </w:p>
+    <w:p>
+      <w:pPr>
+        <w:keepNext/>
+        <w:keepLines/>
+        <w:pBdr>
+          <w:left w:val="single" w:color="A6A6A6" w:sz="12" w:space="6"/>
+        </w:pBdr>
+        <w:shd w:fill="F2F2F2" w:color="auto" w:val="clear"/>
+        <w:spacing w:after="0" w:before="0" w:line="240"/>
+        <w:ind w:left="144" w:right="144"/>
+      </w:pPr>
+      <w:r>
+        <w:rPr>
+          <w:rFonts w:ascii="Consolas" w:cs="Consolas" w:eastAsia="Consolas" w:hAnsi="Consolas"/>
+          <w:sz w:val="17"/>
+          <w:szCs w:val="17"/>
+        </w:rPr>
+        <w:t xml:space="preserve">[00:14:33] client B finished (A still connected)</w:t>
       </w:r>
     </w:p>
     <w:p>
@@ -9875,7 +11475,7 @@
           <w:sz w:val="17"/>
           <w:szCs w:val="17"/>
         </w:rPr>
-        <w:t xml:space="preserve">Enter query (or 'quit'): Server replied: 200 BYE</w:t>
+        <w:t xml:space="preserve">[00:14:38] client A finished</w:t>
       </w:r>
     </w:p>
     <w:p>
@@ -9889,7 +11489,273 @@
         <w:spacing w:after="120"/>
       </w:pPr>
       <w:r>
-        <w:t xml:space="preserve">Server log for this session (</w:t>
+        <w:t xml:space="preserve">The server log shows the two connections overlapping: B (port 34860) is accepted and served while A (port 34852) is still open, and A finishes last:</w:t>
+      </w:r>
+    </w:p>
+    <w:p>
+      <w:pPr>
+        <w:keepNext/>
+        <w:keepLines/>
+        <w:pBdr>
+          <w:top w:val="single" w:color="F2F2F2" w:sz="2" w:space="4"/>
+          <w:left w:val="single" w:color="A6A6A6" w:sz="12" w:space="6"/>
+        </w:pBdr>
+        <w:shd w:fill="F2F2F2" w:color="auto" w:val="clear"/>
+        <w:spacing w:after="0" w:before="0" w:line="240"/>
+        <w:ind w:left="144" w:right="144"/>
+      </w:pPr>
+      <w:r>
+        <w:rPr>
+          <w:rFonts w:ascii="Consolas" w:cs="Consolas" w:eastAsia="Consolas" w:hAnsi="Consolas"/>
+          <w:sz w:val="17"/>
+          <w:szCs w:val="17"/>
+        </w:rPr>
+        <w:t xml:space="preserve">Server connected by ('127.0.0.1', 34852) at Fri Oct 16 00:14:32 2026</w:t>
+      </w:r>
+    </w:p>
+    <w:p>
+      <w:pPr>
+        <w:keepNext/>
+        <w:keepLines/>
+        <w:pBdr>
+          <w:left w:val="single" w:color="A6A6A6" w:sz="12" w:space="6"/>
+        </w:pBdr>
+        <w:shd w:fill="F2F2F2" w:color="auto" w:val="clear"/>
+        <w:spacing w:after="0" w:before="0" w:line="240"/>
+        <w:ind w:left="144" w:right="144"/>
+      </w:pPr>
+      <w:r>
+        <w:rPr>
+          <w:rFonts w:ascii="Consolas" w:cs="Consolas" w:eastAsia="Consolas" w:hAnsi="Consolas"/>
+          <w:sz w:val="17"/>
+          <w:szCs w:val="17"/>
+        </w:rPr>
+        <w:t xml:space="preserve">('127.0.0.1', 34852)  b'QUERY -?-\n' -&gt; 200 OK 13</w:t>
+      </w:r>
+    </w:p>
+    <w:p>
+      <w:pPr>
+        <w:keepNext/>
+        <w:keepLines/>
+        <w:pBdr>
+          <w:left w:val="single" w:color="A6A6A6" w:sz="12" w:space="6"/>
+        </w:pBdr>
+        <w:shd w:fill="F2F2F2" w:color="auto" w:val="clear"/>
+        <w:spacing w:after="0" w:before="0" w:line="240"/>
+        <w:ind w:left="144" w:right="144"/>
+      </w:pPr>
+      <w:r>
+        <w:rPr>
+          <w:rFonts w:ascii="Consolas" w:cs="Consolas" w:eastAsia="Consolas" w:hAnsi="Consolas"/>
+          <w:sz w:val="17"/>
+          <w:szCs w:val="17"/>
+        </w:rPr>
+        <w:t xml:space="preserve">Server connected by ('127.0.0.1', 34860) at Fri Oct 16 00:14:33 2026</w:t>
+      </w:r>
+    </w:p>
+    <w:p>
+      <w:pPr>
+        <w:keepNext/>
+        <w:keepLines/>
+        <w:pBdr>
+          <w:left w:val="single" w:color="A6A6A6" w:sz="12" w:space="6"/>
+        </w:pBdr>
+        <w:shd w:fill="F2F2F2" w:color="auto" w:val="clear"/>
+        <w:spacing w:after="0" w:before="0" w:line="240"/>
+        <w:ind w:left="144" w:right="144"/>
+      </w:pPr>
+      <w:r>
+        <w:rPr>
+          <w:rFonts w:ascii="Consolas" w:cs="Consolas" w:eastAsia="Consolas" w:hAnsi="Consolas"/>
+          <w:sz w:val="17"/>
+          <w:szCs w:val="17"/>
+        </w:rPr>
+        <w:t xml:space="preserve">('127.0.0.1', 34860)  b'QUERY ?(a)\n' -&gt; 200 OK 414</w:t>
+      </w:r>
+    </w:p>
+    <w:p>
+      <w:pPr>
+        <w:keepNext/>
+        <w:keepLines/>
+        <w:pBdr>
+          <w:left w:val="single" w:color="A6A6A6" w:sz="12" w:space="6"/>
+        </w:pBdr>
+        <w:shd w:fill="F2F2F2" w:color="auto" w:val="clear"/>
+        <w:spacing w:after="0" w:before="0" w:line="240"/>
+        <w:ind w:left="144" w:right="144"/>
+      </w:pPr>
+      <w:r>
+        <w:rPr>
+          <w:rFonts w:ascii="Consolas" w:cs="Consolas" w:eastAsia="Consolas" w:hAnsi="Consolas"/>
+          <w:sz w:val="17"/>
+          <w:szCs w:val="17"/>
+        </w:rPr>
+        <w:t xml:space="preserve">('127.0.0.1', 34860)  b'QUERY zzzzqx\n' -&gt; 404 NOT_FOUND 0</w:t>
+      </w:r>
+    </w:p>
+    <w:p>
+      <w:pPr>
+        <w:keepNext/>
+        <w:keepLines/>
+        <w:pBdr>
+          <w:left w:val="single" w:color="A6A6A6" w:sz="12" w:space="6"/>
+        </w:pBdr>
+        <w:shd w:fill="F2F2F2" w:color="auto" w:val="clear"/>
+        <w:spacing w:after="0" w:before="0" w:line="240"/>
+        <w:ind w:left="144" w:right="144"/>
+      </w:pPr>
+      <w:r>
+        <w:rPr>
+          <w:rFonts w:ascii="Consolas" w:cs="Consolas" w:eastAsia="Consolas" w:hAnsi="Consolas"/>
+          <w:sz w:val="17"/>
+          <w:szCs w:val="17"/>
+        </w:rPr>
+        <w:t xml:space="preserve">('127.0.0.1', 34860)  b'QUIT\n' -&gt; 200 BYE 0</w:t>
+      </w:r>
+    </w:p>
+    <w:p>
+      <w:pPr>
+        <w:keepNext/>
+        <w:keepLines/>
+        <w:pBdr>
+          <w:left w:val="single" w:color="A6A6A6" w:sz="12" w:space="6"/>
+        </w:pBdr>
+        <w:shd w:fill="F2F2F2" w:color="auto" w:val="clear"/>
+        <w:spacing w:after="0" w:before="0" w:line="240"/>
+        <w:ind w:left="144" w:right="144"/>
+      </w:pPr>
+      <w:r>
+        <w:rPr>
+          <w:rFonts w:ascii="Consolas" w:cs="Consolas" w:eastAsia="Consolas" w:hAnsi="Consolas"/>
+          <w:sz w:val="17"/>
+          <w:szCs w:val="17"/>
+        </w:rPr>
+        <w:t xml:space="preserve">Client ('127.0.0.1', 34860) finished at Fri Oct 16 00:14:33 2026</w:t>
+      </w:r>
+    </w:p>
+    <w:p>
+      <w:pPr>
+        <w:keepNext/>
+        <w:keepLines/>
+        <w:pBdr>
+          <w:left w:val="single" w:color="A6A6A6" w:sz="12" w:space="6"/>
+        </w:pBdr>
+        <w:shd w:fill="F2F2F2" w:color="auto" w:val="clear"/>
+        <w:spacing w:after="0" w:before="0" w:line="240"/>
+        <w:ind w:left="144" w:right="144"/>
+      </w:pPr>
+      <w:r>
+        <w:rPr>
+          <w:rFonts w:ascii="Consolas" w:cs="Consolas" w:eastAsia="Consolas" w:hAnsi="Consolas"/>
+          <w:sz w:val="17"/>
+          <w:szCs w:val="17"/>
+        </w:rPr>
+        <w:t xml:space="preserve">('127.0.0.1', 34852)  b'QUIT\n' -&gt; 200 BYE 0</w:t>
+      </w:r>
+    </w:p>
+    <w:p>
+      <w:pPr>
+        <w:keepNext w:val="false"/>
+        <w:keepLines/>
+        <w:pBdr>
+          <w:bottom w:val="single" w:color="F2F2F2" w:sz="2" w:space="4"/>
+          <w:left w:val="single" w:color="A6A6A6" w:sz="12" w:space="6"/>
+        </w:pBdr>
+        <w:shd w:fill="F2F2F2" w:color="auto" w:val="clear"/>
+        <w:spacing w:after="0" w:before="0" w:line="240"/>
+        <w:ind w:left="144" w:right="144"/>
+      </w:pPr>
+      <w:r>
+        <w:rPr>
+          <w:rFonts w:ascii="Consolas" w:cs="Consolas" w:eastAsia="Consolas" w:hAnsi="Consolas"/>
+          <w:sz w:val="17"/>
+          <w:szCs w:val="17"/>
+        </w:rPr>
+        <w:t xml:space="preserve">Client ('127.0.0.1', 34852) finished at Fri Oct 16 00:14:38 2026</w:t>
+      </w:r>
+    </w:p>
+    <w:p>
+      <w:pPr>
+        <w:spacing w:after="80"/>
+      </w:pPr>
+    </w:p>
+    <w:p>
+      <w:pPr>
+        <w:keepNext/>
+        <w:spacing w:after="40" w:before="60"/>
+        <w:jc w:val="center"/>
+      </w:pPr>
+      <w:r>
+        <w:drawing>
+          <wp:inline distT="0" distB="0" distL="0" distR="0">
+            <wp:extent cx="5943600" cy="3724275"/>
+            <wp:effectExtent t="0" r="0" b="0" l="0"/>
+            <wp:docPr id="1" name="12.png" descr="Screenshot: three terminals: mt_server, client A idle, client B served" title="three terminals: mt_server, client A idle, client B served"/>
+            <wp:cNvGraphicFramePr>
+              <a:graphicFrameLocks xmlns:a="http://schemas.openxmlformats.org/drawingml/2006/main" noChangeAspect="1"/>
+            </wp:cNvGraphicFramePr>
+            <a:graphic xmlns:a="http://schemas.openxmlformats.org/drawingml/2006/main">
+              <a:graphicData uri="http://schemas.openxmlformats.org/drawingml/2006/picture">
+                <pic:pic xmlns:pic="http://schemas.openxmlformats.org/drawingml/2006/picture">
+                  <pic:nvPicPr>
+                    <pic:cNvPr id="0" name="" descr=""/>
+                    <pic:cNvPicPr>
+                      <a:picLocks noChangeAspect="1" noChangeArrowheads="1"/>
+                    </pic:cNvPicPr>
+                  </pic:nvPicPr>
+                  <pic:blipFill>
+                    <a:blip r:embed="rId19" cstate="none"/>
+                    <a:srcRect/>
+                    <a:stretch>
+                      <a:fillRect/>
+                    </a:stretch>
+                  </pic:blipFill>
+                  <pic:spPr bwMode="auto">
+                    <a:xfrm>
+                      <a:off x="0" y="0"/>
+                      <a:ext cx="5943600" cy="3724275"/>
+                    </a:xfrm>
+                    <a:prstGeom prst="rect">
+                      <a:avLst/>
+                    </a:prstGeom>
+                  </pic:spPr>
+                </pic:pic>
+              </a:graphicData>
+            </a:graphic>
+          </wp:inline>
+        </w:drawing>
+      </w:r>
+    </w:p>
+    <w:p>
+      <w:pPr>
+        <w:spacing w:after="200"/>
+        <w:jc w:val="center"/>
+      </w:pPr>
+      <w:r>
+        <w:rPr>
+          <w:i/>
+          <w:iCs/>
+          <w:color w:val="595959"/>
+          <w:sz w:val="18"/>
+          <w:szCs w:val="18"/>
+        </w:rPr>
+        <w:t xml:space="preserve">Screenshot (Windows 11): mt_server with two clients connected at once: left window (second client) is answered while the right window (first client) is still connected; middle window is the server log</w:t>
+      </w:r>
+    </w:p>
+    <w:p>
+      <w:pPr>
+        <w:keepNext/>
+        <w:spacing w:after="120"/>
+      </w:pPr>
+      <w:r>
+        <w:rPr>
+          <w:b/>
+          <w:bCs/>
+        </w:rPr>
+        <w:t xml:space="preserve">Test 16, basic server.</w:t>
+      </w:r>
+      <w:r>
+        <w:t xml:space="preserve"> Same scenario against </w:t>
       </w:r>
       <w:r>
         <w:rPr>
@@ -9897,259 +11763,10 @@
           <w:sz w:val="19"/>
           <w:szCs w:val="19"/>
         </w:rPr>
-        <w:t xml:space="preserve">logs/mt_server.log</w:t>
-      </w:r>
-      <w:r>
-        <w:t xml:space="preserve">):</w:t>
-      </w:r>
-    </w:p>
-    <w:p>
-      <w:pPr>
-        <w:keepNext/>
-        <w:keepLines/>
-        <w:pBdr>
-          <w:top w:val="single" w:color="F2F2F2" w:sz="2" w:space="4"/>
-          <w:left w:val="single" w:color="A6A6A6" w:sz="12" w:space="6"/>
-        </w:pBdr>
-        <w:shd w:fill="F2F2F2" w:color="auto" w:val="clear"/>
-        <w:spacing w:after="0" w:before="0" w:line="240"/>
-        <w:ind w:left="144" w:right="144"/>
-      </w:pPr>
-      <w:r>
-        <w:rPr>
-          <w:rFonts w:ascii="Consolas" w:cs="Consolas" w:eastAsia="Consolas" w:hAnsi="Consolas"/>
-          <w:sz w:val="17"/>
-          <w:szCs w:val="17"/>
-        </w:rPr>
-        <w:t xml:space="preserve">Loaded 69903 words from /home/user/Testing_Repo/pa1/wordlist.txt</w:t>
-      </w:r>
-    </w:p>
-    <w:p>
-      <w:pPr>
-        <w:keepNext/>
-        <w:keepLines/>
-        <w:pBdr>
-          <w:left w:val="single" w:color="A6A6A6" w:sz="12" w:space="6"/>
-        </w:pBdr>
-        <w:shd w:fill="F2F2F2" w:color="auto" w:val="clear"/>
-        <w:spacing w:after="0" w:before="0" w:line="240"/>
-        <w:ind w:left="144" w:right="144"/>
-      </w:pPr>
-      <w:r>
-        <w:rPr>
-          <w:rFonts w:ascii="Consolas" w:cs="Consolas" w:eastAsia="Consolas" w:hAnsi="Consolas"/>
-          <w:sz w:val="17"/>
-          <w:szCs w:val="17"/>
-        </w:rPr>
-        <w:t xml:space="preserve">Multi-threaded WORDQ server listening on port 12000 (Ctrl-C to stop)</w:t>
-      </w:r>
-    </w:p>
-    <w:p>
-      <w:pPr>
-        <w:keepNext/>
-        <w:keepLines/>
-        <w:pBdr>
-          <w:left w:val="single" w:color="A6A6A6" w:sz="12" w:space="6"/>
-        </w:pBdr>
-        <w:shd w:fill="F2F2F2" w:color="auto" w:val="clear"/>
-        <w:spacing w:after="0" w:before="0" w:line="240"/>
-        <w:ind w:left="144" w:right="144"/>
-      </w:pPr>
-      <w:r>
-        <w:rPr>
-          <w:rFonts w:ascii="Consolas" w:cs="Consolas" w:eastAsia="Consolas" w:hAnsi="Consolas"/>
-          <w:sz w:val="17"/>
-          <w:szCs w:val="17"/>
-        </w:rPr>
-        <w:t xml:space="preserve">Server connected by ('127.0.0.1', 34836) at Fri Oct 16 00:14:31 2026</w:t>
-      </w:r>
-    </w:p>
-    <w:p>
-      <w:pPr>
-        <w:keepNext/>
-        <w:keepLines/>
-        <w:pBdr>
-          <w:left w:val="single" w:color="A6A6A6" w:sz="12" w:space="6"/>
-        </w:pBdr>
-        <w:shd w:fill="F2F2F2" w:color="auto" w:val="clear"/>
-        <w:spacing w:after="0" w:before="0" w:line="240"/>
-        <w:ind w:left="144" w:right="144"/>
-      </w:pPr>
-      <w:r>
-        <w:rPr>
-          <w:rFonts w:ascii="Consolas" w:cs="Consolas" w:eastAsia="Consolas" w:hAnsi="Consolas"/>
-          <w:sz w:val="17"/>
-          <w:szCs w:val="17"/>
-        </w:rPr>
-        <w:t xml:space="preserve">('127.0.0.1', 34836)  b'QUERY ??????????\n' -&gt; 200 OK 24071</w:t>
-      </w:r>
-    </w:p>
-    <w:p>
-      <w:pPr>
-        <w:keepNext/>
-        <w:keepLines/>
-        <w:pBdr>
-          <w:left w:val="single" w:color="A6A6A6" w:sz="12" w:space="6"/>
-        </w:pBdr>
-        <w:shd w:fill="F2F2F2" w:color="auto" w:val="clear"/>
-        <w:spacing w:after="0" w:before="0" w:line="240"/>
-        <w:ind w:left="144" w:right="144"/>
-      </w:pPr>
-      <w:r>
-        <w:rPr>
-          <w:rFonts w:ascii="Consolas" w:cs="Consolas" w:eastAsia="Consolas" w:hAnsi="Consolas"/>
-          <w:sz w:val="17"/>
-          <w:szCs w:val="17"/>
-        </w:rPr>
-        <w:t xml:space="preserve">('127.0.0.1', 34836)  b'QUERY ?\n' -&gt; 200 OK 69903</w:t>
-      </w:r>
-    </w:p>
-    <w:p>
-      <w:pPr>
-        <w:keepNext/>
-        <w:keepLines/>
-        <w:pBdr>
-          <w:left w:val="single" w:color="A6A6A6" w:sz="12" w:space="6"/>
-        </w:pBdr>
-        <w:shd w:fill="F2F2F2" w:color="auto" w:val="clear"/>
-        <w:spacing w:after="0" w:before="0" w:line="240"/>
-        <w:ind w:left="144" w:right="144"/>
-      </w:pPr>
-      <w:r>
-        <w:rPr>
-          <w:rFonts w:ascii="Consolas" w:cs="Consolas" w:eastAsia="Consolas" w:hAnsi="Consolas"/>
-          <w:sz w:val="17"/>
-          <w:szCs w:val="17"/>
-        </w:rPr>
-        <w:t xml:space="preserve">('127.0.0.1', 34836)  b'QUERY ?(a)\n' -&gt; 200 OK 414</w:t>
-      </w:r>
-    </w:p>
-    <w:p>
-      <w:pPr>
-        <w:keepNext/>
-        <w:keepLines/>
-        <w:pBdr>
-          <w:left w:val="single" w:color="A6A6A6" w:sz="12" w:space="6"/>
-        </w:pBdr>
-        <w:shd w:fill="F2F2F2" w:color="auto" w:val="clear"/>
-        <w:spacing w:after="0" w:before="0" w:line="240"/>
-        <w:ind w:left="144" w:right="144"/>
-      </w:pPr>
-      <w:r>
-        <w:rPr>
-          <w:rFonts w:ascii="Consolas" w:cs="Consolas" w:eastAsia="Consolas" w:hAnsi="Consolas"/>
-          <w:sz w:val="17"/>
-          <w:szCs w:val="17"/>
-        </w:rPr>
-        <w:t xml:space="preserve">('127.0.0.1', 34836)  b'QUERY -?-\n' -&gt; 200 OK 13</w:t>
-      </w:r>
-    </w:p>
-    <w:p>
-      <w:pPr>
-        <w:keepNext/>
-        <w:keepLines/>
-        <w:pBdr>
-          <w:left w:val="single" w:color="A6A6A6" w:sz="12" w:space="6"/>
-        </w:pBdr>
-        <w:shd w:fill="F2F2F2" w:color="auto" w:val="clear"/>
-        <w:spacing w:after="0" w:before="0" w:line="240"/>
-        <w:ind w:left="144" w:right="144"/>
-      </w:pPr>
-      <w:r>
-        <w:rPr>
-          <w:rFonts w:ascii="Consolas" w:cs="Consolas" w:eastAsia="Consolas" w:hAnsi="Consolas"/>
-          <w:sz w:val="17"/>
-          <w:szCs w:val="17"/>
-        </w:rPr>
-        <w:t xml:space="preserve">('127.0.0.1', 34836)  b'QUERY a?t\n' -&gt; 200 OK 4260</w:t>
-      </w:r>
-    </w:p>
-    <w:p>
-      <w:pPr>
-        <w:keepNext/>
-        <w:keepLines/>
-        <w:pBdr>
-          <w:left w:val="single" w:color="A6A6A6" w:sz="12" w:space="6"/>
-        </w:pBdr>
-        <w:shd w:fill="F2F2F2" w:color="auto" w:val="clear"/>
-        <w:spacing w:after="0" w:before="0" w:line="240"/>
-        <w:ind w:left="144" w:right="144"/>
-      </w:pPr>
-      <w:r>
-        <w:rPr>
-          <w:rFonts w:ascii="Consolas" w:cs="Consolas" w:eastAsia="Consolas" w:hAnsi="Consolas"/>
-          <w:sz w:val="17"/>
-          <w:szCs w:val="17"/>
-        </w:rPr>
-        <w:t xml:space="preserve">('127.0.0.1', 34836)  b'QUERY zzzzqx\n' -&gt; 404 NOT_FOUND 0</w:t>
-      </w:r>
-    </w:p>
-    <w:p>
-      <w:pPr>
-        <w:keepNext/>
-        <w:keepLines/>
-        <w:pBdr>
-          <w:left w:val="single" w:color="A6A6A6" w:sz="12" w:space="6"/>
-        </w:pBdr>
-        <w:shd w:fill="F2F2F2" w:color="auto" w:val="clear"/>
-        <w:spacing w:after="0" w:before="0" w:line="240"/>
-        <w:ind w:left="144" w:right="144"/>
-      </w:pPr>
-      <w:r>
-        <w:rPr>
-          <w:rFonts w:ascii="Consolas" w:cs="Consolas" w:eastAsia="Consolas" w:hAnsi="Consolas"/>
-          <w:sz w:val="17"/>
-          <w:szCs w:val="17"/>
-        </w:rPr>
-        <w:t xml:space="preserve">('127.0.0.1', 34836)  b'QUIT\n' -&gt; 200 BYE 0</w:t>
-      </w:r>
-    </w:p>
-    <w:p>
-      <w:pPr>
-        <w:keepNext w:val="false"/>
-        <w:keepLines/>
-        <w:pBdr>
-          <w:bottom w:val="single" w:color="F2F2F2" w:sz="2" w:space="4"/>
-          <w:left w:val="single" w:color="A6A6A6" w:sz="12" w:space="6"/>
-        </w:pBdr>
-        <w:shd w:fill="F2F2F2" w:color="auto" w:val="clear"/>
-        <w:spacing w:after="0" w:before="0" w:line="240"/>
-        <w:ind w:left="144" w:right="144"/>
-      </w:pPr>
-      <w:r>
-        <w:rPr>
-          <w:rFonts w:ascii="Consolas" w:cs="Consolas" w:eastAsia="Consolas" w:hAnsi="Consolas"/>
-          <w:sz w:val="17"/>
-          <w:szCs w:val="17"/>
-        </w:rPr>
-        <w:t xml:space="preserve">Client ('127.0.0.1', 34836) finished at Fri Oct 16 00:14:32 2026</w:t>
-      </w:r>
-    </w:p>
-    <w:p>
-      <w:pPr>
-        <w:spacing w:after="80"/>
-      </w:pPr>
-    </w:p>
-    <w:p>
-      <w:pPr>
-        <w:spacing w:after="160" w:before="60"/>
-      </w:pPr>
-      <w:r>
-        <w:rPr>
-          <w:b/>
-          <w:bCs/>
-          <w:color w:val="C00000"/>
-        </w:rPr>
-        <w:t xml:space="preserve">[SCREENSHOT PLACEHOLDER: mt_client session with the four required queries]</w:t>
-      </w:r>
-    </w:p>
-    <w:p>
-      <w:pPr>
-        <w:keepNext/>
-        <w:spacing w:after="120"/>
-      </w:pPr>
-      <w:r>
-        <w:t xml:space="preserve">Test 10, EOF counts as quit (</w:t>
+        <w:t xml:space="preserve">basic_server.py</w:t>
+      </w:r>
+      <w:r>
+        <w:t xml:space="preserve">: B connects at 00:14:25 but gets no reply until A quits at 00:14:30, because the single-threaded server only accepts B once it has finished with A (</w:t>
       </w:r>
       <w:r>
         <w:rPr>
@@ -10157,7 +11774,7 @@
           <w:sz w:val="19"/>
           <w:szCs w:val="19"/>
         </w:rPr>
-        <w:t xml:space="preserve">logs/mt_client_eof.txt</w:t>
+        <w:t xml:space="preserve">logs/basic_server_second_client_waits.txt</w:t>
       </w:r>
       <w:r>
         <w:t xml:space="preserve">):</w:t>
@@ -10181,167 +11798,87 @@
           <w:sz w:val="17"/>
           <w:szCs w:val="17"/>
         </w:rPr>
-        <w:t xml:space="preserve">$ python3 mt_client.py   (typed: -?- then EOF/Ctrl-D)</w:t>
-      </w:r>
-    </w:p>
-    <w:p>
-      <w:pPr>
-        <w:keepNext/>
-        <w:keepLines/>
-        <w:pBdr>
-          <w:left w:val="single" w:color="A6A6A6" w:sz="12" w:space="6"/>
-        </w:pBdr>
-        <w:shd w:fill="F2F2F2" w:color="auto" w:val="clear"/>
-        <w:spacing w:after="0" w:before="0" w:line="240"/>
-        <w:ind w:left="144" w:right="144"/>
-      </w:pPr>
-      <w:r>
-        <w:rPr>
-          <w:rFonts w:ascii="Consolas" w:cs="Consolas" w:eastAsia="Consolas" w:hAnsi="Consolas"/>
-          <w:sz w:val="17"/>
-          <w:szCs w:val="17"/>
-        </w:rPr>
-        <w:t xml:space="preserve">Connected to 127.0.0.1:12000</w:t>
-      </w:r>
-    </w:p>
-    <w:p>
-      <w:pPr>
-        <w:keepNext/>
-        <w:keepLines/>
-        <w:pBdr>
-          <w:left w:val="single" w:color="A6A6A6" w:sz="12" w:space="6"/>
-        </w:pBdr>
-        <w:shd w:fill="F2F2F2" w:color="auto" w:val="clear"/>
-        <w:spacing w:after="0" w:before="0" w:line="240"/>
-        <w:ind w:left="144" w:right="144"/>
-      </w:pPr>
-      <w:r>
-        <w:rPr>
-          <w:rFonts w:ascii="Consolas" w:cs="Consolas" w:eastAsia="Consolas" w:hAnsi="Consolas"/>
-          <w:sz w:val="17"/>
-          <w:szCs w:val="17"/>
-        </w:rPr>
-        <w:t xml:space="preserve">Enter query (or 'quit'): Server replied: 200 OK</w:t>
-      </w:r>
-    </w:p>
-    <w:p>
-      <w:pPr>
-        <w:keepNext/>
-        <w:keepLines/>
-        <w:pBdr>
-          <w:left w:val="single" w:color="A6A6A6" w:sz="12" w:space="6"/>
-        </w:pBdr>
-        <w:shd w:fill="F2F2F2" w:color="auto" w:val="clear"/>
-        <w:spacing w:after="0" w:before="0" w:line="240"/>
-        <w:ind w:left="144" w:right="144"/>
-      </w:pPr>
-      <w:r>
-        <w:rPr>
-          <w:rFonts w:ascii="Consolas" w:cs="Consolas" w:eastAsia="Consolas" w:hAnsi="Consolas"/>
-          <w:sz w:val="17"/>
-          <w:szCs w:val="17"/>
-        </w:rPr>
-        <w:t xml:space="preserve">Number of matching words: 13</w:t>
-      </w:r>
-    </w:p>
-    <w:p>
-      <w:pPr>
-        <w:keepNext/>
-        <w:keepLines/>
-        <w:pBdr>
-          <w:left w:val="single" w:color="A6A6A6" w:sz="12" w:space="6"/>
-        </w:pBdr>
-        <w:shd w:fill="F2F2F2" w:color="auto" w:val="clear"/>
-        <w:spacing w:after="0" w:before="0" w:line="240"/>
-        <w:ind w:left="144" w:right="144"/>
-      </w:pPr>
-      <w:r>
-        <w:rPr>
-          <w:rFonts w:ascii="Consolas" w:cs="Consolas" w:eastAsia="Consolas" w:hAnsi="Consolas"/>
-          <w:sz w:val="17"/>
-          <w:szCs w:val="17"/>
-        </w:rPr>
-        <w:t xml:space="preserve">bric-a-brac</w:t>
-      </w:r>
-    </w:p>
-    <w:p>
-      <w:pPr>
-        <w:keepNext/>
-        <w:keepLines/>
-        <w:pBdr>
-          <w:left w:val="single" w:color="A6A6A6" w:sz="12" w:space="6"/>
-        </w:pBdr>
-        <w:shd w:fill="F2F2F2" w:color="auto" w:val="clear"/>
-        <w:spacing w:after="0" w:before="0" w:line="240"/>
-        <w:ind w:left="144" w:right="144"/>
-      </w:pPr>
-      <w:r>
-        <w:rPr>
-          <w:rFonts w:ascii="Consolas" w:cs="Consolas" w:eastAsia="Consolas" w:hAnsi="Consolas"/>
-          <w:sz w:val="17"/>
-          <w:szCs w:val="17"/>
-        </w:rPr>
-        <w:t xml:space="preserve">   ... (11 more lines omitted; full output in logs/) ...</w:t>
-      </w:r>
-    </w:p>
-    <w:p>
-      <w:pPr>
-        <w:keepNext/>
-        <w:keepLines/>
-        <w:pBdr>
-          <w:left w:val="single" w:color="A6A6A6" w:sz="12" w:space="6"/>
-        </w:pBdr>
-        <w:shd w:fill="F2F2F2" w:color="auto" w:val="clear"/>
-        <w:spacing w:after="0" w:before="0" w:line="240"/>
-        <w:ind w:left="144" w:right="144"/>
-      </w:pPr>
-      <w:r>
-        <w:rPr>
-          <w:rFonts w:ascii="Consolas" w:cs="Consolas" w:eastAsia="Consolas" w:hAnsi="Consolas"/>
-          <w:sz w:val="17"/>
-          <w:szCs w:val="17"/>
-        </w:rPr>
-        <w:t xml:space="preserve">vis-a-vis</w:t>
-      </w:r>
-    </w:p>
-    <w:p>
-      <w:pPr>
-        <w:keepNext/>
-        <w:keepLines/>
-        <w:pBdr>
-          <w:left w:val="single" w:color="A6A6A6" w:sz="12" w:space="6"/>
-        </w:pBdr>
-        <w:shd w:fill="F2F2F2" w:color="auto" w:val="clear"/>
-        <w:spacing w:after="0" w:before="0" w:line="240"/>
-        <w:ind w:left="144" w:right="144"/>
-      </w:pPr>
-      <w:r>
-        <w:rPr>
-          <w:rFonts w:ascii="Consolas" w:cs="Consolas" w:eastAsia="Consolas" w:hAnsi="Consolas"/>
-          <w:sz w:val="17"/>
-          <w:szCs w:val="17"/>
-        </w:rPr>
-        <w:t xml:space="preserve">Enter query (or 'quit'): </w:t>
-      </w:r>
-    </w:p>
-    <w:p>
-      <w:pPr>
-        <w:keepNext/>
-        <w:keepLines/>
-        <w:pBdr>
-          <w:left w:val="single" w:color="A6A6A6" w:sz="12" w:space="6"/>
-        </w:pBdr>
-        <w:shd w:fill="F2F2F2" w:color="auto" w:val="clear"/>
-        <w:spacing w:after="0" w:before="0" w:line="240"/>
-        <w:ind w:left="144" w:right="144"/>
-      </w:pPr>
-      <w:r>
-        <w:rPr>
-          <w:rFonts w:ascii="Consolas" w:cs="Consolas" w:eastAsia="Consolas" w:hAnsi="Consolas"/>
-          <w:sz w:val="17"/>
-          <w:szCs w:val="17"/>
-        </w:rPr>
-        <w:t xml:space="preserve">Server replied: 200 BYE</w:t>
+        <w:t xml:space="preserve">[00:14:24] client A (mt_client) connects to BASIC server and stays idle 6 s</w:t>
+      </w:r>
+    </w:p>
+    <w:p>
+      <w:pPr>
+        <w:keepNext/>
+        <w:keepLines/>
+        <w:pBdr>
+          <w:left w:val="single" w:color="A6A6A6" w:sz="12" w:space="6"/>
+        </w:pBdr>
+        <w:shd w:fill="F2F2F2" w:color="auto" w:val="clear"/>
+        <w:spacing w:after="0" w:before="0" w:line="240"/>
+        <w:ind w:left="144" w:right="144"/>
+      </w:pPr>
+      <w:r>
+        <w:rPr>
+          <w:rFonts w:ascii="Consolas" w:cs="Consolas" w:eastAsia="Consolas" w:hAnsi="Consolas"/>
+          <w:sz w:val="17"/>
+          <w:szCs w:val="17"/>
+        </w:rPr>
+        <w:t xml:space="preserve">[00:14:25] client B (basic_client) starts, query zzzzqx</w:t>
+      </w:r>
+    </w:p>
+    <w:p>
+      <w:pPr>
+        <w:keepNext/>
+        <w:keepLines/>
+        <w:pBdr>
+          <w:left w:val="single" w:color="A6A6A6" w:sz="12" w:space="6"/>
+        </w:pBdr>
+        <w:shd w:fill="F2F2F2" w:color="auto" w:val="clear"/>
+        <w:spacing w:after="0" w:before="0" w:line="240"/>
+        <w:ind w:left="144" w:right="144"/>
+      </w:pPr>
+      <w:r>
+        <w:rPr>
+          <w:rFonts w:ascii="Consolas" w:cs="Consolas" w:eastAsia="Consolas" w:hAnsi="Consolas"/>
+          <w:sz w:val="17"/>
+          <w:szCs w:val="17"/>
+        </w:rPr>
+        <w:t xml:space="preserve">[00:14:30] client A finished (sent quit)</w:t>
+      </w:r>
+    </w:p>
+    <w:p>
+      <w:pPr>
+        <w:keepNext/>
+        <w:keepLines/>
+        <w:pBdr>
+          <w:left w:val="single" w:color="A6A6A6" w:sz="12" w:space="6"/>
+        </w:pBdr>
+        <w:shd w:fill="F2F2F2" w:color="auto" w:val="clear"/>
+        <w:spacing w:after="0" w:before="0" w:line="240"/>
+        <w:ind w:left="144" w:right="144"/>
+      </w:pPr>
+      <w:r>
+        <w:rPr>
+          <w:rFonts w:ascii="Consolas" w:cs="Consolas" w:eastAsia="Consolas" w:hAnsi="Consolas"/>
+          <w:sz w:val="17"/>
+          <w:szCs w:val="17"/>
+        </w:rPr>
+        <w:t xml:space="preserve">[B] Enter query: Server replied: 404 NOT_FOUND</w:t>
+      </w:r>
+    </w:p>
+    <w:p>
+      <w:pPr>
+        <w:keepNext/>
+        <w:keepLines/>
+        <w:pBdr>
+          <w:left w:val="single" w:color="A6A6A6" w:sz="12" w:space="6"/>
+        </w:pBdr>
+        <w:shd w:fill="F2F2F2" w:color="auto" w:val="clear"/>
+        <w:spacing w:after="0" w:before="0" w:line="240"/>
+        <w:ind w:left="144" w:right="144"/>
+      </w:pPr>
+      <w:r>
+        <w:rPr>
+          <w:rFonts w:ascii="Consolas" w:cs="Consolas" w:eastAsia="Consolas" w:hAnsi="Consolas"/>
+          <w:sz w:val="17"/>
+          <w:szCs w:val="17"/>
+        </w:rPr>
+        <w:t xml:space="preserve">[B] Number of matching words: 0</w:t>
       </w:r>
     </w:p>
     <w:p>
@@ -10362,7 +11899,7 @@
           <w:sz w:val="17"/>
           <w:szCs w:val="17"/>
         </w:rPr>
-        <w:t xml:space="preserve">[exit code 0]</w:t>
+        <w:t xml:space="preserve">[00:14:30] client B finished</w:t>
       </w:r>
     </w:p>
     <w:p>
@@ -10372,1139 +11909,137 @@
     </w:p>
     <w:p>
       <w:pPr>
-        <w:pStyle w:val="Heading2"/>
-      </w:pPr>
-      <w:r>
-        <w:t xml:space="preserve">4.4 Malformed requests</w:t>
-      </w:r>
-    </w:p>
-    <w:p>
-      <w:pPr>
-        <w:keepNext/>
+        <w:keepNext w:val="false"/>
         <w:spacing w:after="120"/>
       </w:pPr>
       <w:r>
-        <w:t xml:space="preserve">Tests 11-14 use </w:t>
-      </w:r>
-      <w:r>
-        <w:rPr>
-          <w:rFonts w:ascii="Consolas" w:cs="Consolas" w:eastAsia="Consolas" w:hAnsi="Consolas"/>
-          <w:sz w:val="19"/>
-          <w:szCs w:val="19"/>
-        </w:rPr>
-        <w:t xml:space="preserve">test_raw_protocol.py</w:t>
-      </w:r>
-      <w:r>
-        <w:t xml:space="preserve">, which sends raw lines over one connection (</w:t>
-      </w:r>
-      <w:r>
-        <w:rPr>
-          <w:rFonts w:ascii="Consolas" w:cs="Consolas" w:eastAsia="Consolas" w:hAnsi="Consolas"/>
-          <w:sz w:val="19"/>
-          <w:szCs w:val="19"/>
-        </w:rPr>
-        <w:t xml:space="preserve">logs/raw_protocol_tests.txt</w:t>
-      </w:r>
-      <w:r>
-        <w:t xml:space="preserve">):</w:t>
-      </w:r>
-    </w:p>
-    <w:p>
-      <w:pPr>
-        <w:keepNext/>
-        <w:keepLines/>
-        <w:pBdr>
-          <w:top w:val="single" w:color="F2F2F2" w:sz="2" w:space="4"/>
-          <w:left w:val="single" w:color="A6A6A6" w:sz="12" w:space="6"/>
-        </w:pBdr>
-        <w:shd w:fill="F2F2F2" w:color="auto" w:val="clear"/>
-        <w:spacing w:after="0" w:before="0" w:line="240"/>
-        <w:ind w:left="144" w:right="144"/>
-      </w:pPr>
-      <w:r>
-        <w:rPr>
-          <w:rFonts w:ascii="Consolas" w:cs="Consolas" w:eastAsia="Consolas" w:hAnsi="Consolas"/>
-          <w:sz w:val="17"/>
-          <w:szCs w:val="17"/>
-        </w:rPr>
-        <w:t xml:space="preserve">--- Test: empty QUERY</w:t>
-      </w:r>
-    </w:p>
-    <w:p>
-      <w:pPr>
-        <w:keepNext/>
-        <w:keepLines/>
-        <w:pBdr>
-          <w:left w:val="single" w:color="A6A6A6" w:sz="12" w:space="6"/>
-        </w:pBdr>
-        <w:shd w:fill="F2F2F2" w:color="auto" w:val="clear"/>
-        <w:spacing w:after="0" w:before="0" w:line="240"/>
-        <w:ind w:left="144" w:right="144"/>
-      </w:pPr>
-      <w:r>
-        <w:rPr>
-          <w:rFonts w:ascii="Consolas" w:cs="Consolas" w:eastAsia="Consolas" w:hAnsi="Consolas"/>
-          <w:sz w:val="17"/>
-          <w:szCs w:val="17"/>
-        </w:rPr>
-        <w:t xml:space="preserve">SEND b'QUERY\n'</w:t>
-      </w:r>
-    </w:p>
-    <w:p>
-      <w:pPr>
-        <w:keepNext/>
-        <w:keepLines/>
-        <w:pBdr>
-          <w:left w:val="single" w:color="A6A6A6" w:sz="12" w:space="6"/>
-        </w:pBdr>
-        <w:shd w:fill="F2F2F2" w:color="auto" w:val="clear"/>
-        <w:spacing w:after="0" w:before="0" w:line="240"/>
-        <w:ind w:left="144" w:right="144"/>
-      </w:pPr>
-      <w:r>
-        <w:rPr>
-          <w:rFonts w:ascii="Consolas" w:cs="Consolas" w:eastAsia="Consolas" w:hAnsi="Consolas"/>
-          <w:sz w:val="17"/>
-          <w:szCs w:val="17"/>
-        </w:rPr>
-        <w:t xml:space="preserve">RECV 400 BAD_REQUEST 0</w:t>
-      </w:r>
-    </w:p>
-    <w:p>
-      <w:pPr>
-        <w:keepNext/>
-        <w:keepLines/>
-        <w:pBdr>
-          <w:left w:val="single" w:color="A6A6A6" w:sz="12" w:space="6"/>
-        </w:pBdr>
-        <w:shd w:fill="F2F2F2" w:color="auto" w:val="clear"/>
-        <w:spacing w:after="0" w:before="0" w:line="240"/>
-        <w:ind w:left="144" w:right="144"/>
-      </w:pPr>
-      <w:r>
-        <w:rPr>
-          <w:rFonts w:ascii="Consolas" w:cs="Consolas" w:eastAsia="Consolas" w:hAnsi="Consolas"/>
-          <w:sz w:val="17"/>
-          <w:szCs w:val="17"/>
-        </w:rPr>
-        <w:t xml:space="preserve">SEND b'QUERY    \n'</w:t>
-      </w:r>
-    </w:p>
-    <w:p>
-      <w:pPr>
-        <w:keepNext/>
-        <w:keepLines/>
-        <w:pBdr>
-          <w:left w:val="single" w:color="A6A6A6" w:sz="12" w:space="6"/>
-        </w:pBdr>
-        <w:shd w:fill="F2F2F2" w:color="auto" w:val="clear"/>
-        <w:spacing w:after="0" w:before="0" w:line="240"/>
-        <w:ind w:left="144" w:right="144"/>
-      </w:pPr>
-      <w:r>
-        <w:rPr>
-          <w:rFonts w:ascii="Consolas" w:cs="Consolas" w:eastAsia="Consolas" w:hAnsi="Consolas"/>
-          <w:sz w:val="17"/>
-          <w:szCs w:val="17"/>
-        </w:rPr>
-        <w:t xml:space="preserve">RECV 400 BAD_REQUEST 0</w:t>
-      </w:r>
-    </w:p>
-    <w:p>
-      <w:pPr>
-        <w:keepNext/>
-        <w:keepLines/>
-        <w:pBdr>
-          <w:left w:val="single" w:color="A6A6A6" w:sz="12" w:space="6"/>
-        </w:pBdr>
-        <w:shd w:fill="F2F2F2" w:color="auto" w:val="clear"/>
-        <w:spacing w:after="0" w:before="0" w:line="240"/>
-        <w:ind w:left="144" w:right="144"/>
-      </w:pPr>
-      <w:r>
-        <w:rPr>
-          <w:rFonts w:ascii="Consolas" w:cs="Consolas" w:eastAsia="Consolas" w:hAnsi="Consolas"/>
-          <w:sz w:val="17"/>
-          <w:szCs w:val="17"/>
-        </w:rPr>
-        <w:t xml:space="preserve">--- Test: unknown command, then check connection stays open</w:t>
-      </w:r>
-    </w:p>
-    <w:p>
-      <w:pPr>
-        <w:keepNext/>
-        <w:keepLines/>
-        <w:pBdr>
-          <w:left w:val="single" w:color="A6A6A6" w:sz="12" w:space="6"/>
-        </w:pBdr>
-        <w:shd w:fill="F2F2F2" w:color="auto" w:val="clear"/>
-        <w:spacing w:after="0" w:before="0" w:line="240"/>
-        <w:ind w:left="144" w:right="144"/>
-      </w:pPr>
-      <w:r>
-        <w:rPr>
-          <w:rFonts w:ascii="Consolas" w:cs="Consolas" w:eastAsia="Consolas" w:hAnsi="Consolas"/>
-          <w:sz w:val="17"/>
-          <w:szCs w:val="17"/>
-        </w:rPr>
-        <w:t xml:space="preserve">SEND b'FIND a?t\n'</w:t>
-      </w:r>
-    </w:p>
-    <w:p>
-      <w:pPr>
-        <w:keepNext/>
-        <w:keepLines/>
-        <w:pBdr>
-          <w:left w:val="single" w:color="A6A6A6" w:sz="12" w:space="6"/>
-        </w:pBdr>
-        <w:shd w:fill="F2F2F2" w:color="auto" w:val="clear"/>
-        <w:spacing w:after="0" w:before="0" w:line="240"/>
-        <w:ind w:left="144" w:right="144"/>
-      </w:pPr>
-      <w:r>
-        <w:rPr>
-          <w:rFonts w:ascii="Consolas" w:cs="Consolas" w:eastAsia="Consolas" w:hAnsi="Consolas"/>
-          <w:sz w:val="17"/>
-          <w:szCs w:val="17"/>
-        </w:rPr>
-        <w:t xml:space="preserve">RECV 400 BAD_REQUEST 0</w:t>
-      </w:r>
-    </w:p>
-    <w:p>
-      <w:pPr>
-        <w:keepNext/>
-        <w:keepLines/>
-        <w:pBdr>
-          <w:left w:val="single" w:color="A6A6A6" w:sz="12" w:space="6"/>
-        </w:pBdr>
-        <w:shd w:fill="F2F2F2" w:color="auto" w:val="clear"/>
-        <w:spacing w:after="0" w:before="0" w:line="240"/>
-        <w:ind w:left="144" w:right="144"/>
-      </w:pPr>
-      <w:r>
-        <w:rPr>
-          <w:rFonts w:ascii="Consolas" w:cs="Consolas" w:eastAsia="Consolas" w:hAnsi="Consolas"/>
-          <w:sz w:val="17"/>
-          <w:szCs w:val="17"/>
-        </w:rPr>
-        <w:t xml:space="preserve">SEND b'QUERY -?-\n'</w:t>
-      </w:r>
-    </w:p>
-    <w:p>
-      <w:pPr>
-        <w:keepNext/>
-        <w:keepLines/>
-        <w:pBdr>
-          <w:left w:val="single" w:color="A6A6A6" w:sz="12" w:space="6"/>
-        </w:pBdr>
-        <w:shd w:fill="F2F2F2" w:color="auto" w:val="clear"/>
-        <w:spacing w:after="0" w:before="0" w:line="240"/>
-        <w:ind w:left="144" w:right="144"/>
-      </w:pPr>
-      <w:r>
-        <w:rPr>
-          <w:rFonts w:ascii="Consolas" w:cs="Consolas" w:eastAsia="Consolas" w:hAnsi="Consolas"/>
-          <w:sz w:val="17"/>
-          <w:szCs w:val="17"/>
-        </w:rPr>
-        <w:t xml:space="preserve">RECV 200 OK 13</w:t>
-      </w:r>
-    </w:p>
-    <w:p>
-      <w:pPr>
-        <w:keepNext/>
-        <w:keepLines/>
-        <w:pBdr>
-          <w:left w:val="single" w:color="A6A6A6" w:sz="12" w:space="6"/>
-        </w:pBdr>
-        <w:shd w:fill="F2F2F2" w:color="auto" w:val="clear"/>
-        <w:spacing w:after="0" w:before="0" w:line="240"/>
-        <w:ind w:left="144" w:right="144"/>
-      </w:pPr>
-      <w:r>
-        <w:rPr>
-          <w:rFonts w:ascii="Consolas" w:cs="Consolas" w:eastAsia="Consolas" w:hAnsi="Consolas"/>
-          <w:sz w:val="17"/>
-          <w:szCs w:val="17"/>
-        </w:rPr>
-        <w:t xml:space="preserve">connection still open: True</w:t>
-      </w:r>
-    </w:p>
-    <w:p>
-      <w:pPr>
-        <w:keepNext/>
-        <w:keepLines/>
-        <w:pBdr>
-          <w:left w:val="single" w:color="A6A6A6" w:sz="12" w:space="6"/>
-        </w:pBdr>
-        <w:shd w:fill="F2F2F2" w:color="auto" w:val="clear"/>
-        <w:spacing w:after="0" w:before="0" w:line="240"/>
-        <w:ind w:left="144" w:right="144"/>
-      </w:pPr>
-      <w:r>
-        <w:rPr>
-          <w:rFonts w:ascii="Consolas" w:cs="Consolas" w:eastAsia="Consolas" w:hAnsi="Consolas"/>
-          <w:sz w:val="17"/>
-          <w:szCs w:val="17"/>
-        </w:rPr>
-        <w:t xml:space="preserve">--- Test: lower-case command (commands are case-insensitive)</w:t>
-      </w:r>
-    </w:p>
-    <w:p>
-      <w:pPr>
-        <w:keepNext/>
-        <w:keepLines/>
-        <w:pBdr>
-          <w:left w:val="single" w:color="A6A6A6" w:sz="12" w:space="6"/>
-        </w:pBdr>
-        <w:shd w:fill="F2F2F2" w:color="auto" w:val="clear"/>
-        <w:spacing w:after="0" w:before="0" w:line="240"/>
-        <w:ind w:left="144" w:right="144"/>
-      </w:pPr>
-      <w:r>
-        <w:rPr>
-          <w:rFonts w:ascii="Consolas" w:cs="Consolas" w:eastAsia="Consolas" w:hAnsi="Consolas"/>
-          <w:sz w:val="17"/>
-          <w:szCs w:val="17"/>
-        </w:rPr>
-        <w:t xml:space="preserve">SEND b'query zzzzqx\n'</w:t>
-      </w:r>
-    </w:p>
-    <w:p>
-      <w:pPr>
-        <w:keepNext/>
-        <w:keepLines/>
-        <w:pBdr>
-          <w:left w:val="single" w:color="A6A6A6" w:sz="12" w:space="6"/>
-        </w:pBdr>
-        <w:shd w:fill="F2F2F2" w:color="auto" w:val="clear"/>
-        <w:spacing w:after="0" w:before="0" w:line="240"/>
-        <w:ind w:left="144" w:right="144"/>
-      </w:pPr>
-      <w:r>
-        <w:rPr>
-          <w:rFonts w:ascii="Consolas" w:cs="Consolas" w:eastAsia="Consolas" w:hAnsi="Consolas"/>
-          <w:sz w:val="17"/>
-          <w:szCs w:val="17"/>
-        </w:rPr>
-        <w:t xml:space="preserve">RECV 404 NOT_FOUND 0</w:t>
-      </w:r>
-    </w:p>
-    <w:p>
-      <w:pPr>
-        <w:keepNext/>
-        <w:keepLines/>
-        <w:pBdr>
-          <w:left w:val="single" w:color="A6A6A6" w:sz="12" w:space="6"/>
-        </w:pBdr>
-        <w:shd w:fill="F2F2F2" w:color="auto" w:val="clear"/>
-        <w:spacing w:after="0" w:before="0" w:line="240"/>
-        <w:ind w:left="144" w:right="144"/>
-      </w:pPr>
-      <w:r>
-        <w:rPr>
-          <w:rFonts w:ascii="Consolas" w:cs="Consolas" w:eastAsia="Consolas" w:hAnsi="Consolas"/>
-          <w:sz w:val="17"/>
-          <w:szCs w:val="17"/>
-        </w:rPr>
-        <w:t xml:space="preserve">--- Test: 2000-character line</w:t>
-      </w:r>
-    </w:p>
-    <w:p>
-      <w:pPr>
-        <w:keepNext/>
-        <w:keepLines/>
-        <w:pBdr>
-          <w:left w:val="single" w:color="A6A6A6" w:sz="12" w:space="6"/>
-        </w:pBdr>
-        <w:shd w:fill="F2F2F2" w:color="auto" w:val="clear"/>
-        <w:spacing w:after="0" w:before="0" w:line="240"/>
-        <w:ind w:left="144" w:right="144"/>
-      </w:pPr>
-      <w:r>
-        <w:rPr>
-          <w:rFonts w:ascii="Consolas" w:cs="Consolas" w:eastAsia="Consolas" w:hAnsi="Consolas"/>
-          <w:sz w:val="17"/>
-          <w:szCs w:val="17"/>
-        </w:rPr>
-        <w:t xml:space="preserve">SEND b'QUERY aaaaaaaaaaaaaa...(2007 bytes)'</w:t>
-      </w:r>
-    </w:p>
-    <w:p>
-      <w:pPr>
-        <w:keepNext/>
-        <w:keepLines/>
-        <w:pBdr>
-          <w:left w:val="single" w:color="A6A6A6" w:sz="12" w:space="6"/>
-        </w:pBdr>
-        <w:shd w:fill="F2F2F2" w:color="auto" w:val="clear"/>
-        <w:spacing w:after="0" w:before="0" w:line="240"/>
-        <w:ind w:left="144" w:right="144"/>
-      </w:pPr>
-      <w:r>
-        <w:rPr>
-          <w:rFonts w:ascii="Consolas" w:cs="Consolas" w:eastAsia="Consolas" w:hAnsi="Consolas"/>
-          <w:sz w:val="17"/>
-          <w:szCs w:val="17"/>
-        </w:rPr>
-        <w:t xml:space="preserve">RECV 400 BAD_REQUEST 0</w:t>
-      </w:r>
-    </w:p>
-    <w:p>
-      <w:pPr>
-        <w:keepNext w:val="false"/>
-        <w:keepLines/>
-        <w:pBdr>
-          <w:bottom w:val="single" w:color="F2F2F2" w:sz="2" w:space="4"/>
-          <w:left w:val="single" w:color="A6A6A6" w:sz="12" w:space="6"/>
-        </w:pBdr>
-        <w:shd w:fill="F2F2F2" w:color="auto" w:val="clear"/>
-        <w:spacing w:after="0" w:before="0" w:line="240"/>
-        <w:ind w:left="144" w:right="144"/>
-      </w:pPr>
-      <w:r>
-        <w:rPr>
-          <w:rFonts w:ascii="Consolas" w:cs="Consolas" w:eastAsia="Consolas" w:hAnsi="Consolas"/>
-          <w:sz w:val="17"/>
-          <w:szCs w:val="17"/>
-        </w:rPr>
-        <w:t xml:space="preserve">server closed connection: True</w:t>
-      </w:r>
-    </w:p>
-    <w:p>
-      <w:pPr>
-        <w:spacing w:after="80"/>
-      </w:pPr>
-    </w:p>
-    <w:p>
-      <w:pPr>
-        <w:keepNext/>
-        <w:spacing w:after="120"/>
-      </w:pPr>
-      <w:r>
-        <w:t xml:space="preserve">Matching server log lines:</w:t>
-      </w:r>
-    </w:p>
-    <w:p>
-      <w:pPr>
-        <w:keepNext/>
-        <w:keepLines/>
-        <w:pBdr>
-          <w:top w:val="single" w:color="F2F2F2" w:sz="2" w:space="4"/>
-          <w:left w:val="single" w:color="A6A6A6" w:sz="12" w:space="6"/>
-        </w:pBdr>
-        <w:shd w:fill="F2F2F2" w:color="auto" w:val="clear"/>
-        <w:spacing w:after="0" w:before="0" w:line="240"/>
-        <w:ind w:left="144" w:right="144"/>
-      </w:pPr>
-      <w:r>
-        <w:rPr>
-          <w:rFonts w:ascii="Consolas" w:cs="Consolas" w:eastAsia="Consolas" w:hAnsi="Consolas"/>
-          <w:sz w:val="17"/>
-          <w:szCs w:val="17"/>
-        </w:rPr>
-        <w:t xml:space="preserve">Server connected by ('127.0.0.1', 58870) at Fri Oct 16 00:14:38 2026</w:t>
-      </w:r>
-    </w:p>
-    <w:p>
-      <w:pPr>
-        <w:keepNext/>
-        <w:keepLines/>
-        <w:pBdr>
-          <w:left w:val="single" w:color="A6A6A6" w:sz="12" w:space="6"/>
-        </w:pBdr>
-        <w:shd w:fill="F2F2F2" w:color="auto" w:val="clear"/>
-        <w:spacing w:after="0" w:before="0" w:line="240"/>
-        <w:ind w:left="144" w:right="144"/>
-      </w:pPr>
-      <w:r>
-        <w:rPr>
-          <w:rFonts w:ascii="Consolas" w:cs="Consolas" w:eastAsia="Consolas" w:hAnsi="Consolas"/>
-          <w:sz w:val="17"/>
-          <w:szCs w:val="17"/>
-        </w:rPr>
-        <w:t xml:space="preserve">('127.0.0.1', 58870)  b'QUERY\n' -&gt; 400 BAD_REQUEST 0</w:t>
-      </w:r>
-    </w:p>
-    <w:p>
-      <w:pPr>
-        <w:keepNext/>
-        <w:keepLines/>
-        <w:pBdr>
-          <w:left w:val="single" w:color="A6A6A6" w:sz="12" w:space="6"/>
-        </w:pBdr>
-        <w:shd w:fill="F2F2F2" w:color="auto" w:val="clear"/>
-        <w:spacing w:after="0" w:before="0" w:line="240"/>
-        <w:ind w:left="144" w:right="144"/>
-      </w:pPr>
-      <w:r>
-        <w:rPr>
-          <w:rFonts w:ascii="Consolas" w:cs="Consolas" w:eastAsia="Consolas" w:hAnsi="Consolas"/>
-          <w:sz w:val="17"/>
-          <w:szCs w:val="17"/>
-        </w:rPr>
-        <w:t xml:space="preserve">('127.0.0.1', 58870)  b'QUERY    \n' -&gt; 400 BAD_REQUEST 0</w:t>
-      </w:r>
-    </w:p>
-    <w:p>
-      <w:pPr>
-        <w:keepNext/>
-        <w:keepLines/>
-        <w:pBdr>
-          <w:left w:val="single" w:color="A6A6A6" w:sz="12" w:space="6"/>
-        </w:pBdr>
-        <w:shd w:fill="F2F2F2" w:color="auto" w:val="clear"/>
-        <w:spacing w:after="0" w:before="0" w:line="240"/>
-        <w:ind w:left="144" w:right="144"/>
-      </w:pPr>
-      <w:r>
-        <w:rPr>
-          <w:rFonts w:ascii="Consolas" w:cs="Consolas" w:eastAsia="Consolas" w:hAnsi="Consolas"/>
-          <w:sz w:val="17"/>
-          <w:szCs w:val="17"/>
-        </w:rPr>
-        <w:t xml:space="preserve">('127.0.0.1', 58870)  b'FIND a?t\n' -&gt; 400 BAD_REQUEST 0</w:t>
-      </w:r>
-    </w:p>
-    <w:p>
-      <w:pPr>
-        <w:keepNext/>
-        <w:keepLines/>
-        <w:pBdr>
-          <w:left w:val="single" w:color="A6A6A6" w:sz="12" w:space="6"/>
-        </w:pBdr>
-        <w:shd w:fill="F2F2F2" w:color="auto" w:val="clear"/>
-        <w:spacing w:after="0" w:before="0" w:line="240"/>
-        <w:ind w:left="144" w:right="144"/>
-      </w:pPr>
-      <w:r>
-        <w:rPr>
-          <w:rFonts w:ascii="Consolas" w:cs="Consolas" w:eastAsia="Consolas" w:hAnsi="Consolas"/>
-          <w:sz w:val="17"/>
-          <w:szCs w:val="17"/>
-        </w:rPr>
-        <w:t xml:space="preserve">('127.0.0.1', 58870)  b'QUERY -?-\n' -&gt; 200 OK 13</w:t>
-      </w:r>
-    </w:p>
-    <w:p>
-      <w:pPr>
-        <w:keepNext/>
-        <w:keepLines/>
-        <w:pBdr>
-          <w:left w:val="single" w:color="A6A6A6" w:sz="12" w:space="6"/>
-        </w:pBdr>
-        <w:shd w:fill="F2F2F2" w:color="auto" w:val="clear"/>
-        <w:spacing w:after="0" w:before="0" w:line="240"/>
-        <w:ind w:left="144" w:right="144"/>
-      </w:pPr>
-      <w:r>
-        <w:rPr>
-          <w:rFonts w:ascii="Consolas" w:cs="Consolas" w:eastAsia="Consolas" w:hAnsi="Consolas"/>
-          <w:sz w:val="17"/>
-          <w:szCs w:val="17"/>
-        </w:rPr>
-        <w:t xml:space="preserve">('127.0.0.1', 58870)  b'query zzzzqx\n' -&gt; 404 NOT_FOUND 0</w:t>
-      </w:r>
-    </w:p>
-    <w:p>
-      <w:pPr>
-        <w:keepNext/>
-        <w:keepLines/>
-        <w:pBdr>
-          <w:left w:val="single" w:color="A6A6A6" w:sz="12" w:space="6"/>
-        </w:pBdr>
-        <w:shd w:fill="F2F2F2" w:color="auto" w:val="clear"/>
-        <w:spacing w:after="0" w:before="0" w:line="240"/>
-        <w:ind w:left="144" w:right="144"/>
-      </w:pPr>
-      <w:r>
-        <w:rPr>
-          <w:rFonts w:ascii="Consolas" w:cs="Consolas" w:eastAsia="Consolas" w:hAnsi="Consolas"/>
-          <w:sz w:val="17"/>
-          <w:szCs w:val="17"/>
-        </w:rPr>
-        <w:t xml:space="preserve">('127.0.0.1', 58870)  b'QUERY aaaaaaaaaaaaaaaaaaaaaaaaaa...' -&gt; 400 BAD_REQUEST 0</w:t>
-      </w:r>
-    </w:p>
-    <w:p>
-      <w:pPr>
-        <w:keepNext w:val="false"/>
-        <w:keepLines/>
-        <w:pBdr>
-          <w:bottom w:val="single" w:color="F2F2F2" w:sz="2" w:space="4"/>
-          <w:left w:val="single" w:color="A6A6A6" w:sz="12" w:space="6"/>
-        </w:pBdr>
-        <w:shd w:fill="F2F2F2" w:color="auto" w:val="clear"/>
-        <w:spacing w:after="0" w:before="0" w:line="240"/>
-        <w:ind w:left="144" w:right="144"/>
-      </w:pPr>
-      <w:r>
-        <w:rPr>
-          <w:rFonts w:ascii="Consolas" w:cs="Consolas" w:eastAsia="Consolas" w:hAnsi="Consolas"/>
-          <w:sz w:val="17"/>
-          <w:szCs w:val="17"/>
-        </w:rPr>
-        <w:t xml:space="preserve">Client ('127.0.0.1', 58870) finished at Fri Oct 16 00:14:38 2026</w:t>
-      </w:r>
-    </w:p>
-    <w:p>
-      <w:pPr>
-        <w:spacing w:after="80"/>
-      </w:pPr>
-    </w:p>
-    <w:p>
-      <w:pPr>
-        <w:spacing w:after="160" w:before="60"/>
-      </w:pPr>
-      <w:r>
-        <w:rPr>
-          <w:b/>
-          <w:bCs/>
-          <w:color w:val="C00000"/>
-        </w:rPr>
-        <w:t xml:space="preserve">[SCREENSHOT PLACEHOLDER: test_raw_protocol.py output]</w:t>
-      </w:r>
-    </w:p>
-    <w:p>
-      <w:pPr>
-        <w:pStyle w:val="Heading2"/>
-      </w:pPr>
-      <w:r>
-        <w:t xml:space="preserve">4.5 Two clients at the same time</w:t>
-      </w:r>
-    </w:p>
-    <w:p>
-      <w:pPr>
-        <w:keepNext/>
-        <w:spacing w:after="120"/>
-      </w:pPr>
-      <w:r>
-        <w:rPr>
-          <w:b/>
-          <w:bCs/>
-        </w:rPr>
-        <w:t xml:space="preserve">Test 15, multi-threaded server.</w:t>
-      </w:r>
-      <w:r>
-        <w:t xml:space="preserve"> Client A connects, queries </w:t>
-      </w:r>
-      <w:r>
-        <w:rPr>
-          <w:rFonts w:ascii="Consolas" w:cs="Consolas" w:eastAsia="Consolas" w:hAnsi="Consolas"/>
-          <w:sz w:val="19"/>
-          <w:szCs w:val="19"/>
-        </w:rPr>
-        <w:t xml:space="preserve">-?-</w:t>
-      </w:r>
-      <w:r>
-        <w:t xml:space="preserve">, then stays idle for 6 s. One second later client B connects, queries </w:t>
-      </w:r>
-      <w:r>
-        <w:rPr>
-          <w:rFonts w:ascii="Consolas" w:cs="Consolas" w:eastAsia="Consolas" w:hAnsi="Consolas"/>
-          <w:sz w:val="19"/>
-          <w:szCs w:val="19"/>
-        </w:rPr>
-        <w:t xml:space="preserve">?(a)</w:t>
-      </w:r>
-      <w:r>
-        <w:t xml:space="preserve"> and </w:t>
-      </w:r>
-      <w:r>
-        <w:rPr>
-          <w:rFonts w:ascii="Consolas" w:cs="Consolas" w:eastAsia="Consolas" w:hAnsi="Consolas"/>
-          <w:sz w:val="19"/>
-          <w:szCs w:val="19"/>
-        </w:rPr>
-        <w:t xml:space="preserve">zzzzqx</w:t>
-      </w:r>
-      <w:r>
-        <w:t xml:space="preserve"> and quits, all while A is still connected (</w:t>
-      </w:r>
-      <w:r>
-        <w:rPr>
-          <w:rFonts w:ascii="Consolas" w:cs="Consolas" w:eastAsia="Consolas" w:hAnsi="Consolas"/>
-          <w:sz w:val="19"/>
-          <w:szCs w:val="19"/>
-        </w:rPr>
-        <w:t xml:space="preserve">logs/mt_two_clients.txt</w:t>
-      </w:r>
-      <w:r>
-        <w:t xml:space="preserve">):</w:t>
-      </w:r>
-    </w:p>
-    <w:p>
-      <w:pPr>
-        <w:keepNext/>
-        <w:keepLines/>
-        <w:pBdr>
-          <w:top w:val="single" w:color="F2F2F2" w:sz="2" w:space="4"/>
-          <w:left w:val="single" w:color="A6A6A6" w:sz="12" w:space="6"/>
-        </w:pBdr>
-        <w:shd w:fill="F2F2F2" w:color="auto" w:val="clear"/>
-        <w:spacing w:after="0" w:before="0" w:line="240"/>
-        <w:ind w:left="144" w:right="144"/>
-      </w:pPr>
-      <w:r>
-        <w:rPr>
-          <w:rFonts w:ascii="Consolas" w:cs="Consolas" w:eastAsia="Consolas" w:hAnsi="Consolas"/>
-          <w:sz w:val="17"/>
-          <w:szCs w:val="17"/>
-        </w:rPr>
-        <w:t xml:space="preserve">[00:14:32] client A connects to MT server, queries -?-, then stays idle 6 s</w:t>
-      </w:r>
-    </w:p>
-    <w:p>
-      <w:pPr>
-        <w:keepNext/>
-        <w:keepLines/>
-        <w:pBdr>
-          <w:left w:val="single" w:color="A6A6A6" w:sz="12" w:space="6"/>
-        </w:pBdr>
-        <w:shd w:fill="F2F2F2" w:color="auto" w:val="clear"/>
-        <w:spacing w:after="0" w:before="0" w:line="240"/>
-        <w:ind w:left="144" w:right="144"/>
-      </w:pPr>
-      <w:r>
-        <w:rPr>
-          <w:rFonts w:ascii="Consolas" w:cs="Consolas" w:eastAsia="Consolas" w:hAnsi="Consolas"/>
-          <w:sz w:val="17"/>
-          <w:szCs w:val="17"/>
-        </w:rPr>
-        <w:t xml:space="preserve">[00:14:33] client B connects while A is still connected</w:t>
-      </w:r>
-    </w:p>
-    <w:p>
-      <w:pPr>
-        <w:keepNext/>
-        <w:keepLines/>
-        <w:pBdr>
-          <w:left w:val="single" w:color="A6A6A6" w:sz="12" w:space="6"/>
-        </w:pBdr>
-        <w:shd w:fill="F2F2F2" w:color="auto" w:val="clear"/>
-        <w:spacing w:after="0" w:before="0" w:line="240"/>
-        <w:ind w:left="144" w:right="144"/>
-      </w:pPr>
-      <w:r>
-        <w:rPr>
-          <w:rFonts w:ascii="Consolas" w:cs="Consolas" w:eastAsia="Consolas" w:hAnsi="Consolas"/>
-          <w:sz w:val="17"/>
-          <w:szCs w:val="17"/>
-        </w:rPr>
-        <w:t xml:space="preserve">[00:14:33] client B finished (A still connected)</w:t>
-      </w:r>
-    </w:p>
-    <w:p>
-      <w:pPr>
-        <w:keepNext w:val="false"/>
-        <w:keepLines/>
-        <w:pBdr>
-          <w:bottom w:val="single" w:color="F2F2F2" w:sz="2" w:space="4"/>
-          <w:left w:val="single" w:color="A6A6A6" w:sz="12" w:space="6"/>
-        </w:pBdr>
-        <w:shd w:fill="F2F2F2" w:color="auto" w:val="clear"/>
-        <w:spacing w:after="0" w:before="0" w:line="240"/>
-        <w:ind w:left="144" w:right="144"/>
-      </w:pPr>
-      <w:r>
-        <w:rPr>
-          <w:rFonts w:ascii="Consolas" w:cs="Consolas" w:eastAsia="Consolas" w:hAnsi="Consolas"/>
-          <w:sz w:val="17"/>
-          <w:szCs w:val="17"/>
-        </w:rPr>
-        <w:t xml:space="preserve">[00:14:38] client A finished</w:t>
-      </w:r>
-    </w:p>
-    <w:p>
-      <w:pPr>
-        <w:spacing w:after="80"/>
-      </w:pPr>
-    </w:p>
-    <w:p>
-      <w:pPr>
-        <w:keepNext/>
-        <w:spacing w:after="120"/>
-      </w:pPr>
-      <w:r>
-        <w:t xml:space="preserve">The server log shows the two connections overlapping: B (port 34860) is accepted and served while A (port 34852) is still open, and A finishes last:</w:t>
-      </w:r>
-    </w:p>
-    <w:p>
-      <w:pPr>
-        <w:keepNext/>
-        <w:keepLines/>
-        <w:pBdr>
-          <w:top w:val="single" w:color="F2F2F2" w:sz="2" w:space="4"/>
-          <w:left w:val="single" w:color="A6A6A6" w:sz="12" w:space="6"/>
-        </w:pBdr>
-        <w:shd w:fill="F2F2F2" w:color="auto" w:val="clear"/>
-        <w:spacing w:after="0" w:before="0" w:line="240"/>
-        <w:ind w:left="144" w:right="144"/>
-      </w:pPr>
-      <w:r>
-        <w:rPr>
-          <w:rFonts w:ascii="Consolas" w:cs="Consolas" w:eastAsia="Consolas" w:hAnsi="Consolas"/>
-          <w:sz w:val="17"/>
-          <w:szCs w:val="17"/>
-        </w:rPr>
-        <w:t xml:space="preserve">Server connected by ('127.0.0.1', 34852) at Fri Oct 16 00:14:32 2026</w:t>
-      </w:r>
-    </w:p>
-    <w:p>
-      <w:pPr>
-        <w:keepNext/>
-        <w:keepLines/>
-        <w:pBdr>
-          <w:left w:val="single" w:color="A6A6A6" w:sz="12" w:space="6"/>
-        </w:pBdr>
-        <w:shd w:fill="F2F2F2" w:color="auto" w:val="clear"/>
-        <w:spacing w:after="0" w:before="0" w:line="240"/>
-        <w:ind w:left="144" w:right="144"/>
-      </w:pPr>
-      <w:r>
-        <w:rPr>
-          <w:rFonts w:ascii="Consolas" w:cs="Consolas" w:eastAsia="Consolas" w:hAnsi="Consolas"/>
-          <w:sz w:val="17"/>
-          <w:szCs w:val="17"/>
-        </w:rPr>
-        <w:t xml:space="preserve">('127.0.0.1', 34852)  b'QUERY -?-\n' -&gt; 200 OK 13</w:t>
-      </w:r>
-    </w:p>
-    <w:p>
-      <w:pPr>
-        <w:keepNext/>
-        <w:keepLines/>
-        <w:pBdr>
-          <w:left w:val="single" w:color="A6A6A6" w:sz="12" w:space="6"/>
-        </w:pBdr>
-        <w:shd w:fill="F2F2F2" w:color="auto" w:val="clear"/>
-        <w:spacing w:after="0" w:before="0" w:line="240"/>
-        <w:ind w:left="144" w:right="144"/>
-      </w:pPr>
-      <w:r>
-        <w:rPr>
-          <w:rFonts w:ascii="Consolas" w:cs="Consolas" w:eastAsia="Consolas" w:hAnsi="Consolas"/>
-          <w:sz w:val="17"/>
-          <w:szCs w:val="17"/>
-        </w:rPr>
-        <w:t xml:space="preserve">Server connected by ('127.0.0.1', 34860) at Fri Oct 16 00:14:33 2026</w:t>
-      </w:r>
-    </w:p>
-    <w:p>
-      <w:pPr>
-        <w:keepNext/>
-        <w:keepLines/>
-        <w:pBdr>
-          <w:left w:val="single" w:color="A6A6A6" w:sz="12" w:space="6"/>
-        </w:pBdr>
-        <w:shd w:fill="F2F2F2" w:color="auto" w:val="clear"/>
-        <w:spacing w:after="0" w:before="0" w:line="240"/>
-        <w:ind w:left="144" w:right="144"/>
-      </w:pPr>
-      <w:r>
-        <w:rPr>
-          <w:rFonts w:ascii="Consolas" w:cs="Consolas" w:eastAsia="Consolas" w:hAnsi="Consolas"/>
-          <w:sz w:val="17"/>
-          <w:szCs w:val="17"/>
-        </w:rPr>
-        <w:t xml:space="preserve">('127.0.0.1', 34860)  b'QUERY ?(a)\n' -&gt; 200 OK 414</w:t>
-      </w:r>
-    </w:p>
-    <w:p>
-      <w:pPr>
-        <w:keepNext/>
-        <w:keepLines/>
-        <w:pBdr>
-          <w:left w:val="single" w:color="A6A6A6" w:sz="12" w:space="6"/>
-        </w:pBdr>
-        <w:shd w:fill="F2F2F2" w:color="auto" w:val="clear"/>
-        <w:spacing w:after="0" w:before="0" w:line="240"/>
-        <w:ind w:left="144" w:right="144"/>
-      </w:pPr>
-      <w:r>
-        <w:rPr>
-          <w:rFonts w:ascii="Consolas" w:cs="Consolas" w:eastAsia="Consolas" w:hAnsi="Consolas"/>
-          <w:sz w:val="17"/>
-          <w:szCs w:val="17"/>
-        </w:rPr>
-        <w:t xml:space="preserve">('127.0.0.1', 34860)  b'QUERY zzzzqx\n' -&gt; 404 NOT_FOUND 0</w:t>
-      </w:r>
-    </w:p>
-    <w:p>
-      <w:pPr>
-        <w:keepNext/>
-        <w:keepLines/>
-        <w:pBdr>
-          <w:left w:val="single" w:color="A6A6A6" w:sz="12" w:space="6"/>
-        </w:pBdr>
-        <w:shd w:fill="F2F2F2" w:color="auto" w:val="clear"/>
-        <w:spacing w:after="0" w:before="0" w:line="240"/>
-        <w:ind w:left="144" w:right="144"/>
-      </w:pPr>
-      <w:r>
-        <w:rPr>
-          <w:rFonts w:ascii="Consolas" w:cs="Consolas" w:eastAsia="Consolas" w:hAnsi="Consolas"/>
-          <w:sz w:val="17"/>
-          <w:szCs w:val="17"/>
-        </w:rPr>
-        <w:t xml:space="preserve">('127.0.0.1', 34860)  b'QUIT\n' -&gt; 200 BYE 0</w:t>
-      </w:r>
-    </w:p>
-    <w:p>
-      <w:pPr>
-        <w:keepNext/>
-        <w:keepLines/>
-        <w:pBdr>
-          <w:left w:val="single" w:color="A6A6A6" w:sz="12" w:space="6"/>
-        </w:pBdr>
-        <w:shd w:fill="F2F2F2" w:color="auto" w:val="clear"/>
-        <w:spacing w:after="0" w:before="0" w:line="240"/>
-        <w:ind w:left="144" w:right="144"/>
-      </w:pPr>
-      <w:r>
-        <w:rPr>
-          <w:rFonts w:ascii="Consolas" w:cs="Consolas" w:eastAsia="Consolas" w:hAnsi="Consolas"/>
-          <w:sz w:val="17"/>
-          <w:szCs w:val="17"/>
-        </w:rPr>
-        <w:t xml:space="preserve">Client ('127.0.0.1', 34860) finished at Fri Oct 16 00:14:33 2026</w:t>
-      </w:r>
-    </w:p>
-    <w:p>
-      <w:pPr>
-        <w:keepNext/>
-        <w:keepLines/>
-        <w:pBdr>
-          <w:left w:val="single" w:color="A6A6A6" w:sz="12" w:space="6"/>
-        </w:pBdr>
-        <w:shd w:fill="F2F2F2" w:color="auto" w:val="clear"/>
-        <w:spacing w:after="0" w:before="0" w:line="240"/>
-        <w:ind w:left="144" w:right="144"/>
-      </w:pPr>
-      <w:r>
-        <w:rPr>
-          <w:rFonts w:ascii="Consolas" w:cs="Consolas" w:eastAsia="Consolas" w:hAnsi="Consolas"/>
-          <w:sz w:val="17"/>
-          <w:szCs w:val="17"/>
-        </w:rPr>
-        <w:t xml:space="preserve">('127.0.0.1', 34852)  b'QUIT\n' -&gt; 200 BYE 0</w:t>
-      </w:r>
-    </w:p>
-    <w:p>
-      <w:pPr>
-        <w:keepNext w:val="false"/>
-        <w:keepLines/>
-        <w:pBdr>
-          <w:bottom w:val="single" w:color="F2F2F2" w:sz="2" w:space="4"/>
-          <w:left w:val="single" w:color="A6A6A6" w:sz="12" w:space="6"/>
-        </w:pBdr>
-        <w:shd w:fill="F2F2F2" w:color="auto" w:val="clear"/>
-        <w:spacing w:after="0" w:before="0" w:line="240"/>
-        <w:ind w:left="144" w:right="144"/>
-      </w:pPr>
-      <w:r>
-        <w:rPr>
-          <w:rFonts w:ascii="Consolas" w:cs="Consolas" w:eastAsia="Consolas" w:hAnsi="Consolas"/>
-          <w:sz w:val="17"/>
-          <w:szCs w:val="17"/>
-        </w:rPr>
-        <w:t xml:space="preserve">Client ('127.0.0.1', 34852) finished at Fri Oct 16 00:14:38 2026</w:t>
-      </w:r>
-    </w:p>
-    <w:p>
-      <w:pPr>
-        <w:spacing w:after="80"/>
-      </w:pPr>
-    </w:p>
-    <w:p>
-      <w:pPr>
-        <w:spacing w:after="160" w:before="60"/>
-      </w:pPr>
-      <w:r>
-        <w:rPr>
-          <w:b/>
-          <w:bCs/>
-          <w:color w:val="C00000"/>
-        </w:rPr>
-        <w:t xml:space="preserve">[SCREENSHOT PLACEHOLDER: three terminals: mt_server, client A idle, client B served]</w:t>
-      </w:r>
-    </w:p>
-    <w:p>
-      <w:pPr>
-        <w:keepNext/>
-        <w:spacing w:after="120"/>
-      </w:pPr>
-      <w:r>
-        <w:rPr>
-          <w:b/>
-          <w:bCs/>
-        </w:rPr>
-        <w:t xml:space="preserve">Test 16, basic server.</w:t>
-      </w:r>
-      <w:r>
-        <w:t xml:space="preserve"> Same scenario against </w:t>
-      </w:r>
-      <w:r>
-        <w:rPr>
-          <w:rFonts w:ascii="Consolas" w:cs="Consolas" w:eastAsia="Consolas" w:hAnsi="Consolas"/>
-          <w:sz w:val="19"/>
-          <w:szCs w:val="19"/>
-        </w:rPr>
-        <w:t xml:space="preserve">basic_server.py</w:t>
-      </w:r>
-      <w:r>
-        <w:t xml:space="preserve">: B connects at 00:14:25 but gets no reply until A quits at 00:14:30, because the single-threaded server only accepts B once it has finished with A (</w:t>
-      </w:r>
-      <w:r>
-        <w:rPr>
-          <w:rFonts w:ascii="Consolas" w:cs="Consolas" w:eastAsia="Consolas" w:hAnsi="Consolas"/>
-          <w:sz w:val="19"/>
-          <w:szCs w:val="19"/>
-        </w:rPr>
-        <w:t xml:space="preserve">logs/basic_server_second_client_waits.txt</w:t>
-      </w:r>
-      <w:r>
-        <w:t xml:space="preserve">):</w:t>
-      </w:r>
-    </w:p>
-    <w:p>
-      <w:pPr>
-        <w:keepNext/>
-        <w:keepLines/>
-        <w:pBdr>
-          <w:top w:val="single" w:color="F2F2F2" w:sz="2" w:space="4"/>
-          <w:left w:val="single" w:color="A6A6A6" w:sz="12" w:space="6"/>
-        </w:pBdr>
-        <w:shd w:fill="F2F2F2" w:color="auto" w:val="clear"/>
-        <w:spacing w:after="0" w:before="0" w:line="240"/>
-        <w:ind w:left="144" w:right="144"/>
-      </w:pPr>
-      <w:r>
-        <w:rPr>
-          <w:rFonts w:ascii="Consolas" w:cs="Consolas" w:eastAsia="Consolas" w:hAnsi="Consolas"/>
-          <w:sz w:val="17"/>
-          <w:szCs w:val="17"/>
-        </w:rPr>
-        <w:t xml:space="preserve">[00:14:24] client A (mt_client) connects to BASIC server and stays idle 6 s</w:t>
-      </w:r>
-    </w:p>
-    <w:p>
-      <w:pPr>
-        <w:keepNext/>
-        <w:keepLines/>
-        <w:pBdr>
-          <w:left w:val="single" w:color="A6A6A6" w:sz="12" w:space="6"/>
-        </w:pBdr>
-        <w:shd w:fill="F2F2F2" w:color="auto" w:val="clear"/>
-        <w:spacing w:after="0" w:before="0" w:line="240"/>
-        <w:ind w:left="144" w:right="144"/>
-      </w:pPr>
-      <w:r>
-        <w:rPr>
-          <w:rFonts w:ascii="Consolas" w:cs="Consolas" w:eastAsia="Consolas" w:hAnsi="Consolas"/>
-          <w:sz w:val="17"/>
-          <w:szCs w:val="17"/>
-        </w:rPr>
-        <w:t xml:space="preserve">[00:14:25] client B (basic_client) starts, query zzzzqx</w:t>
-      </w:r>
-    </w:p>
-    <w:p>
-      <w:pPr>
-        <w:keepNext/>
-        <w:keepLines/>
-        <w:pBdr>
-          <w:left w:val="single" w:color="A6A6A6" w:sz="12" w:space="6"/>
-        </w:pBdr>
-        <w:shd w:fill="F2F2F2" w:color="auto" w:val="clear"/>
-        <w:spacing w:after="0" w:before="0" w:line="240"/>
-        <w:ind w:left="144" w:right="144"/>
-      </w:pPr>
-      <w:r>
-        <w:rPr>
-          <w:rFonts w:ascii="Consolas" w:cs="Consolas" w:eastAsia="Consolas" w:hAnsi="Consolas"/>
-          <w:sz w:val="17"/>
-          <w:szCs w:val="17"/>
-        </w:rPr>
-        <w:t xml:space="preserve">[00:14:30] client A finished (sent quit)</w:t>
-      </w:r>
-    </w:p>
-    <w:p>
-      <w:pPr>
-        <w:keepNext/>
-        <w:keepLines/>
-        <w:pBdr>
-          <w:left w:val="single" w:color="A6A6A6" w:sz="12" w:space="6"/>
-        </w:pBdr>
-        <w:shd w:fill="F2F2F2" w:color="auto" w:val="clear"/>
-        <w:spacing w:after="0" w:before="0" w:line="240"/>
-        <w:ind w:left="144" w:right="144"/>
-      </w:pPr>
-      <w:r>
-        <w:rPr>
-          <w:rFonts w:ascii="Consolas" w:cs="Consolas" w:eastAsia="Consolas" w:hAnsi="Consolas"/>
-          <w:sz w:val="17"/>
-          <w:szCs w:val="17"/>
-        </w:rPr>
-        <w:t xml:space="preserve">[B] Enter query: Server replied: 404 NOT_FOUND</w:t>
-      </w:r>
-    </w:p>
-    <w:p>
-      <w:pPr>
-        <w:keepNext/>
-        <w:keepLines/>
-        <w:pBdr>
-          <w:left w:val="single" w:color="A6A6A6" w:sz="12" w:space="6"/>
-        </w:pBdr>
-        <w:shd w:fill="F2F2F2" w:color="auto" w:val="clear"/>
-        <w:spacing w:after="0" w:before="0" w:line="240"/>
-        <w:ind w:left="144" w:right="144"/>
-      </w:pPr>
-      <w:r>
-        <w:rPr>
-          <w:rFonts w:ascii="Consolas" w:cs="Consolas" w:eastAsia="Consolas" w:hAnsi="Consolas"/>
-          <w:sz w:val="17"/>
-          <w:szCs w:val="17"/>
-        </w:rPr>
-        <w:t xml:space="preserve">[B] Number of matching words: 0</w:t>
-      </w:r>
-    </w:p>
-    <w:p>
-      <w:pPr>
-        <w:keepNext w:val="false"/>
-        <w:keepLines/>
-        <w:pBdr>
-          <w:bottom w:val="single" w:color="F2F2F2" w:sz="2" w:space="4"/>
-          <w:left w:val="single" w:color="A6A6A6" w:sz="12" w:space="6"/>
-        </w:pBdr>
-        <w:shd w:fill="F2F2F2" w:color="auto" w:val="clear"/>
-        <w:spacing w:after="0" w:before="0" w:line="240"/>
-        <w:ind w:left="144" w:right="144"/>
-      </w:pPr>
-      <w:r>
-        <w:rPr>
-          <w:rFonts w:ascii="Consolas" w:cs="Consolas" w:eastAsia="Consolas" w:hAnsi="Consolas"/>
-          <w:sz w:val="17"/>
-          <w:szCs w:val="17"/>
-        </w:rPr>
-        <w:t xml:space="preserve">[00:14:30] client B finished</w:t>
-      </w:r>
-    </w:p>
-    <w:p>
-      <w:pPr>
-        <w:spacing w:after="80"/>
-      </w:pPr>
-    </w:p>
-    <w:p>
-      <w:pPr>
-        <w:spacing w:after="160" w:before="60"/>
-      </w:pPr>
-      <w:r>
-        <w:rPr>
-          <w:b/>
-          <w:bCs/>
-          <w:color w:val="C00000"/>
-        </w:rPr>
-        <w:t xml:space="preserve">[SCREENSHOT PLACEHOLDER: basic_server: second client waiting]</w:t>
+        <w:t xml:space="preserve">In the Windows screenshots below, the first client stayed connected for longer than 30 seconds, so the waiting client gave up with a read timeout instead of being answered; either way it was never served while the other client was connected.</w:t>
+      </w:r>
+    </w:p>
+    <w:p>
+      <w:pPr>
+        <w:keepNext/>
+        <w:spacing w:after="40" w:before="60"/>
+        <w:jc w:val="center"/>
+      </w:pPr>
+      <w:r>
+        <w:drawing>
+          <wp:inline distT="0" distB="0" distL="0" distR="0">
+            <wp:extent cx="2971800" cy="847725"/>
+            <wp:effectExtent t="0" r="0" b="0" l="0"/>
+            <wp:docPr id="1" name="13a.png" descr="Screenshot: basic_server: second client waiting" title="basic_server: second client waiting"/>
+            <wp:cNvGraphicFramePr>
+              <a:graphicFrameLocks xmlns:a="http://schemas.openxmlformats.org/drawingml/2006/main" noChangeAspect="1"/>
+            </wp:cNvGraphicFramePr>
+            <a:graphic xmlns:a="http://schemas.openxmlformats.org/drawingml/2006/main">
+              <a:graphicData uri="http://schemas.openxmlformats.org/drawingml/2006/picture">
+                <pic:pic xmlns:pic="http://schemas.openxmlformats.org/drawingml/2006/picture">
+                  <pic:nvPicPr>
+                    <pic:cNvPr id="0" name="" descr=""/>
+                    <pic:cNvPicPr>
+                      <a:picLocks noChangeAspect="1" noChangeArrowheads="1"/>
+                    </pic:cNvPicPr>
+                  </pic:nvPicPr>
+                  <pic:blipFill>
+                    <a:blip r:embed="rId20" cstate="none"/>
+                    <a:srcRect/>
+                    <a:stretch>
+                      <a:fillRect/>
+                    </a:stretch>
+                  </pic:blipFill>
+                  <pic:spPr bwMode="auto">
+                    <a:xfrm>
+                      <a:off x="0" y="0"/>
+                      <a:ext cx="2971800" cy="847725"/>
+                    </a:xfrm>
+                    <a:prstGeom prst="rect">
+                      <a:avLst/>
+                    </a:prstGeom>
+                  </pic:spPr>
+                </pic:pic>
+              </a:graphicData>
+            </a:graphic>
+          </wp:inline>
+        </w:drawing>
+      </w:r>
+    </w:p>
+    <w:p>
+      <w:pPr>
+        <w:spacing w:after="200"/>
+        <w:jc w:val="center"/>
+      </w:pPr>
+      <w:r>
+        <w:rPr>
+          <w:i/>
+          <w:iCs/>
+          <w:color w:val="595959"/>
+          <w:sz w:val="18"/>
+          <w:szCs w:val="18"/>
+        </w:rPr>
+        <w:t xml:space="preserve">Screenshot (Windows 11): basic_server, second client (basic_client) waiting: no reply while another client is connected</w:t>
+      </w:r>
+    </w:p>
+    <w:p>
+      <w:pPr>
+        <w:keepNext/>
+        <w:spacing w:after="40" w:before="60"/>
+        <w:jc w:val="center"/>
+      </w:pPr>
+      <w:r>
+        <w:drawing>
+          <wp:inline distT="0" distB="0" distL="0" distR="0">
+            <wp:extent cx="5943600" cy="3667125"/>
+            <wp:effectExtent t="0" r="0" b="0" l="0"/>
+            <wp:docPr id="1" name="13b.png" descr="Screenshot: basic_server: second client waiting" title="basic_server: second client waiting"/>
+            <wp:cNvGraphicFramePr>
+              <a:graphicFrameLocks xmlns:a="http://schemas.openxmlformats.org/drawingml/2006/main" noChangeAspect="1"/>
+            </wp:cNvGraphicFramePr>
+            <a:graphic xmlns:a="http://schemas.openxmlformats.org/drawingml/2006/main">
+              <a:graphicData uri="http://schemas.openxmlformats.org/drawingml/2006/picture">
+                <pic:pic xmlns:pic="http://schemas.openxmlformats.org/drawingml/2006/picture">
+                  <pic:nvPicPr>
+                    <pic:cNvPr id="0" name="" descr=""/>
+                    <pic:cNvPicPr>
+                      <a:picLocks noChangeAspect="1" noChangeArrowheads="1"/>
+                    </pic:cNvPicPr>
+                  </pic:nvPicPr>
+                  <pic:blipFill>
+                    <a:blip r:embed="rId21" cstate="none"/>
+                    <a:srcRect/>
+                    <a:stretch>
+                      <a:fillRect/>
+                    </a:stretch>
+                  </pic:blipFill>
+                  <pic:spPr bwMode="auto">
+                    <a:xfrm>
+                      <a:off x="0" y="0"/>
+                      <a:ext cx="5943600" cy="3667125"/>
+                    </a:xfrm>
+                    <a:prstGeom prst="rect">
+                      <a:avLst/>
+                    </a:prstGeom>
+                  </pic:spPr>
+                </pic:pic>
+              </a:graphicData>
+            </a:graphic>
+          </wp:inline>
+        </w:drawing>
+      </w:r>
+    </w:p>
+    <w:p>
+      <w:pPr>
+        <w:spacing w:after="200"/>
+        <w:jc w:val="center"/>
+      </w:pPr>
+      <w:r>
+        <w:rPr>
+          <w:i/>
+          <w:iCs/>
+          <w:color w:val="595959"/>
+          <w:sz w:val="18"/>
+          <w:szCs w:val="18"/>
+        </w:rPr>
+        <w:t xml:space="preserve">Screenshot (Windows 11): basic_server: left = server log (only the first client is served), middle = first client still connected, right = second client never answered and gives up after its 30 s read timeout</w:t>
       </w:r>
     </w:p>
     <w:p>
@@ -11602,6 +12137,30 @@
       </w:pPr>
       <w:r>
         <w:t xml:space="preserve">Every client gets its own thread with no upper limit, and idle clients are never timed out, so a very large number of connections could exhaust server threads (see the thread-pool extension).</w:t>
+      </w:r>
+    </w:p>
+    <w:p>
+      <w:pPr>
+        <w:pStyle w:val="ListParagraph"/>
+        <w:numPr>
+          <w:ilvl w:val="0"/>
+          <w:numId w:val="2"/>
+        </w:numPr>
+        <w:spacing w:after="60"/>
+      </w:pPr>
+      <w:r>
+        <w:t xml:space="preserve">A client waits at most 30 seconds for a reply. Behind a busy basic_server it reports </w:t>
+      </w:r>
+      <w:r>
+        <w:rPr>
+          <w:rFonts w:ascii="Consolas" w:cs="Consolas" w:eastAsia="Consolas" w:hAnsi="Consolas"/>
+          <w:sz w:val="19"/>
+          <w:szCs w:val="19"/>
+        </w:rPr>
+        <w:t xml:space="preserve">timed out</w:t>
+      </w:r>
+      <w:r>
+        <w:t xml:space="preserve"> instead of waiting indefinitely.</w:t>
       </w:r>
     </w:p>
     <w:p>

</xml_diff>